<commit_message>
Add per-meal energy, carbohydrate and protein table to I選手 meal plan
Co-Authored-By: Claude Opus 5.5 <noreply@anthropic.com>
Claude-Session: https://claude.ai/code/session_01XUw637tvGB6AwL1RKiBxvF
</commit_message>
<xml_diff>
--- a/I選手_前日朝〜試合当日_食事・補食プラン.docx
+++ b/I選手_前日朝〜試合当日_食事・補食プラン.docx
@@ -5360,6 +5360,4279 @@
         </w:tc>
       </w:tr>
     </w:tbl>
+    <w:p>
+      <w:pPr>
+        <w:pageBreakBefore/>
+        <w:spacing w:after="80"/>
+        <w:rPr>
+          <w:rFonts w:ascii="ヒラギノ丸ゴ Pro W4" w:eastAsia="ヒラギノ丸ゴ Pro W4" w:hAnsi="ヒラギノ丸ゴ Pro W4" w:hint="eastAsia"/>
+          <w:b/>
+          <w:bCs/>
+          <w:color w:val="1A5276"/>
+          <w:sz w:val="28"/>
+          <w:szCs w:val="28"/>
+        </w:rPr>
+      </w:pPr>
+      <w:r>
+        <w:rPr>
+          <w:rFonts w:ascii="ヒラギノ丸ゴ Pro W4" w:eastAsia="ヒラギノ丸ゴ Pro W4" w:hAnsi="ヒラギノ丸ゴ Pro W4" w:hint="eastAsia"/>
+          <w:b/>
+          <w:bCs/>
+          <w:color w:val="1A5276"/>
+          <w:sz w:val="28"/>
+          <w:szCs w:val="28"/>
+        </w:rPr>
+        <w:t>食事・補食ごとの栄養量（目安）</w:t>
+      </w:r>
+    </w:p>
+    <w:p>
+      <w:pPr>
+        <w:spacing w:before="0" w:after="100"/>
+        <w:rPr>
+          <w:rFonts w:ascii="ヒラギノ丸ゴ Pro W4" w:eastAsia="ヒラギノ丸ゴ Pro W4" w:hAnsi="ヒラギノ丸ゴ Pro W4" w:hint="eastAsia"/>
+          <w:color w:val="2C3E50"/>
+          <w:sz w:val="17"/>
+          <w:szCs w:val="17"/>
+        </w:rPr>
+      </w:pPr>
+      <w:r>
+        <w:rPr>
+          <w:rFonts w:ascii="ヒラギノ丸ゴ Pro W4" w:eastAsia="ヒラギノ丸ゴ Pro W4" w:hAnsi="ヒラギノ丸ゴ Pro W4" w:hint="eastAsia"/>
+          <w:color w:val="2C3E50"/>
+          <w:sz w:val="17"/>
+          <w:szCs w:val="17"/>
+        </w:rPr>
+        <w:t xml:space="preserve">日本食品標準成分表（八訂）をもとにした1人前の目安です（ビュッフェでは料理・量で変わります）。選択肢がある食事は主な組み合わせで計算し、他の選択肢は「範囲」欄に記載。糖質(g/kg)は体重61kgで割った値です。</w:t>
+      </w:r>
+    </w:p>
+    <w:tbl>
+      <w:tblPr>
+        <w:tblW w:w="10064" w:type="dxa"/>
+        <w:tblLayout w:type="fixed"/>
+        <w:tblCellMar>
+          <w:left w:w="10" w:type="dxa"/>
+          <w:right w:w="10" w:type="dxa"/>
+        </w:tblCellMar>
+        <w:tblLook w:val="0000" w:firstRow="0" w:lastRow="0" w:firstColumn="0" w:lastColumn="0" w:noHBand="0" w:noVBand="0"/>
+      </w:tblPr>
+      <w:tblGrid>
+        <w:gridCol w:w="780"/>
+        <w:gridCol w:w="880"/>
+        <w:gridCol w:w="2420"/>
+        <w:gridCol w:w="1120"/>
+        <w:gridCol w:w="880"/>
+        <w:gridCol w:w="760"/>
+        <w:gridCol w:w="830"/>
+        <w:gridCol w:w="2394"/>
+      </w:tblGrid>
+      <w:tr>
+        <w:trPr>
+          <w:cantSplit/>
+          <w:tblHeader/>
+        </w:trPr>
+        <w:tc>
+          <w:tcPr>
+            <w:tcW w:w="780" w:type="dxa"/>
+            <w:tcBorders>
+              <w:top w:val="single" w:sz="1" w:space="0" w:color="CCCCCC"/>
+              <w:left w:val="single" w:sz="1" w:space="0" w:color="CCCCCC"/>
+              <w:bottom w:val="single" w:sz="1" w:space="0" w:color="CCCCCC"/>
+              <w:right w:val="single" w:sz="1" w:space="0" w:color="CCCCCC"/>
+            </w:tcBorders>
+            <w:shd w:val="clear" w:color="auto" w:fill="1A5276"/>
+            <w:tcMar>
+              <w:top w:w="40" w:type="dxa"/>
+              <w:left w:w="90" w:type="dxa"/>
+              <w:bottom w:w="40" w:type="dxa"/>
+              <w:right w:w="90" w:type="dxa"/>
+            </w:tcMar>
+            <w:vAlign w:val="center"/>
+          </w:tcPr>
+          <w:p>
+            <w:pPr>
+              <w:jc w:val="center"/>
+              <w:rPr>
+                <w:rFonts w:ascii="ヒラギノ丸ゴ Pro W4" w:eastAsia="ヒラギノ丸ゴ Pro W4" w:hAnsi="ヒラギノ丸ゴ Pro W4" w:hint="eastAsia"/>
+                <w:b/>
+                <w:bCs/>
+                <w:color w:val="FFFFFF"/>
+                <w:sz w:val="17"/>
+                <w:szCs w:val="17"/>
+              </w:rPr>
+            </w:pPr>
+            <w:r>
+              <w:rPr>
+                <w:rFonts w:ascii="ヒラギノ丸ゴ Pro W4" w:eastAsia="ヒラギノ丸ゴ Pro W4" w:hAnsi="ヒラギノ丸ゴ Pro W4" w:hint="eastAsia"/>
+                <w:b/>
+                <w:bCs/>
+                <w:color w:val="FFFFFF"/>
+                <w:sz w:val="17"/>
+                <w:szCs w:val="17"/>
+              </w:rPr>
+              <w:t xml:space="preserve">時間</w:t>
+            </w:r>
+          </w:p>
+        </w:tc>
+        <w:tc>
+          <w:tcPr>
+            <w:tcW w:w="880" w:type="dxa"/>
+            <w:tcBorders>
+              <w:top w:val="single" w:sz="1" w:space="0" w:color="CCCCCC"/>
+              <w:left w:val="single" w:sz="1" w:space="0" w:color="CCCCCC"/>
+              <w:bottom w:val="single" w:sz="1" w:space="0" w:color="CCCCCC"/>
+              <w:right w:val="single" w:sz="1" w:space="0" w:color="CCCCCC"/>
+            </w:tcBorders>
+            <w:shd w:val="clear" w:color="auto" w:fill="1A5276"/>
+            <w:tcMar>
+              <w:top w:w="40" w:type="dxa"/>
+              <w:left w:w="90" w:type="dxa"/>
+              <w:bottom w:w="40" w:type="dxa"/>
+              <w:right w:w="90" w:type="dxa"/>
+            </w:tcMar>
+            <w:vAlign w:val="center"/>
+          </w:tcPr>
+          <w:p>
+            <w:pPr>
+              <w:jc w:val="center"/>
+              <w:rPr>
+                <w:rFonts w:ascii="ヒラギノ丸ゴ Pro W4" w:eastAsia="ヒラギノ丸ゴ Pro W4" w:hAnsi="ヒラギノ丸ゴ Pro W4" w:hint="eastAsia"/>
+                <w:b/>
+                <w:bCs/>
+                <w:color w:val="FFFFFF"/>
+                <w:sz w:val="17"/>
+                <w:szCs w:val="17"/>
+              </w:rPr>
+            </w:pPr>
+            <w:r>
+              <w:rPr>
+                <w:rFonts w:ascii="ヒラギノ丸ゴ Pro W4" w:eastAsia="ヒラギノ丸ゴ Pro W4" w:hAnsi="ヒラギノ丸ゴ Pro W4" w:hint="eastAsia"/>
+                <w:b/>
+                <w:bCs/>
+                <w:color w:val="FFFFFF"/>
+                <w:sz w:val="17"/>
+                <w:szCs w:val="17"/>
+              </w:rPr>
+              <w:t xml:space="preserve">食事</w:t>
+            </w:r>
+          </w:p>
+        </w:tc>
+        <w:tc>
+          <w:tcPr>
+            <w:tcW w:w="2420" w:type="dxa"/>
+            <w:tcBorders>
+              <w:top w:val="single" w:sz="1" w:space="0" w:color="CCCCCC"/>
+              <w:left w:val="single" w:sz="1" w:space="0" w:color="CCCCCC"/>
+              <w:bottom w:val="single" w:sz="1" w:space="0" w:color="CCCCCC"/>
+              <w:right w:val="single" w:sz="1" w:space="0" w:color="CCCCCC"/>
+            </w:tcBorders>
+            <w:shd w:val="clear" w:color="auto" w:fill="1A5276"/>
+            <w:tcMar>
+              <w:top w:w="40" w:type="dxa"/>
+              <w:left w:w="90" w:type="dxa"/>
+              <w:bottom w:w="40" w:type="dxa"/>
+              <w:right w:w="90" w:type="dxa"/>
+            </w:tcMar>
+            <w:vAlign w:val="center"/>
+          </w:tcPr>
+          <w:p>
+            <w:pPr>
+              <w:jc w:val="center"/>
+              <w:rPr>
+                <w:rFonts w:ascii="ヒラギノ丸ゴ Pro W4" w:eastAsia="ヒラギノ丸ゴ Pro W4" w:hAnsi="ヒラギノ丸ゴ Pro W4" w:hint="eastAsia"/>
+                <w:b/>
+                <w:bCs/>
+                <w:color w:val="FFFFFF"/>
+                <w:sz w:val="17"/>
+                <w:szCs w:val="17"/>
+              </w:rPr>
+            </w:pPr>
+            <w:r>
+              <w:rPr>
+                <w:rFonts w:ascii="ヒラギノ丸ゴ Pro W4" w:eastAsia="ヒラギノ丸ゴ Pro W4" w:hAnsi="ヒラギノ丸ゴ Pro W4" w:hint="eastAsia"/>
+                <w:b/>
+                <w:bCs/>
+                <w:color w:val="FFFFFF"/>
+                <w:sz w:val="17"/>
+                <w:szCs w:val="17"/>
+              </w:rPr>
+              <w:t xml:space="preserve">計算した内容</w:t>
+            </w:r>
+          </w:p>
+        </w:tc>
+        <w:tc>
+          <w:tcPr>
+            <w:tcW w:w="1120" w:type="dxa"/>
+            <w:tcBorders>
+              <w:top w:val="single" w:sz="1" w:space="0" w:color="CCCCCC"/>
+              <w:left w:val="single" w:sz="1" w:space="0" w:color="CCCCCC"/>
+              <w:bottom w:val="single" w:sz="1" w:space="0" w:color="CCCCCC"/>
+              <w:right w:val="single" w:sz="1" w:space="0" w:color="CCCCCC"/>
+            </w:tcBorders>
+            <w:shd w:val="clear" w:color="auto" w:fill="1A5276"/>
+            <w:tcMar>
+              <w:top w:w="40" w:type="dxa"/>
+              <w:left w:w="90" w:type="dxa"/>
+              <w:bottom w:w="40" w:type="dxa"/>
+              <w:right w:w="90" w:type="dxa"/>
+            </w:tcMar>
+            <w:vAlign w:val="center"/>
+          </w:tcPr>
+          <w:p>
+            <w:pPr>
+              <w:jc w:val="center"/>
+              <w:rPr>
+                <w:rFonts w:ascii="ヒラギノ丸ゴ Pro W4" w:eastAsia="ヒラギノ丸ゴ Pro W4" w:hAnsi="ヒラギノ丸ゴ Pro W4" w:hint="eastAsia"/>
+                <w:b/>
+                <w:bCs/>
+                <w:color w:val="FFFFFF"/>
+                <w:sz w:val="17"/>
+                <w:szCs w:val="17"/>
+              </w:rPr>
+            </w:pPr>
+            <w:r>
+              <w:rPr>
+                <w:rFonts w:ascii="ヒラギノ丸ゴ Pro W4" w:eastAsia="ヒラギノ丸ゴ Pro W4" w:hAnsi="ヒラギノ丸ゴ Pro W4" w:hint="eastAsia"/>
+                <w:b/>
+                <w:bCs/>
+                <w:color w:val="FFFFFF"/>
+                <w:sz w:val="17"/>
+                <w:szCs w:val="17"/>
+              </w:rPr>
+              <w:t xml:space="preserve">エネルギー</w:t>
+            </w:r>
+          </w:p>
+        </w:tc>
+        <w:tc>
+          <w:tcPr>
+            <w:tcW w:w="880" w:type="dxa"/>
+            <w:tcBorders>
+              <w:top w:val="single" w:sz="1" w:space="0" w:color="CCCCCC"/>
+              <w:left w:val="single" w:sz="1" w:space="0" w:color="CCCCCC"/>
+              <w:bottom w:val="single" w:sz="1" w:space="0" w:color="CCCCCC"/>
+              <w:right w:val="single" w:sz="1" w:space="0" w:color="CCCCCC"/>
+            </w:tcBorders>
+            <w:shd w:val="clear" w:color="auto" w:fill="1A5276"/>
+            <w:tcMar>
+              <w:top w:w="40" w:type="dxa"/>
+              <w:left w:w="90" w:type="dxa"/>
+              <w:bottom w:w="40" w:type="dxa"/>
+              <w:right w:w="90" w:type="dxa"/>
+            </w:tcMar>
+            <w:vAlign w:val="center"/>
+          </w:tcPr>
+          <w:p>
+            <w:pPr>
+              <w:jc w:val="center"/>
+              <w:rPr>
+                <w:rFonts w:ascii="ヒラギノ丸ゴ Pro W4" w:eastAsia="ヒラギノ丸ゴ Pro W4" w:hAnsi="ヒラギノ丸ゴ Pro W4" w:hint="eastAsia"/>
+                <w:b/>
+                <w:bCs/>
+                <w:color w:val="FFFFFF"/>
+                <w:sz w:val="17"/>
+                <w:szCs w:val="17"/>
+              </w:rPr>
+            </w:pPr>
+            <w:r>
+              <w:rPr>
+                <w:rFonts w:ascii="ヒラギノ丸ゴ Pro W4" w:eastAsia="ヒラギノ丸ゴ Pro W4" w:hAnsi="ヒラギノ丸ゴ Pro W4" w:hint="eastAsia"/>
+                <w:b/>
+                <w:bCs/>
+                <w:color w:val="FFFFFF"/>
+                <w:sz w:val="17"/>
+                <w:szCs w:val="17"/>
+              </w:rPr>
+              <w:t xml:space="preserve">糖質</w:t>
+            </w:r>
+          </w:p>
+        </w:tc>
+        <w:tc>
+          <w:tcPr>
+            <w:tcW w:w="760" w:type="dxa"/>
+            <w:tcBorders>
+              <w:top w:val="single" w:sz="1" w:space="0" w:color="CCCCCC"/>
+              <w:left w:val="single" w:sz="1" w:space="0" w:color="CCCCCC"/>
+              <w:bottom w:val="single" w:sz="1" w:space="0" w:color="CCCCCC"/>
+              <w:right w:val="single" w:sz="1" w:space="0" w:color="CCCCCC"/>
+            </w:tcBorders>
+            <w:shd w:val="clear" w:color="auto" w:fill="1A5276"/>
+            <w:tcMar>
+              <w:top w:w="40" w:type="dxa"/>
+              <w:left w:w="90" w:type="dxa"/>
+              <w:bottom w:w="40" w:type="dxa"/>
+              <w:right w:w="90" w:type="dxa"/>
+            </w:tcMar>
+            <w:vAlign w:val="center"/>
+          </w:tcPr>
+          <w:p>
+            <w:pPr>
+              <w:jc w:val="center"/>
+              <w:rPr>
+                <w:rFonts w:ascii="ヒラギノ丸ゴ Pro W4" w:eastAsia="ヒラギノ丸ゴ Pro W4" w:hAnsi="ヒラギノ丸ゴ Pro W4" w:hint="eastAsia"/>
+                <w:b/>
+                <w:bCs/>
+                <w:color w:val="FFFFFF"/>
+                <w:sz w:val="17"/>
+                <w:szCs w:val="17"/>
+              </w:rPr>
+            </w:pPr>
+            <w:r>
+              <w:rPr>
+                <w:rFonts w:ascii="ヒラギノ丸ゴ Pro W4" w:eastAsia="ヒラギノ丸ゴ Pro W4" w:hAnsi="ヒラギノ丸ゴ Pro W4" w:hint="eastAsia"/>
+                <w:b/>
+                <w:bCs/>
+                <w:color w:val="FFFFFF"/>
+                <w:sz w:val="17"/>
+                <w:szCs w:val="17"/>
+              </w:rPr>
+              <w:t xml:space="preserve">糖質</w:t>
+            </w:r>
+          </w:p>
+          <w:p>
+            <w:pPr>
+              <w:jc w:val="center"/>
+              <w:rPr>
+                <w:rFonts w:ascii="ヒラギノ丸ゴ Pro W4" w:eastAsia="ヒラギノ丸ゴ Pro W4" w:hAnsi="ヒラギノ丸ゴ Pro W4" w:hint="eastAsia"/>
+                <w:b/>
+                <w:bCs/>
+                <w:color w:val="FFFFFF"/>
+                <w:sz w:val="17"/>
+                <w:szCs w:val="17"/>
+              </w:rPr>
+            </w:pPr>
+            <w:r>
+              <w:rPr>
+                <w:rFonts w:ascii="ヒラギノ丸ゴ Pro W4" w:eastAsia="ヒラギノ丸ゴ Pro W4" w:hAnsi="ヒラギノ丸ゴ Pro W4" w:hint="eastAsia"/>
+                <w:b/>
+                <w:bCs/>
+                <w:color w:val="FFFFFF"/>
+                <w:sz w:val="17"/>
+                <w:szCs w:val="17"/>
+              </w:rPr>
+              <w:t xml:space="preserve">(g/kg)</w:t>
+            </w:r>
+          </w:p>
+        </w:tc>
+        <w:tc>
+          <w:tcPr>
+            <w:tcW w:w="830" w:type="dxa"/>
+            <w:tcBorders>
+              <w:top w:val="single" w:sz="1" w:space="0" w:color="CCCCCC"/>
+              <w:left w:val="single" w:sz="1" w:space="0" w:color="CCCCCC"/>
+              <w:bottom w:val="single" w:sz="1" w:space="0" w:color="CCCCCC"/>
+              <w:right w:val="single" w:sz="1" w:space="0" w:color="CCCCCC"/>
+            </w:tcBorders>
+            <w:shd w:val="clear" w:color="auto" w:fill="1A5276"/>
+            <w:tcMar>
+              <w:top w:w="40" w:type="dxa"/>
+              <w:left w:w="90" w:type="dxa"/>
+              <w:bottom w:w="40" w:type="dxa"/>
+              <w:right w:w="90" w:type="dxa"/>
+            </w:tcMar>
+            <w:vAlign w:val="center"/>
+          </w:tcPr>
+          <w:p>
+            <w:pPr>
+              <w:jc w:val="center"/>
+              <w:rPr>
+                <w:rFonts w:ascii="ヒラギノ丸ゴ Pro W4" w:eastAsia="ヒラギノ丸ゴ Pro W4" w:hAnsi="ヒラギノ丸ゴ Pro W4" w:hint="eastAsia"/>
+                <w:b/>
+                <w:bCs/>
+                <w:color w:val="FFFFFF"/>
+                <w:sz w:val="17"/>
+                <w:szCs w:val="17"/>
+              </w:rPr>
+            </w:pPr>
+            <w:r>
+              <w:rPr>
+                <w:rFonts w:ascii="ヒラギノ丸ゴ Pro W4" w:eastAsia="ヒラギノ丸ゴ Pro W4" w:hAnsi="ヒラギノ丸ゴ Pro W4" w:hint="eastAsia"/>
+                <w:b/>
+                <w:bCs/>
+                <w:color w:val="FFFFFF"/>
+                <w:sz w:val="17"/>
+                <w:szCs w:val="17"/>
+              </w:rPr>
+              <w:t xml:space="preserve">たんぱく質</w:t>
+            </w:r>
+          </w:p>
+        </w:tc>
+        <w:tc>
+          <w:tcPr>
+            <w:tcW w:w="2394" w:type="dxa"/>
+            <w:tcBorders>
+              <w:top w:val="single" w:sz="1" w:space="0" w:color="CCCCCC"/>
+              <w:left w:val="single" w:sz="1" w:space="0" w:color="CCCCCC"/>
+              <w:bottom w:val="single" w:sz="1" w:space="0" w:color="CCCCCC"/>
+              <w:right w:val="single" w:sz="1" w:space="0" w:color="CCCCCC"/>
+            </w:tcBorders>
+            <w:shd w:val="clear" w:color="auto" w:fill="1A5276"/>
+            <w:tcMar>
+              <w:top w:w="40" w:type="dxa"/>
+              <w:left w:w="90" w:type="dxa"/>
+              <w:bottom w:w="40" w:type="dxa"/>
+              <w:right w:w="90" w:type="dxa"/>
+            </w:tcMar>
+            <w:vAlign w:val="center"/>
+          </w:tcPr>
+          <w:p>
+            <w:pPr>
+              <w:jc w:val="center"/>
+              <w:rPr>
+                <w:rFonts w:ascii="ヒラギノ丸ゴ Pro W4" w:eastAsia="ヒラギノ丸ゴ Pro W4" w:hAnsi="ヒラギノ丸ゴ Pro W4" w:hint="eastAsia"/>
+                <w:b/>
+                <w:bCs/>
+                <w:color w:val="FFFFFF"/>
+                <w:sz w:val="17"/>
+                <w:szCs w:val="17"/>
+              </w:rPr>
+            </w:pPr>
+            <w:r>
+              <w:rPr>
+                <w:rFonts w:ascii="ヒラギノ丸ゴ Pro W4" w:eastAsia="ヒラギノ丸ゴ Pro W4" w:hAnsi="ヒラギノ丸ゴ Pro W4" w:hint="eastAsia"/>
+                <w:b/>
+                <w:bCs/>
+                <w:color w:val="FFFFFF"/>
+                <w:sz w:val="17"/>
+                <w:szCs w:val="17"/>
+              </w:rPr>
+              <w:t xml:space="preserve">範囲（選択肢を変えた場合）</w:t>
+            </w:r>
+          </w:p>
+        </w:tc>
+      </w:tr>
+      <w:tr>
+        <w:trPr>
+          <w:cantSplit/>
+        </w:trPr>
+        <w:tc>
+          <w:tcPr>
+            <w:tcW w:w="10064" w:type="dxa"/>
+            <w:gridSpan w:val="8"/>
+            <w:tcBorders>
+              <w:top w:val="single" w:sz="1" w:space="0" w:color="CCCCCC"/>
+              <w:left w:val="single" w:sz="1" w:space="0" w:color="CCCCCC"/>
+              <w:bottom w:val="single" w:sz="1" w:space="0" w:color="CCCCCC"/>
+              <w:right w:val="single" w:sz="1" w:space="0" w:color="CCCCCC"/>
+            </w:tcBorders>
+            <w:shd w:val="clear" w:color="auto" w:fill="1B2631"/>
+            <w:tcMar>
+              <w:top w:w="40" w:type="dxa"/>
+              <w:left w:w="90" w:type="dxa"/>
+              <w:bottom w:w="40" w:type="dxa"/>
+              <w:right w:w="90" w:type="dxa"/>
+            </w:tcMar>
+            <w:vAlign w:val="center"/>
+          </w:tcPr>
+          <w:p>
+            <w:pPr>
+              <w:rPr>
+                <w:rFonts w:ascii="ヒラギノ丸ゴ Pro W4" w:eastAsia="ヒラギノ丸ゴ Pro W4" w:hAnsi="ヒラギノ丸ゴ Pro W4" w:hint="eastAsia"/>
+                <w:b/>
+                <w:bCs/>
+                <w:color w:val="FFFFFF"/>
+                <w:sz w:val="19"/>
+                <w:szCs w:val="19"/>
+              </w:rPr>
+            </w:pPr>
+            <w:r>
+              <w:rPr>
+                <w:rFonts w:ascii="ヒラギノ丸ゴ Pro W4" w:eastAsia="ヒラギノ丸ゴ Pro W4" w:hAnsi="ヒラギノ丸ゴ Pro W4" w:hint="eastAsia"/>
+                <w:b/>
+                <w:bCs/>
+                <w:color w:val="FFFFFF"/>
+                <w:sz w:val="19"/>
+                <w:szCs w:val="19"/>
+              </w:rPr>
+              <w:t xml:space="preserve">前日（ホテルビュッフェ）</w:t>
+            </w:r>
+          </w:p>
+        </w:tc>
+      </w:tr>
+      <w:tr>
+        <w:trPr>
+          <w:cantSplit/>
+        </w:trPr>
+        <w:tc>
+          <w:tcPr>
+            <w:tcW w:w="780" w:type="dxa"/>
+            <w:tcBorders>
+              <w:top w:val="single" w:sz="1" w:space="0" w:color="CCCCCC"/>
+              <w:left w:val="single" w:sz="1" w:space="0" w:color="CCCCCC"/>
+              <w:bottom w:val="single" w:sz="1" w:space="0" w:color="CCCCCC"/>
+              <w:right w:val="single" w:sz="1" w:space="0" w:color="CCCCCC"/>
+            </w:tcBorders>
+            <w:shd w:val="clear" w:color="auto" w:fill="EBF5FB"/>
+            <w:tcMar>
+              <w:top w:w="40" w:type="dxa"/>
+              <w:left w:w="90" w:type="dxa"/>
+              <w:bottom w:w="40" w:type="dxa"/>
+              <w:right w:w="90" w:type="dxa"/>
+            </w:tcMar>
+            <w:vAlign w:val="center"/>
+          </w:tcPr>
+          <w:p>
+            <w:pPr>
+              <w:jc w:val="center"/>
+              <w:rPr>
+                <w:rFonts w:ascii="ヒラギノ丸ゴ Pro W4" w:eastAsia="ヒラギノ丸ゴ Pro W4" w:hAnsi="ヒラギノ丸ゴ Pro W4" w:hint="eastAsia"/>
+                <w:color w:val="2C3E50"/>
+                <w:sz w:val="17"/>
+                <w:szCs w:val="17"/>
+              </w:rPr>
+            </w:pPr>
+            <w:r>
+              <w:rPr>
+                <w:rFonts w:ascii="ヒラギノ丸ゴ Pro W4" w:eastAsia="ヒラギノ丸ゴ Pro W4" w:hAnsi="ヒラギノ丸ゴ Pro W4" w:hint="eastAsia"/>
+                <w:color w:val="2C3E50"/>
+                <w:sz w:val="17"/>
+                <w:szCs w:val="17"/>
+              </w:rPr>
+              <w:t xml:space="preserve">7:30〜</w:t>
+            </w:r>
+          </w:p>
+        </w:tc>
+        <w:tc>
+          <w:tcPr>
+            <w:tcW w:w="880" w:type="dxa"/>
+            <w:tcBorders>
+              <w:top w:val="single" w:sz="1" w:space="0" w:color="CCCCCC"/>
+              <w:left w:val="single" w:sz="1" w:space="0" w:color="CCCCCC"/>
+              <w:bottom w:val="single" w:sz="1" w:space="0" w:color="CCCCCC"/>
+              <w:right w:val="single" w:sz="1" w:space="0" w:color="CCCCCC"/>
+            </w:tcBorders>
+            <w:shd w:val="clear" w:color="auto" w:fill="EBF5FB"/>
+            <w:tcMar>
+              <w:top w:w="40" w:type="dxa"/>
+              <w:left w:w="90" w:type="dxa"/>
+              <w:bottom w:w="40" w:type="dxa"/>
+              <w:right w:w="90" w:type="dxa"/>
+            </w:tcMar>
+            <w:vAlign w:val="center"/>
+          </w:tcPr>
+          <w:p>
+            <w:pPr>
+              <w:jc w:val="center"/>
+              <w:rPr>
+                <w:rFonts w:ascii="ヒラギノ丸ゴ Pro W4" w:eastAsia="ヒラギノ丸ゴ Pro W4" w:hAnsi="ヒラギノ丸ゴ Pro W4" w:hint="eastAsia"/>
+                <w:b/>
+                <w:bCs/>
+                <w:color w:val="922B21"/>
+                <w:sz w:val="18"/>
+                <w:szCs w:val="18"/>
+              </w:rPr>
+            </w:pPr>
+            <w:r>
+              <w:rPr>
+                <w:rFonts w:ascii="ヒラギノ丸ゴ Pro W4" w:eastAsia="ヒラギノ丸ゴ Pro W4" w:hAnsi="ヒラギノ丸ゴ Pro W4" w:hint="eastAsia"/>
+                <w:b/>
+                <w:bCs/>
+                <w:color w:val="922B21"/>
+                <w:sz w:val="18"/>
+                <w:szCs w:val="18"/>
+              </w:rPr>
+              <w:t xml:space="preserve">朝食</w:t>
+            </w:r>
+          </w:p>
+        </w:tc>
+        <w:tc>
+          <w:tcPr>
+            <w:tcW w:w="2420" w:type="dxa"/>
+            <w:tcBorders>
+              <w:top w:val="single" w:sz="1" w:space="0" w:color="CCCCCC"/>
+              <w:left w:val="single" w:sz="1" w:space="0" w:color="CCCCCC"/>
+              <w:bottom w:val="single" w:sz="1" w:space="0" w:color="CCCCCC"/>
+              <w:right w:val="single" w:sz="1" w:space="0" w:color="CCCCCC"/>
+            </w:tcBorders>
+            <w:shd w:val="clear" w:color="auto" w:fill="EBF5FB"/>
+            <w:tcMar>
+              <w:top w:w="40" w:type="dxa"/>
+              <w:left w:w="90" w:type="dxa"/>
+              <w:bottom w:w="40" w:type="dxa"/>
+              <w:right w:w="90" w:type="dxa"/>
+            </w:tcMar>
+            <w:vAlign w:val="center"/>
+          </w:tcPr>
+          <w:p>
+            <w:pPr>
+              <w:rPr>
+                <w:rFonts w:ascii="ヒラギノ丸ゴ Pro W4" w:eastAsia="ヒラギノ丸ゴ Pro W4" w:hAnsi="ヒラギノ丸ゴ Pro W4" w:hint="eastAsia"/>
+                <w:color w:val="2C3E50"/>
+                <w:sz w:val="17"/>
+                <w:szCs w:val="17"/>
+              </w:rPr>
+            </w:pPr>
+            <w:r>
+              <w:rPr>
+                <w:rFonts w:ascii="ヒラギノ丸ゴ Pro W4" w:eastAsia="ヒラギノ丸ゴ Pro W4" w:hAnsi="ヒラギノ丸ゴ Pro W4" w:hint="eastAsia"/>
+                <w:color w:val="2C3E50"/>
+                <w:sz w:val="17"/>
+                <w:szCs w:val="17"/>
+              </w:rPr>
+              <w:t xml:space="preserve">ご飯180g、味噌汁、卵料理1品、バナナ1本＋オレンジ数切れ、オレンジジュース200ml、ヨーグルト＋ジャム</w:t>
+            </w:r>
+          </w:p>
+        </w:tc>
+        <w:tc>
+          <w:tcPr>
+            <w:tcW w:w="1120" w:type="dxa"/>
+            <w:tcBorders>
+              <w:top w:val="single" w:sz="1" w:space="0" w:color="CCCCCC"/>
+              <w:left w:val="single" w:sz="1" w:space="0" w:color="CCCCCC"/>
+              <w:bottom w:val="single" w:sz="1" w:space="0" w:color="CCCCCC"/>
+              <w:right w:val="single" w:sz="1" w:space="0" w:color="CCCCCC"/>
+            </w:tcBorders>
+            <w:shd w:val="clear" w:color="auto" w:fill="EBF5FB"/>
+            <w:tcMar>
+              <w:top w:w="40" w:type="dxa"/>
+              <w:left w:w="90" w:type="dxa"/>
+              <w:bottom w:w="40" w:type="dxa"/>
+              <w:right w:w="90" w:type="dxa"/>
+            </w:tcMar>
+            <w:vAlign w:val="center"/>
+          </w:tcPr>
+          <w:p>
+            <w:pPr>
+              <w:jc w:val="center"/>
+              <w:rPr>
+                <w:rFonts w:ascii="ヒラギノ丸ゴ Pro W4" w:eastAsia="ヒラギノ丸ゴ Pro W4" w:hAnsi="ヒラギノ丸ゴ Pro W4" w:hint="eastAsia"/>
+                <w:b/>
+                <w:bCs/>
+                <w:color w:val="2C3E50"/>
+                <w:sz w:val="17"/>
+                <w:szCs w:val="17"/>
+              </w:rPr>
+            </w:pPr>
+            <w:r>
+              <w:rPr>
+                <w:rFonts w:ascii="ヒラギノ丸ゴ Pro W4" w:eastAsia="ヒラギノ丸ゴ Pro W4" w:hAnsi="ヒラギノ丸ゴ Pro W4" w:hint="eastAsia"/>
+                <w:b/>
+                <w:bCs/>
+                <w:color w:val="2C3E50"/>
+                <w:sz w:val="17"/>
+                <w:szCs w:val="17"/>
+              </w:rPr>
+              <w:t xml:space="preserve">約720kcal</w:t>
+            </w:r>
+          </w:p>
+        </w:tc>
+        <w:tc>
+          <w:tcPr>
+            <w:tcW w:w="880" w:type="dxa"/>
+            <w:tcBorders>
+              <w:top w:val="single" w:sz="1" w:space="0" w:color="CCCCCC"/>
+              <w:left w:val="single" w:sz="1" w:space="0" w:color="CCCCCC"/>
+              <w:bottom w:val="single" w:sz="1" w:space="0" w:color="CCCCCC"/>
+              <w:right w:val="single" w:sz="1" w:space="0" w:color="CCCCCC"/>
+            </w:tcBorders>
+            <w:shd w:val="clear" w:color="auto" w:fill="EBF5FB"/>
+            <w:tcMar>
+              <w:top w:w="40" w:type="dxa"/>
+              <w:left w:w="90" w:type="dxa"/>
+              <w:bottom w:w="40" w:type="dxa"/>
+              <w:right w:w="90" w:type="dxa"/>
+            </w:tcMar>
+            <w:vAlign w:val="center"/>
+          </w:tcPr>
+          <w:p>
+            <w:pPr>
+              <w:jc w:val="center"/>
+              <w:rPr>
+                <w:rFonts w:ascii="ヒラギノ丸ゴ Pro W4" w:eastAsia="ヒラギノ丸ゴ Pro W4" w:hAnsi="ヒラギノ丸ゴ Pro W4" w:hint="eastAsia"/>
+                <w:b/>
+                <w:bCs/>
+                <w:color w:val="922B21"/>
+                <w:sz w:val="17"/>
+                <w:szCs w:val="17"/>
+              </w:rPr>
+            </w:pPr>
+            <w:r>
+              <w:rPr>
+                <w:rFonts w:ascii="ヒラギノ丸ゴ Pro W4" w:eastAsia="ヒラギノ丸ゴ Pro W4" w:hAnsi="ヒラギノ丸ゴ Pro W4" w:hint="eastAsia"/>
+                <w:b/>
+                <w:bCs/>
+                <w:color w:val="922B21"/>
+                <w:sz w:val="17"/>
+                <w:szCs w:val="17"/>
+              </w:rPr>
+              <w:t xml:space="preserve">約135g</w:t>
+            </w:r>
+          </w:p>
+        </w:tc>
+        <w:tc>
+          <w:tcPr>
+            <w:tcW w:w="760" w:type="dxa"/>
+            <w:tcBorders>
+              <w:top w:val="single" w:sz="1" w:space="0" w:color="CCCCCC"/>
+              <w:left w:val="single" w:sz="1" w:space="0" w:color="CCCCCC"/>
+              <w:bottom w:val="single" w:sz="1" w:space="0" w:color="CCCCCC"/>
+              <w:right w:val="single" w:sz="1" w:space="0" w:color="CCCCCC"/>
+            </w:tcBorders>
+            <w:shd w:val="clear" w:color="auto" w:fill="EBF5FB"/>
+            <w:tcMar>
+              <w:top w:w="40" w:type="dxa"/>
+              <w:left w:w="90" w:type="dxa"/>
+              <w:bottom w:w="40" w:type="dxa"/>
+              <w:right w:w="90" w:type="dxa"/>
+            </w:tcMar>
+            <w:vAlign w:val="center"/>
+          </w:tcPr>
+          <w:p>
+            <w:pPr>
+              <w:jc w:val="center"/>
+              <w:rPr>
+                <w:rFonts w:ascii="ヒラギノ丸ゴ Pro W4" w:eastAsia="ヒラギノ丸ゴ Pro W4" w:hAnsi="ヒラギノ丸ゴ Pro W4" w:hint="eastAsia"/>
+                <w:b/>
+                <w:bCs/>
+                <w:color w:val="922B21"/>
+                <w:sz w:val="17"/>
+                <w:szCs w:val="17"/>
+              </w:rPr>
+            </w:pPr>
+            <w:r>
+              <w:rPr>
+                <w:rFonts w:ascii="ヒラギノ丸ゴ Pro W4" w:eastAsia="ヒラギノ丸ゴ Pro W4" w:hAnsi="ヒラギノ丸ゴ Pro W4" w:hint="eastAsia"/>
+                <w:b/>
+                <w:bCs/>
+                <w:color w:val="922B21"/>
+                <w:sz w:val="17"/>
+                <w:szCs w:val="17"/>
+              </w:rPr>
+              <w:t xml:space="preserve">2.2</w:t>
+            </w:r>
+          </w:p>
+        </w:tc>
+        <w:tc>
+          <w:tcPr>
+            <w:tcW w:w="830" w:type="dxa"/>
+            <w:tcBorders>
+              <w:top w:val="single" w:sz="1" w:space="0" w:color="CCCCCC"/>
+              <w:left w:val="single" w:sz="1" w:space="0" w:color="CCCCCC"/>
+              <w:bottom w:val="single" w:sz="1" w:space="0" w:color="CCCCCC"/>
+              <w:right w:val="single" w:sz="1" w:space="0" w:color="CCCCCC"/>
+            </w:tcBorders>
+            <w:shd w:val="clear" w:color="auto" w:fill="EBF5FB"/>
+            <w:tcMar>
+              <w:top w:w="40" w:type="dxa"/>
+              <w:left w:w="90" w:type="dxa"/>
+              <w:bottom w:w="40" w:type="dxa"/>
+              <w:right w:w="90" w:type="dxa"/>
+            </w:tcMar>
+            <w:vAlign w:val="center"/>
+          </w:tcPr>
+          <w:p>
+            <w:pPr>
+              <w:jc w:val="center"/>
+              <w:rPr>
+                <w:rFonts w:ascii="ヒラギノ丸ゴ Pro W4" w:eastAsia="ヒラギノ丸ゴ Pro W4" w:hAnsi="ヒラギノ丸ゴ Pro W4" w:hint="eastAsia"/>
+                <w:b/>
+                <w:bCs/>
+                <w:color w:val="2C3E50"/>
+                <w:sz w:val="17"/>
+                <w:szCs w:val="17"/>
+              </w:rPr>
+            </w:pPr>
+            <w:r>
+              <w:rPr>
+                <w:rFonts w:ascii="ヒラギノ丸ゴ Pro W4" w:eastAsia="ヒラギノ丸ゴ Pro W4" w:hAnsi="ヒラギノ丸ゴ Pro W4" w:hint="eastAsia"/>
+                <w:b/>
+                <w:bCs/>
+                <w:color w:val="2C3E50"/>
+                <w:sz w:val="17"/>
+                <w:szCs w:val="17"/>
+              </w:rPr>
+              <w:t xml:space="preserve">約21g</w:t>
+            </w:r>
+          </w:p>
+        </w:tc>
+        <w:tc>
+          <w:tcPr>
+            <w:tcW w:w="2394" w:type="dxa"/>
+            <w:tcBorders>
+              <w:top w:val="single" w:sz="1" w:space="0" w:color="CCCCCC"/>
+              <w:left w:val="single" w:sz="1" w:space="0" w:color="CCCCCC"/>
+              <w:bottom w:val="single" w:sz="1" w:space="0" w:color="CCCCCC"/>
+              <w:right w:val="single" w:sz="1" w:space="0" w:color="CCCCCC"/>
+            </w:tcBorders>
+            <w:shd w:val="clear" w:color="auto" w:fill="EBF5FB"/>
+            <w:tcMar>
+              <w:top w:w="40" w:type="dxa"/>
+              <w:left w:w="90" w:type="dxa"/>
+              <w:bottom w:w="40" w:type="dxa"/>
+              <w:right w:w="90" w:type="dxa"/>
+            </w:tcMar>
+            <w:vAlign w:val="center"/>
+          </w:tcPr>
+          <w:p>
+            <w:pPr>
+              <w:rPr>
+                <w:rFonts w:ascii="ヒラギノ丸ゴ Pro W4" w:eastAsia="ヒラギノ丸ゴ Pro W4" w:hAnsi="ヒラギノ丸ゴ Pro W4" w:hint="eastAsia"/>
+                <w:color w:val="5D6D7E"/>
+                <w:sz w:val="16"/>
+                <w:szCs w:val="16"/>
+              </w:rPr>
+            </w:pPr>
+            <w:r>
+              <w:rPr>
+                <w:rFonts w:ascii="ヒラギノ丸ゴ Pro W4" w:eastAsia="ヒラギノ丸ゴ Pro W4" w:hAnsi="ヒラギノ丸ゴ Pro W4" w:hint="eastAsia"/>
+                <w:color w:val="5D6D7E"/>
+                <w:sz w:val="16"/>
+                <w:szCs w:val="16"/>
+              </w:rPr>
+              <w:t xml:space="preserve">パン2個にすると糖質 約−20g（1.9g/kg）</w:t>
+            </w:r>
+          </w:p>
+          <w:p>
+            <w:pPr>
+              <w:rPr>
+                <w:rFonts w:ascii="ヒラギノ丸ゴ Pro W4" w:eastAsia="ヒラギノ丸ゴ Pro W4" w:hAnsi="ヒラギノ丸ゴ Pro W4" w:hint="eastAsia"/>
+                <w:color w:val="5D6D7E"/>
+                <w:sz w:val="16"/>
+                <w:szCs w:val="16"/>
+              </w:rPr>
+            </w:pPr>
+            <w:r>
+              <w:rPr>
+                <w:rFonts w:ascii="ヒラギノ丸ゴ Pro W4" w:eastAsia="ヒラギノ丸ゴ Pro W4" w:hAnsi="ヒラギノ丸ゴ Pro W4" w:hint="eastAsia"/>
+                <w:color w:val="5D6D7E"/>
+                <w:sz w:val="16"/>
+                <w:szCs w:val="16"/>
+              </w:rPr>
+              <w:t xml:space="preserve">焼き魚にするとたんぱく質 約＋5g</w:t>
+            </w:r>
+          </w:p>
+        </w:tc>
+      </w:tr>
+      <w:tr>
+        <w:trPr>
+          <w:cantSplit/>
+        </w:trPr>
+        <w:tc>
+          <w:tcPr>
+            <w:tcW w:w="780" w:type="dxa"/>
+            <w:tcBorders>
+              <w:top w:val="single" w:sz="1" w:space="0" w:color="CCCCCC"/>
+              <w:left w:val="single" w:sz="1" w:space="0" w:color="CCCCCC"/>
+              <w:bottom w:val="single" w:sz="1" w:space="0" w:color="CCCCCC"/>
+              <w:right w:val="single" w:sz="1" w:space="0" w:color="CCCCCC"/>
+            </w:tcBorders>
+            <w:shd w:val="clear" w:color="auto" w:fill="EBF5FB"/>
+            <w:tcMar>
+              <w:top w:w="40" w:type="dxa"/>
+              <w:left w:w="90" w:type="dxa"/>
+              <w:bottom w:w="40" w:type="dxa"/>
+              <w:right w:w="90" w:type="dxa"/>
+            </w:tcMar>
+            <w:vAlign w:val="center"/>
+          </w:tcPr>
+          <w:p>
+            <w:pPr>
+              <w:jc w:val="center"/>
+              <w:rPr>
+                <w:rFonts w:ascii="ヒラギノ丸ゴ Pro W4" w:eastAsia="ヒラギノ丸ゴ Pro W4" w:hAnsi="ヒラギノ丸ゴ Pro W4" w:hint="eastAsia"/>
+                <w:color w:val="2C3E50"/>
+                <w:sz w:val="17"/>
+                <w:szCs w:val="17"/>
+              </w:rPr>
+            </w:pPr>
+            <w:r>
+              <w:rPr>
+                <w:rFonts w:ascii="ヒラギノ丸ゴ Pro W4" w:eastAsia="ヒラギノ丸ゴ Pro W4" w:hAnsi="ヒラギノ丸ゴ Pro W4" w:hint="eastAsia"/>
+                <w:color w:val="2C3E50"/>
+                <w:sz w:val="17"/>
+                <w:szCs w:val="17"/>
+              </w:rPr>
+              <w:t xml:space="preserve">10:00頃</w:t>
+            </w:r>
+          </w:p>
+        </w:tc>
+        <w:tc>
+          <w:tcPr>
+            <w:tcW w:w="880" w:type="dxa"/>
+            <w:tcBorders>
+              <w:top w:val="single" w:sz="1" w:space="0" w:color="CCCCCC"/>
+              <w:left w:val="single" w:sz="1" w:space="0" w:color="CCCCCC"/>
+              <w:bottom w:val="single" w:sz="1" w:space="0" w:color="CCCCCC"/>
+              <w:right w:val="single" w:sz="1" w:space="0" w:color="CCCCCC"/>
+            </w:tcBorders>
+            <w:shd w:val="clear" w:color="auto" w:fill="EBF5FB"/>
+            <w:tcMar>
+              <w:top w:w="40" w:type="dxa"/>
+              <w:left w:w="90" w:type="dxa"/>
+              <w:bottom w:w="40" w:type="dxa"/>
+              <w:right w:w="90" w:type="dxa"/>
+            </w:tcMar>
+            <w:vAlign w:val="center"/>
+          </w:tcPr>
+          <w:p>
+            <w:pPr>
+              <w:jc w:val="center"/>
+              <w:rPr>
+                <w:rFonts w:ascii="ヒラギノ丸ゴ Pro W4" w:eastAsia="ヒラギノ丸ゴ Pro W4" w:hAnsi="ヒラギノ丸ゴ Pro W4" w:hint="eastAsia"/>
+                <w:b/>
+                <w:bCs/>
+                <w:color w:val="922B21"/>
+                <w:sz w:val="18"/>
+                <w:szCs w:val="18"/>
+              </w:rPr>
+            </w:pPr>
+            <w:r>
+              <w:rPr>
+                <w:rFonts w:ascii="ヒラギノ丸ゴ Pro W4" w:eastAsia="ヒラギノ丸ゴ Pro W4" w:hAnsi="ヒラギノ丸ゴ Pro W4" w:hint="eastAsia"/>
+                <w:b/>
+                <w:bCs/>
+                <w:color w:val="922B21"/>
+                <w:sz w:val="18"/>
+                <w:szCs w:val="18"/>
+              </w:rPr>
+              <w:t xml:space="preserve">補食①</w:t>
+            </w:r>
+          </w:p>
+        </w:tc>
+        <w:tc>
+          <w:tcPr>
+            <w:tcW w:w="2420" w:type="dxa"/>
+            <w:tcBorders>
+              <w:top w:val="single" w:sz="1" w:space="0" w:color="CCCCCC"/>
+              <w:left w:val="single" w:sz="1" w:space="0" w:color="CCCCCC"/>
+              <w:bottom w:val="single" w:sz="1" w:space="0" w:color="CCCCCC"/>
+              <w:right w:val="single" w:sz="1" w:space="0" w:color="CCCCCC"/>
+            </w:tcBorders>
+            <w:shd w:val="clear" w:color="auto" w:fill="EBF5FB"/>
+            <w:tcMar>
+              <w:top w:w="40" w:type="dxa"/>
+              <w:left w:w="90" w:type="dxa"/>
+              <w:bottom w:w="40" w:type="dxa"/>
+              <w:right w:w="90" w:type="dxa"/>
+            </w:tcMar>
+            <w:vAlign w:val="center"/>
+          </w:tcPr>
+          <w:p>
+            <w:pPr>
+              <w:rPr>
+                <w:rFonts w:ascii="ヒラギノ丸ゴ Pro W4" w:eastAsia="ヒラギノ丸ゴ Pro W4" w:hAnsi="ヒラギノ丸ゴ Pro W4" w:hint="eastAsia"/>
+                <w:color w:val="2C3E50"/>
+                <w:sz w:val="17"/>
+                <w:szCs w:val="17"/>
+              </w:rPr>
+            </w:pPr>
+            <w:r>
+              <w:rPr>
+                <w:rFonts w:ascii="ヒラギノ丸ゴ Pro W4" w:eastAsia="ヒラギノ丸ゴ Pro W4" w:hAnsi="ヒラギノ丸ゴ Pro W4" w:hint="eastAsia"/>
+                <w:color w:val="2C3E50"/>
+                <w:sz w:val="17"/>
+                <w:szCs w:val="17"/>
+              </w:rPr>
+              <w:t xml:space="preserve">バナナ1本</w:t>
+            </w:r>
+          </w:p>
+        </w:tc>
+        <w:tc>
+          <w:tcPr>
+            <w:tcW w:w="1120" w:type="dxa"/>
+            <w:tcBorders>
+              <w:top w:val="single" w:sz="1" w:space="0" w:color="CCCCCC"/>
+              <w:left w:val="single" w:sz="1" w:space="0" w:color="CCCCCC"/>
+              <w:bottom w:val="single" w:sz="1" w:space="0" w:color="CCCCCC"/>
+              <w:right w:val="single" w:sz="1" w:space="0" w:color="CCCCCC"/>
+            </w:tcBorders>
+            <w:shd w:val="clear" w:color="auto" w:fill="EBF5FB"/>
+            <w:tcMar>
+              <w:top w:w="40" w:type="dxa"/>
+              <w:left w:w="90" w:type="dxa"/>
+              <w:bottom w:w="40" w:type="dxa"/>
+              <w:right w:w="90" w:type="dxa"/>
+            </w:tcMar>
+            <w:vAlign w:val="center"/>
+          </w:tcPr>
+          <w:p>
+            <w:pPr>
+              <w:jc w:val="center"/>
+              <w:rPr>
+                <w:rFonts w:ascii="ヒラギノ丸ゴ Pro W4" w:eastAsia="ヒラギノ丸ゴ Pro W4" w:hAnsi="ヒラギノ丸ゴ Pro W4" w:hint="eastAsia"/>
+                <w:b/>
+                <w:bCs/>
+                <w:color w:val="2C3E50"/>
+                <w:sz w:val="17"/>
+                <w:szCs w:val="17"/>
+              </w:rPr>
+            </w:pPr>
+            <w:r>
+              <w:rPr>
+                <w:rFonts w:ascii="ヒラギノ丸ゴ Pro W4" w:eastAsia="ヒラギノ丸ゴ Pro W4" w:hAnsi="ヒラギノ丸ゴ Pro W4" w:hint="eastAsia"/>
+                <w:b/>
+                <w:bCs/>
+                <w:color w:val="2C3E50"/>
+                <w:sz w:val="17"/>
+                <w:szCs w:val="17"/>
+              </w:rPr>
+              <w:t xml:space="preserve">約95kcal</w:t>
+            </w:r>
+          </w:p>
+        </w:tc>
+        <w:tc>
+          <w:tcPr>
+            <w:tcW w:w="880" w:type="dxa"/>
+            <w:tcBorders>
+              <w:top w:val="single" w:sz="1" w:space="0" w:color="CCCCCC"/>
+              <w:left w:val="single" w:sz="1" w:space="0" w:color="CCCCCC"/>
+              <w:bottom w:val="single" w:sz="1" w:space="0" w:color="CCCCCC"/>
+              <w:right w:val="single" w:sz="1" w:space="0" w:color="CCCCCC"/>
+            </w:tcBorders>
+            <w:shd w:val="clear" w:color="auto" w:fill="EBF5FB"/>
+            <w:tcMar>
+              <w:top w:w="40" w:type="dxa"/>
+              <w:left w:w="90" w:type="dxa"/>
+              <w:bottom w:w="40" w:type="dxa"/>
+              <w:right w:w="90" w:type="dxa"/>
+            </w:tcMar>
+            <w:vAlign w:val="center"/>
+          </w:tcPr>
+          <w:p>
+            <w:pPr>
+              <w:jc w:val="center"/>
+              <w:rPr>
+                <w:rFonts w:ascii="ヒラギノ丸ゴ Pro W4" w:eastAsia="ヒラギノ丸ゴ Pro W4" w:hAnsi="ヒラギノ丸ゴ Pro W4" w:hint="eastAsia"/>
+                <w:b/>
+                <w:bCs/>
+                <w:color w:val="922B21"/>
+                <w:sz w:val="17"/>
+                <w:szCs w:val="17"/>
+              </w:rPr>
+            </w:pPr>
+            <w:r>
+              <w:rPr>
+                <w:rFonts w:ascii="ヒラギノ丸ゴ Pro W4" w:eastAsia="ヒラギノ丸ゴ Pro W4" w:hAnsi="ヒラギノ丸ゴ Pro W4" w:hint="eastAsia"/>
+                <w:b/>
+                <w:bCs/>
+                <w:color w:val="922B21"/>
+                <w:sz w:val="17"/>
+                <w:szCs w:val="17"/>
+              </w:rPr>
+              <w:t xml:space="preserve">約22g</w:t>
+            </w:r>
+          </w:p>
+        </w:tc>
+        <w:tc>
+          <w:tcPr>
+            <w:tcW w:w="760" w:type="dxa"/>
+            <w:tcBorders>
+              <w:top w:val="single" w:sz="1" w:space="0" w:color="CCCCCC"/>
+              <w:left w:val="single" w:sz="1" w:space="0" w:color="CCCCCC"/>
+              <w:bottom w:val="single" w:sz="1" w:space="0" w:color="CCCCCC"/>
+              <w:right w:val="single" w:sz="1" w:space="0" w:color="CCCCCC"/>
+            </w:tcBorders>
+            <w:shd w:val="clear" w:color="auto" w:fill="EBF5FB"/>
+            <w:tcMar>
+              <w:top w:w="40" w:type="dxa"/>
+              <w:left w:w="90" w:type="dxa"/>
+              <w:bottom w:w="40" w:type="dxa"/>
+              <w:right w:w="90" w:type="dxa"/>
+            </w:tcMar>
+            <w:vAlign w:val="center"/>
+          </w:tcPr>
+          <w:p>
+            <w:pPr>
+              <w:jc w:val="center"/>
+              <w:rPr>
+                <w:rFonts w:ascii="ヒラギノ丸ゴ Pro W4" w:eastAsia="ヒラギノ丸ゴ Pro W4" w:hAnsi="ヒラギノ丸ゴ Pro W4" w:hint="eastAsia"/>
+                <w:b/>
+                <w:bCs/>
+                <w:color w:val="922B21"/>
+                <w:sz w:val="17"/>
+                <w:szCs w:val="17"/>
+              </w:rPr>
+            </w:pPr>
+            <w:r>
+              <w:rPr>
+                <w:rFonts w:ascii="ヒラギノ丸ゴ Pro W4" w:eastAsia="ヒラギノ丸ゴ Pro W4" w:hAnsi="ヒラギノ丸ゴ Pro W4" w:hint="eastAsia"/>
+                <w:b/>
+                <w:bCs/>
+                <w:color w:val="922B21"/>
+                <w:sz w:val="17"/>
+                <w:szCs w:val="17"/>
+              </w:rPr>
+              <w:t xml:space="preserve">0.4</w:t>
+            </w:r>
+          </w:p>
+        </w:tc>
+        <w:tc>
+          <w:tcPr>
+            <w:tcW w:w="830" w:type="dxa"/>
+            <w:tcBorders>
+              <w:top w:val="single" w:sz="1" w:space="0" w:color="CCCCCC"/>
+              <w:left w:val="single" w:sz="1" w:space="0" w:color="CCCCCC"/>
+              <w:bottom w:val="single" w:sz="1" w:space="0" w:color="CCCCCC"/>
+              <w:right w:val="single" w:sz="1" w:space="0" w:color="CCCCCC"/>
+            </w:tcBorders>
+            <w:shd w:val="clear" w:color="auto" w:fill="EBF5FB"/>
+            <w:tcMar>
+              <w:top w:w="40" w:type="dxa"/>
+              <w:left w:w="90" w:type="dxa"/>
+              <w:bottom w:w="40" w:type="dxa"/>
+              <w:right w:w="90" w:type="dxa"/>
+            </w:tcMar>
+            <w:vAlign w:val="center"/>
+          </w:tcPr>
+          <w:p>
+            <w:pPr>
+              <w:jc w:val="center"/>
+              <w:rPr>
+                <w:rFonts w:ascii="ヒラギノ丸ゴ Pro W4" w:eastAsia="ヒラギノ丸ゴ Pro W4" w:hAnsi="ヒラギノ丸ゴ Pro W4" w:hint="eastAsia"/>
+                <w:b/>
+                <w:bCs/>
+                <w:color w:val="2C3E50"/>
+                <w:sz w:val="17"/>
+                <w:szCs w:val="17"/>
+              </w:rPr>
+            </w:pPr>
+            <w:r>
+              <w:rPr>
+                <w:rFonts w:ascii="ヒラギノ丸ゴ Pro W4" w:eastAsia="ヒラギノ丸ゴ Pro W4" w:hAnsi="ヒラギノ丸ゴ Pro W4" w:hint="eastAsia"/>
+                <w:b/>
+                <w:bCs/>
+                <w:color w:val="2C3E50"/>
+                <w:sz w:val="17"/>
+                <w:szCs w:val="17"/>
+              </w:rPr>
+              <w:t xml:space="preserve">約1g</w:t>
+            </w:r>
+          </w:p>
+        </w:tc>
+        <w:tc>
+          <w:tcPr>
+            <w:tcW w:w="2394" w:type="dxa"/>
+            <w:tcBorders>
+              <w:top w:val="single" w:sz="1" w:space="0" w:color="CCCCCC"/>
+              <w:left w:val="single" w:sz="1" w:space="0" w:color="CCCCCC"/>
+              <w:bottom w:val="single" w:sz="1" w:space="0" w:color="CCCCCC"/>
+              <w:right w:val="single" w:sz="1" w:space="0" w:color="CCCCCC"/>
+            </w:tcBorders>
+            <w:shd w:val="clear" w:color="auto" w:fill="EBF5FB"/>
+            <w:tcMar>
+              <w:top w:w="40" w:type="dxa"/>
+              <w:left w:w="90" w:type="dxa"/>
+              <w:bottom w:w="40" w:type="dxa"/>
+              <w:right w:w="90" w:type="dxa"/>
+            </w:tcMar>
+            <w:vAlign w:val="center"/>
+          </w:tcPr>
+          <w:p>
+            <w:pPr>
+              <w:rPr>
+                <w:rFonts w:ascii="ヒラギノ丸ゴ Pro W4" w:eastAsia="ヒラギノ丸ゴ Pro W4" w:hAnsi="ヒラギノ丸ゴ Pro W4" w:hint="eastAsia"/>
+                <w:color w:val="5D6D7E"/>
+                <w:sz w:val="16"/>
+                <w:szCs w:val="16"/>
+              </w:rPr>
+            </w:pPr>
+            <w:r>
+              <w:rPr>
+                <w:rFonts w:ascii="ヒラギノ丸ゴ Pro W4" w:eastAsia="ヒラギノ丸ゴ Pro W4" w:hAnsi="ヒラギノ丸ゴ Pro W4" w:hint="eastAsia"/>
+                <w:color w:val="5D6D7E"/>
+                <w:sz w:val="16"/>
+                <w:szCs w:val="16"/>
+              </w:rPr>
+              <w:t xml:space="preserve">おにぎり小1個：約125kcal／30g（0.5g/kg）／2g</w:t>
+            </w:r>
+          </w:p>
+        </w:tc>
+      </w:tr>
+      <w:tr>
+        <w:trPr>
+          <w:cantSplit/>
+        </w:trPr>
+        <w:tc>
+          <w:tcPr>
+            <w:tcW w:w="780" w:type="dxa"/>
+            <w:tcBorders>
+              <w:top w:val="single" w:sz="1" w:space="0" w:color="CCCCCC"/>
+              <w:left w:val="single" w:sz="1" w:space="0" w:color="CCCCCC"/>
+              <w:bottom w:val="single" w:sz="1" w:space="0" w:color="CCCCCC"/>
+              <w:right w:val="single" w:sz="1" w:space="0" w:color="CCCCCC"/>
+            </w:tcBorders>
+            <w:shd w:val="clear" w:color="auto" w:fill="EBF5FB"/>
+            <w:tcMar>
+              <w:top w:w="40" w:type="dxa"/>
+              <w:left w:w="90" w:type="dxa"/>
+              <w:bottom w:w="40" w:type="dxa"/>
+              <w:right w:w="90" w:type="dxa"/>
+            </w:tcMar>
+            <w:vAlign w:val="center"/>
+          </w:tcPr>
+          <w:p>
+            <w:pPr>
+              <w:jc w:val="center"/>
+              <w:rPr>
+                <w:rFonts w:ascii="ヒラギノ丸ゴ Pro W4" w:eastAsia="ヒラギノ丸ゴ Pro W4" w:hAnsi="ヒラギノ丸ゴ Pro W4" w:hint="eastAsia"/>
+                <w:color w:val="2C3E50"/>
+                <w:sz w:val="17"/>
+                <w:szCs w:val="17"/>
+              </w:rPr>
+            </w:pPr>
+            <w:r>
+              <w:rPr>
+                <w:rFonts w:ascii="ヒラギノ丸ゴ Pro W4" w:eastAsia="ヒラギノ丸ゴ Pro W4" w:hAnsi="ヒラギノ丸ゴ Pro W4" w:hint="eastAsia"/>
+                <w:color w:val="2C3E50"/>
+                <w:sz w:val="17"/>
+                <w:szCs w:val="17"/>
+              </w:rPr>
+              <w:t xml:space="preserve">12:00〜</w:t>
+            </w:r>
+          </w:p>
+        </w:tc>
+        <w:tc>
+          <w:tcPr>
+            <w:tcW w:w="880" w:type="dxa"/>
+            <w:tcBorders>
+              <w:top w:val="single" w:sz="1" w:space="0" w:color="CCCCCC"/>
+              <w:left w:val="single" w:sz="1" w:space="0" w:color="CCCCCC"/>
+              <w:bottom w:val="single" w:sz="1" w:space="0" w:color="CCCCCC"/>
+              <w:right w:val="single" w:sz="1" w:space="0" w:color="CCCCCC"/>
+            </w:tcBorders>
+            <w:shd w:val="clear" w:color="auto" w:fill="EBF5FB"/>
+            <w:tcMar>
+              <w:top w:w="40" w:type="dxa"/>
+              <w:left w:w="90" w:type="dxa"/>
+              <w:bottom w:w="40" w:type="dxa"/>
+              <w:right w:w="90" w:type="dxa"/>
+            </w:tcMar>
+            <w:vAlign w:val="center"/>
+          </w:tcPr>
+          <w:p>
+            <w:pPr>
+              <w:jc w:val="center"/>
+              <w:rPr>
+                <w:rFonts w:ascii="ヒラギノ丸ゴ Pro W4" w:eastAsia="ヒラギノ丸ゴ Pro W4" w:hAnsi="ヒラギノ丸ゴ Pro W4" w:hint="eastAsia"/>
+                <w:b/>
+                <w:bCs/>
+                <w:color w:val="922B21"/>
+                <w:sz w:val="18"/>
+                <w:szCs w:val="18"/>
+              </w:rPr>
+            </w:pPr>
+            <w:r>
+              <w:rPr>
+                <w:rFonts w:ascii="ヒラギノ丸ゴ Pro W4" w:eastAsia="ヒラギノ丸ゴ Pro W4" w:hAnsi="ヒラギノ丸ゴ Pro W4" w:hint="eastAsia"/>
+                <w:b/>
+                <w:bCs/>
+                <w:color w:val="922B21"/>
+                <w:sz w:val="18"/>
+                <w:szCs w:val="18"/>
+              </w:rPr>
+              <w:t xml:space="preserve">昼食</w:t>
+            </w:r>
+          </w:p>
+        </w:tc>
+        <w:tc>
+          <w:tcPr>
+            <w:tcW w:w="2420" w:type="dxa"/>
+            <w:tcBorders>
+              <w:top w:val="single" w:sz="1" w:space="0" w:color="CCCCCC"/>
+              <w:left w:val="single" w:sz="1" w:space="0" w:color="CCCCCC"/>
+              <w:bottom w:val="single" w:sz="1" w:space="0" w:color="CCCCCC"/>
+              <w:right w:val="single" w:sz="1" w:space="0" w:color="CCCCCC"/>
+            </w:tcBorders>
+            <w:shd w:val="clear" w:color="auto" w:fill="EBF5FB"/>
+            <w:tcMar>
+              <w:top w:w="40" w:type="dxa"/>
+              <w:left w:w="90" w:type="dxa"/>
+              <w:bottom w:w="40" w:type="dxa"/>
+              <w:right w:w="90" w:type="dxa"/>
+            </w:tcMar>
+            <w:vAlign w:val="center"/>
+          </w:tcPr>
+          <w:p>
+            <w:pPr>
+              <w:rPr>
+                <w:rFonts w:ascii="ヒラギノ丸ゴ Pro W4" w:eastAsia="ヒラギノ丸ゴ Pro W4" w:hAnsi="ヒラギノ丸ゴ Pro W4" w:hint="eastAsia"/>
+                <w:color w:val="2C3E50"/>
+                <w:sz w:val="17"/>
+                <w:szCs w:val="17"/>
+              </w:rPr>
+            </w:pPr>
+            <w:r>
+              <w:rPr>
+                <w:rFonts w:ascii="ヒラギノ丸ゴ Pro W4" w:eastAsia="ヒラギノ丸ゴ Pro W4" w:hAnsi="ヒラギノ丸ゴ Pro W4" w:hint="eastAsia"/>
+                <w:color w:val="2C3E50"/>
+                <w:sz w:val="17"/>
+                <w:szCs w:val="17"/>
+              </w:rPr>
+              <w:t xml:space="preserve">ご飯180g、うどん小盛り、肉じゃが小鉢、鶏の照り焼き、温野菜、オレンジジュース200ml</w:t>
+            </w:r>
+          </w:p>
+        </w:tc>
+        <w:tc>
+          <w:tcPr>
+            <w:tcW w:w="1120" w:type="dxa"/>
+            <w:tcBorders>
+              <w:top w:val="single" w:sz="1" w:space="0" w:color="CCCCCC"/>
+              <w:left w:val="single" w:sz="1" w:space="0" w:color="CCCCCC"/>
+              <w:bottom w:val="single" w:sz="1" w:space="0" w:color="CCCCCC"/>
+              <w:right w:val="single" w:sz="1" w:space="0" w:color="CCCCCC"/>
+            </w:tcBorders>
+            <w:shd w:val="clear" w:color="auto" w:fill="EBF5FB"/>
+            <w:tcMar>
+              <w:top w:w="40" w:type="dxa"/>
+              <w:left w:w="90" w:type="dxa"/>
+              <w:bottom w:w="40" w:type="dxa"/>
+              <w:right w:w="90" w:type="dxa"/>
+            </w:tcMar>
+            <w:vAlign w:val="center"/>
+          </w:tcPr>
+          <w:p>
+            <w:pPr>
+              <w:jc w:val="center"/>
+              <w:rPr>
+                <w:rFonts w:ascii="ヒラギノ丸ゴ Pro W4" w:eastAsia="ヒラギノ丸ゴ Pro W4" w:hAnsi="ヒラギノ丸ゴ Pro W4" w:hint="eastAsia"/>
+                <w:b/>
+                <w:bCs/>
+                <w:color w:val="2C3E50"/>
+                <w:sz w:val="17"/>
+                <w:szCs w:val="17"/>
+              </w:rPr>
+            </w:pPr>
+            <w:r>
+              <w:rPr>
+                <w:rFonts w:ascii="ヒラギノ丸ゴ Pro W4" w:eastAsia="ヒラギノ丸ゴ Pro W4" w:hAnsi="ヒラギノ丸ゴ Pro W4" w:hint="eastAsia"/>
+                <w:b/>
+                <w:bCs/>
+                <w:color w:val="2C3E50"/>
+                <w:sz w:val="17"/>
+                <w:szCs w:val="17"/>
+              </w:rPr>
+              <w:t xml:space="preserve">約740kcal</w:t>
+            </w:r>
+          </w:p>
+        </w:tc>
+        <w:tc>
+          <w:tcPr>
+            <w:tcW w:w="880" w:type="dxa"/>
+            <w:tcBorders>
+              <w:top w:val="single" w:sz="1" w:space="0" w:color="CCCCCC"/>
+              <w:left w:val="single" w:sz="1" w:space="0" w:color="CCCCCC"/>
+              <w:bottom w:val="single" w:sz="1" w:space="0" w:color="CCCCCC"/>
+              <w:right w:val="single" w:sz="1" w:space="0" w:color="CCCCCC"/>
+            </w:tcBorders>
+            <w:shd w:val="clear" w:color="auto" w:fill="EBF5FB"/>
+            <w:tcMar>
+              <w:top w:w="40" w:type="dxa"/>
+              <w:left w:w="90" w:type="dxa"/>
+              <w:bottom w:w="40" w:type="dxa"/>
+              <w:right w:w="90" w:type="dxa"/>
+            </w:tcMar>
+            <w:vAlign w:val="center"/>
+          </w:tcPr>
+          <w:p>
+            <w:pPr>
+              <w:jc w:val="center"/>
+              <w:rPr>
+                <w:rFonts w:ascii="ヒラギノ丸ゴ Pro W4" w:eastAsia="ヒラギノ丸ゴ Pro W4" w:hAnsi="ヒラギノ丸ゴ Pro W4" w:hint="eastAsia"/>
+                <w:b/>
+                <w:bCs/>
+                <w:color w:val="922B21"/>
+                <w:sz w:val="17"/>
+                <w:szCs w:val="17"/>
+              </w:rPr>
+            </w:pPr>
+            <w:r>
+              <w:rPr>
+                <w:rFonts w:ascii="ヒラギノ丸ゴ Pro W4" w:eastAsia="ヒラギノ丸ゴ Pro W4" w:hAnsi="ヒラギノ丸ゴ Pro W4" w:hint="eastAsia"/>
+                <w:b/>
+                <w:bCs/>
+                <w:color w:val="922B21"/>
+                <w:sz w:val="17"/>
+                <w:szCs w:val="17"/>
+              </w:rPr>
+              <w:t xml:space="preserve">約135g</w:t>
+            </w:r>
+          </w:p>
+        </w:tc>
+        <w:tc>
+          <w:tcPr>
+            <w:tcW w:w="760" w:type="dxa"/>
+            <w:tcBorders>
+              <w:top w:val="single" w:sz="1" w:space="0" w:color="CCCCCC"/>
+              <w:left w:val="single" w:sz="1" w:space="0" w:color="CCCCCC"/>
+              <w:bottom w:val="single" w:sz="1" w:space="0" w:color="CCCCCC"/>
+              <w:right w:val="single" w:sz="1" w:space="0" w:color="CCCCCC"/>
+            </w:tcBorders>
+            <w:shd w:val="clear" w:color="auto" w:fill="EBF5FB"/>
+            <w:tcMar>
+              <w:top w:w="40" w:type="dxa"/>
+              <w:left w:w="90" w:type="dxa"/>
+              <w:bottom w:w="40" w:type="dxa"/>
+              <w:right w:w="90" w:type="dxa"/>
+            </w:tcMar>
+            <w:vAlign w:val="center"/>
+          </w:tcPr>
+          <w:p>
+            <w:pPr>
+              <w:jc w:val="center"/>
+              <w:rPr>
+                <w:rFonts w:ascii="ヒラギノ丸ゴ Pro W4" w:eastAsia="ヒラギノ丸ゴ Pro W4" w:hAnsi="ヒラギノ丸ゴ Pro W4" w:hint="eastAsia"/>
+                <w:b/>
+                <w:bCs/>
+                <w:color w:val="922B21"/>
+                <w:sz w:val="17"/>
+                <w:szCs w:val="17"/>
+              </w:rPr>
+            </w:pPr>
+            <w:r>
+              <w:rPr>
+                <w:rFonts w:ascii="ヒラギノ丸ゴ Pro W4" w:eastAsia="ヒラギノ丸ゴ Pro W4" w:hAnsi="ヒラギノ丸ゴ Pro W4" w:hint="eastAsia"/>
+                <w:b/>
+                <w:bCs/>
+                <w:color w:val="922B21"/>
+                <w:sz w:val="17"/>
+                <w:szCs w:val="17"/>
+              </w:rPr>
+              <w:t xml:space="preserve">2.2</w:t>
+            </w:r>
+          </w:p>
+        </w:tc>
+        <w:tc>
+          <w:tcPr>
+            <w:tcW w:w="830" w:type="dxa"/>
+            <w:tcBorders>
+              <w:top w:val="single" w:sz="1" w:space="0" w:color="CCCCCC"/>
+              <w:left w:val="single" w:sz="1" w:space="0" w:color="CCCCCC"/>
+              <w:bottom w:val="single" w:sz="1" w:space="0" w:color="CCCCCC"/>
+              <w:right w:val="single" w:sz="1" w:space="0" w:color="CCCCCC"/>
+            </w:tcBorders>
+            <w:shd w:val="clear" w:color="auto" w:fill="EBF5FB"/>
+            <w:tcMar>
+              <w:top w:w="40" w:type="dxa"/>
+              <w:left w:w="90" w:type="dxa"/>
+              <w:bottom w:w="40" w:type="dxa"/>
+              <w:right w:w="90" w:type="dxa"/>
+            </w:tcMar>
+            <w:vAlign w:val="center"/>
+          </w:tcPr>
+          <w:p>
+            <w:pPr>
+              <w:jc w:val="center"/>
+              <w:rPr>
+                <w:rFonts w:ascii="ヒラギノ丸ゴ Pro W4" w:eastAsia="ヒラギノ丸ゴ Pro W4" w:hAnsi="ヒラギノ丸ゴ Pro W4" w:hint="eastAsia"/>
+                <w:b/>
+                <w:bCs/>
+                <w:color w:val="2C3E50"/>
+                <w:sz w:val="17"/>
+                <w:szCs w:val="17"/>
+              </w:rPr>
+            </w:pPr>
+            <w:r>
+              <w:rPr>
+                <w:rFonts w:ascii="ヒラギノ丸ゴ Pro W4" w:eastAsia="ヒラギノ丸ゴ Pro W4" w:hAnsi="ヒラギノ丸ゴ Pro W4" w:hint="eastAsia"/>
+                <w:b/>
+                <w:bCs/>
+                <w:color w:val="2C3E50"/>
+                <w:sz w:val="17"/>
+                <w:szCs w:val="17"/>
+              </w:rPr>
+              <w:t xml:space="preserve">約30g</w:t>
+            </w:r>
+          </w:p>
+        </w:tc>
+        <w:tc>
+          <w:tcPr>
+            <w:tcW w:w="2394" w:type="dxa"/>
+            <w:tcBorders>
+              <w:top w:val="single" w:sz="1" w:space="0" w:color="CCCCCC"/>
+              <w:left w:val="single" w:sz="1" w:space="0" w:color="CCCCCC"/>
+              <w:bottom w:val="single" w:sz="1" w:space="0" w:color="CCCCCC"/>
+              <w:right w:val="single" w:sz="1" w:space="0" w:color="CCCCCC"/>
+            </w:tcBorders>
+            <w:shd w:val="clear" w:color="auto" w:fill="EBF5FB"/>
+            <w:tcMar>
+              <w:top w:w="40" w:type="dxa"/>
+              <w:left w:w="90" w:type="dxa"/>
+              <w:bottom w:w="40" w:type="dxa"/>
+              <w:right w:w="90" w:type="dxa"/>
+            </w:tcMar>
+            <w:vAlign w:val="center"/>
+          </w:tcPr>
+          <w:p>
+            <w:pPr>
+              <w:rPr>
+                <w:rFonts w:ascii="ヒラギノ丸ゴ Pro W4" w:eastAsia="ヒラギノ丸ゴ Pro W4" w:hAnsi="ヒラギノ丸ゴ Pro W4" w:hint="eastAsia"/>
+                <w:color w:val="5D6D7E"/>
+                <w:sz w:val="16"/>
+                <w:szCs w:val="16"/>
+              </w:rPr>
+            </w:pPr>
+            <w:r>
+              <w:rPr>
+                <w:rFonts w:ascii="ヒラギノ丸ゴ Pro W4" w:eastAsia="ヒラギノ丸ゴ Pro W4" w:hAnsi="ヒラギノ丸ゴ Pro W4" w:hint="eastAsia"/>
+                <w:color w:val="5D6D7E"/>
+                <w:sz w:val="16"/>
+                <w:szCs w:val="16"/>
+              </w:rPr>
+              <w:t xml:space="preserve">パスタ少量（トマト系）でもほぼ同じ</w:t>
+            </w:r>
+          </w:p>
+        </w:tc>
+      </w:tr>
+      <w:tr>
+        <w:trPr>
+          <w:cantSplit/>
+        </w:trPr>
+        <w:tc>
+          <w:tcPr>
+            <w:tcW w:w="780" w:type="dxa"/>
+            <w:tcBorders>
+              <w:top w:val="single" w:sz="1" w:space="0" w:color="CCCCCC"/>
+              <w:left w:val="single" w:sz="1" w:space="0" w:color="CCCCCC"/>
+              <w:bottom w:val="single" w:sz="1" w:space="0" w:color="CCCCCC"/>
+              <w:right w:val="single" w:sz="1" w:space="0" w:color="CCCCCC"/>
+            </w:tcBorders>
+            <w:shd w:val="clear" w:color="auto" w:fill="EBF5FB"/>
+            <w:tcMar>
+              <w:top w:w="40" w:type="dxa"/>
+              <w:left w:w="90" w:type="dxa"/>
+              <w:bottom w:w="40" w:type="dxa"/>
+              <w:right w:w="90" w:type="dxa"/>
+            </w:tcMar>
+            <w:vAlign w:val="center"/>
+          </w:tcPr>
+          <w:p>
+            <w:pPr>
+              <w:jc w:val="center"/>
+              <w:rPr>
+                <w:rFonts w:ascii="ヒラギノ丸ゴ Pro W4" w:eastAsia="ヒラギノ丸ゴ Pro W4" w:hAnsi="ヒラギノ丸ゴ Pro W4" w:hint="eastAsia"/>
+                <w:color w:val="2C3E50"/>
+                <w:sz w:val="17"/>
+                <w:szCs w:val="17"/>
+              </w:rPr>
+            </w:pPr>
+            <w:r>
+              <w:rPr>
+                <w:rFonts w:ascii="ヒラギノ丸ゴ Pro W4" w:eastAsia="ヒラギノ丸ゴ Pro W4" w:hAnsi="ヒラギノ丸ゴ Pro W4" w:hint="eastAsia"/>
+                <w:color w:val="2C3E50"/>
+                <w:sz w:val="17"/>
+                <w:szCs w:val="17"/>
+              </w:rPr>
+              <w:t xml:space="preserve">15:00〜</w:t>
+            </w:r>
+          </w:p>
+        </w:tc>
+        <w:tc>
+          <w:tcPr>
+            <w:tcW w:w="880" w:type="dxa"/>
+            <w:tcBorders>
+              <w:top w:val="single" w:sz="1" w:space="0" w:color="CCCCCC"/>
+              <w:left w:val="single" w:sz="1" w:space="0" w:color="CCCCCC"/>
+              <w:bottom w:val="single" w:sz="1" w:space="0" w:color="CCCCCC"/>
+              <w:right w:val="single" w:sz="1" w:space="0" w:color="CCCCCC"/>
+            </w:tcBorders>
+            <w:shd w:val="clear" w:color="auto" w:fill="EBF5FB"/>
+            <w:tcMar>
+              <w:top w:w="40" w:type="dxa"/>
+              <w:left w:w="90" w:type="dxa"/>
+              <w:bottom w:w="40" w:type="dxa"/>
+              <w:right w:w="90" w:type="dxa"/>
+            </w:tcMar>
+            <w:vAlign w:val="center"/>
+          </w:tcPr>
+          <w:p>
+            <w:pPr>
+              <w:jc w:val="center"/>
+              <w:rPr>
+                <w:rFonts w:ascii="ヒラギノ丸ゴ Pro W4" w:eastAsia="ヒラギノ丸ゴ Pro W4" w:hAnsi="ヒラギノ丸ゴ Pro W4" w:hint="eastAsia"/>
+                <w:b/>
+                <w:bCs/>
+                <w:color w:val="922B21"/>
+                <w:sz w:val="18"/>
+                <w:szCs w:val="18"/>
+              </w:rPr>
+            </w:pPr>
+            <w:r>
+              <w:rPr>
+                <w:rFonts w:ascii="ヒラギノ丸ゴ Pro W4" w:eastAsia="ヒラギノ丸ゴ Pro W4" w:hAnsi="ヒラギノ丸ゴ Pro W4" w:hint="eastAsia"/>
+                <w:b/>
+                <w:bCs/>
+                <w:color w:val="922B21"/>
+                <w:sz w:val="18"/>
+                <w:szCs w:val="18"/>
+              </w:rPr>
+              <w:t xml:space="preserve">補食②</w:t>
+            </w:r>
+          </w:p>
+        </w:tc>
+        <w:tc>
+          <w:tcPr>
+            <w:tcW w:w="2420" w:type="dxa"/>
+            <w:tcBorders>
+              <w:top w:val="single" w:sz="1" w:space="0" w:color="CCCCCC"/>
+              <w:left w:val="single" w:sz="1" w:space="0" w:color="CCCCCC"/>
+              <w:bottom w:val="single" w:sz="1" w:space="0" w:color="CCCCCC"/>
+              <w:right w:val="single" w:sz="1" w:space="0" w:color="CCCCCC"/>
+            </w:tcBorders>
+            <w:shd w:val="clear" w:color="auto" w:fill="EBF5FB"/>
+            <w:tcMar>
+              <w:top w:w="40" w:type="dxa"/>
+              <w:left w:w="90" w:type="dxa"/>
+              <w:bottom w:w="40" w:type="dxa"/>
+              <w:right w:w="90" w:type="dxa"/>
+            </w:tcMar>
+            <w:vAlign w:val="center"/>
+          </w:tcPr>
+          <w:p>
+            <w:pPr>
+              <w:rPr>
+                <w:rFonts w:ascii="ヒラギノ丸ゴ Pro W4" w:eastAsia="ヒラギノ丸ゴ Pro W4" w:hAnsi="ヒラギノ丸ゴ Pro W4" w:hint="eastAsia"/>
+                <w:color w:val="2C3E50"/>
+                <w:sz w:val="17"/>
+                <w:szCs w:val="17"/>
+              </w:rPr>
+            </w:pPr>
+            <w:r>
+              <w:rPr>
+                <w:rFonts w:ascii="ヒラギノ丸ゴ Pro W4" w:eastAsia="ヒラギノ丸ゴ Pro W4" w:hAnsi="ヒラギノ丸ゴ Pro W4" w:hint="eastAsia"/>
+                <w:color w:val="2C3E50"/>
+                <w:sz w:val="17"/>
+                <w:szCs w:val="17"/>
+              </w:rPr>
+              <w:t xml:space="preserve">おにぎり1個（ご飯100g）</w:t>
+            </w:r>
+          </w:p>
+        </w:tc>
+        <w:tc>
+          <w:tcPr>
+            <w:tcW w:w="1120" w:type="dxa"/>
+            <w:tcBorders>
+              <w:top w:val="single" w:sz="1" w:space="0" w:color="CCCCCC"/>
+              <w:left w:val="single" w:sz="1" w:space="0" w:color="CCCCCC"/>
+              <w:bottom w:val="single" w:sz="1" w:space="0" w:color="CCCCCC"/>
+              <w:right w:val="single" w:sz="1" w:space="0" w:color="CCCCCC"/>
+            </w:tcBorders>
+            <w:shd w:val="clear" w:color="auto" w:fill="EBF5FB"/>
+            <w:tcMar>
+              <w:top w:w="40" w:type="dxa"/>
+              <w:left w:w="90" w:type="dxa"/>
+              <w:bottom w:w="40" w:type="dxa"/>
+              <w:right w:w="90" w:type="dxa"/>
+            </w:tcMar>
+            <w:vAlign w:val="center"/>
+          </w:tcPr>
+          <w:p>
+            <w:pPr>
+              <w:jc w:val="center"/>
+              <w:rPr>
+                <w:rFonts w:ascii="ヒラギノ丸ゴ Pro W4" w:eastAsia="ヒラギノ丸ゴ Pro W4" w:hAnsi="ヒラギノ丸ゴ Pro W4" w:hint="eastAsia"/>
+                <w:b/>
+                <w:bCs/>
+                <w:color w:val="2C3E50"/>
+                <w:sz w:val="17"/>
+                <w:szCs w:val="17"/>
+              </w:rPr>
+            </w:pPr>
+            <w:r>
+              <w:rPr>
+                <w:rFonts w:ascii="ヒラギノ丸ゴ Pro W4" w:eastAsia="ヒラギノ丸ゴ Pro W4" w:hAnsi="ヒラギノ丸ゴ Pro W4" w:hint="eastAsia"/>
+                <w:b/>
+                <w:bCs/>
+                <w:color w:val="2C3E50"/>
+                <w:sz w:val="17"/>
+                <w:szCs w:val="17"/>
+              </w:rPr>
+              <w:t xml:space="preserve">約175kcal</w:t>
+            </w:r>
+          </w:p>
+        </w:tc>
+        <w:tc>
+          <w:tcPr>
+            <w:tcW w:w="880" w:type="dxa"/>
+            <w:tcBorders>
+              <w:top w:val="single" w:sz="1" w:space="0" w:color="CCCCCC"/>
+              <w:left w:val="single" w:sz="1" w:space="0" w:color="CCCCCC"/>
+              <w:bottom w:val="single" w:sz="1" w:space="0" w:color="CCCCCC"/>
+              <w:right w:val="single" w:sz="1" w:space="0" w:color="CCCCCC"/>
+            </w:tcBorders>
+            <w:shd w:val="clear" w:color="auto" w:fill="EBF5FB"/>
+            <w:tcMar>
+              <w:top w:w="40" w:type="dxa"/>
+              <w:left w:w="90" w:type="dxa"/>
+              <w:bottom w:w="40" w:type="dxa"/>
+              <w:right w:w="90" w:type="dxa"/>
+            </w:tcMar>
+            <w:vAlign w:val="center"/>
+          </w:tcPr>
+          <w:p>
+            <w:pPr>
+              <w:jc w:val="center"/>
+              <w:rPr>
+                <w:rFonts w:ascii="ヒラギノ丸ゴ Pro W4" w:eastAsia="ヒラギノ丸ゴ Pro W4" w:hAnsi="ヒラギノ丸ゴ Pro W4" w:hint="eastAsia"/>
+                <w:b/>
+                <w:bCs/>
+                <w:color w:val="922B21"/>
+                <w:sz w:val="17"/>
+                <w:szCs w:val="17"/>
+              </w:rPr>
+            </w:pPr>
+            <w:r>
+              <w:rPr>
+                <w:rFonts w:ascii="ヒラギノ丸ゴ Pro W4" w:eastAsia="ヒラギノ丸ゴ Pro W4" w:hAnsi="ヒラギノ丸ゴ Pro W4" w:hint="eastAsia"/>
+                <w:b/>
+                <w:bCs/>
+                <w:color w:val="922B21"/>
+                <w:sz w:val="17"/>
+                <w:szCs w:val="17"/>
+              </w:rPr>
+              <w:t xml:space="preserve">約38g</w:t>
+            </w:r>
+          </w:p>
+        </w:tc>
+        <w:tc>
+          <w:tcPr>
+            <w:tcW w:w="760" w:type="dxa"/>
+            <w:tcBorders>
+              <w:top w:val="single" w:sz="1" w:space="0" w:color="CCCCCC"/>
+              <w:left w:val="single" w:sz="1" w:space="0" w:color="CCCCCC"/>
+              <w:bottom w:val="single" w:sz="1" w:space="0" w:color="CCCCCC"/>
+              <w:right w:val="single" w:sz="1" w:space="0" w:color="CCCCCC"/>
+            </w:tcBorders>
+            <w:shd w:val="clear" w:color="auto" w:fill="EBF5FB"/>
+            <w:tcMar>
+              <w:top w:w="40" w:type="dxa"/>
+              <w:left w:w="90" w:type="dxa"/>
+              <w:bottom w:w="40" w:type="dxa"/>
+              <w:right w:w="90" w:type="dxa"/>
+            </w:tcMar>
+            <w:vAlign w:val="center"/>
+          </w:tcPr>
+          <w:p>
+            <w:pPr>
+              <w:jc w:val="center"/>
+              <w:rPr>
+                <w:rFonts w:ascii="ヒラギノ丸ゴ Pro W4" w:eastAsia="ヒラギノ丸ゴ Pro W4" w:hAnsi="ヒラギノ丸ゴ Pro W4" w:hint="eastAsia"/>
+                <w:b/>
+                <w:bCs/>
+                <w:color w:val="922B21"/>
+                <w:sz w:val="17"/>
+                <w:szCs w:val="17"/>
+              </w:rPr>
+            </w:pPr>
+            <w:r>
+              <w:rPr>
+                <w:rFonts w:ascii="ヒラギノ丸ゴ Pro W4" w:eastAsia="ヒラギノ丸ゴ Pro W4" w:hAnsi="ヒラギノ丸ゴ Pro W4" w:hint="eastAsia"/>
+                <w:b/>
+                <w:bCs/>
+                <w:color w:val="922B21"/>
+                <w:sz w:val="17"/>
+                <w:szCs w:val="17"/>
+              </w:rPr>
+              <w:t xml:space="preserve">0.6</w:t>
+            </w:r>
+          </w:p>
+        </w:tc>
+        <w:tc>
+          <w:tcPr>
+            <w:tcW w:w="830" w:type="dxa"/>
+            <w:tcBorders>
+              <w:top w:val="single" w:sz="1" w:space="0" w:color="CCCCCC"/>
+              <w:left w:val="single" w:sz="1" w:space="0" w:color="CCCCCC"/>
+              <w:bottom w:val="single" w:sz="1" w:space="0" w:color="CCCCCC"/>
+              <w:right w:val="single" w:sz="1" w:space="0" w:color="CCCCCC"/>
+            </w:tcBorders>
+            <w:shd w:val="clear" w:color="auto" w:fill="EBF5FB"/>
+            <w:tcMar>
+              <w:top w:w="40" w:type="dxa"/>
+              <w:left w:w="90" w:type="dxa"/>
+              <w:bottom w:w="40" w:type="dxa"/>
+              <w:right w:w="90" w:type="dxa"/>
+            </w:tcMar>
+            <w:vAlign w:val="center"/>
+          </w:tcPr>
+          <w:p>
+            <w:pPr>
+              <w:jc w:val="center"/>
+              <w:rPr>
+                <w:rFonts w:ascii="ヒラギノ丸ゴ Pro W4" w:eastAsia="ヒラギノ丸ゴ Pro W4" w:hAnsi="ヒラギノ丸ゴ Pro W4" w:hint="eastAsia"/>
+                <w:b/>
+                <w:bCs/>
+                <w:color w:val="2C3E50"/>
+                <w:sz w:val="17"/>
+                <w:szCs w:val="17"/>
+              </w:rPr>
+            </w:pPr>
+            <w:r>
+              <w:rPr>
+                <w:rFonts w:ascii="ヒラギノ丸ゴ Pro W4" w:eastAsia="ヒラギノ丸ゴ Pro W4" w:hAnsi="ヒラギノ丸ゴ Pro W4" w:hint="eastAsia"/>
+                <w:b/>
+                <w:bCs/>
+                <w:color w:val="2C3E50"/>
+                <w:sz w:val="17"/>
+                <w:szCs w:val="17"/>
+              </w:rPr>
+              <w:t xml:space="preserve">約4g</w:t>
+            </w:r>
+          </w:p>
+        </w:tc>
+        <w:tc>
+          <w:tcPr>
+            <w:tcW w:w="2394" w:type="dxa"/>
+            <w:tcBorders>
+              <w:top w:val="single" w:sz="1" w:space="0" w:color="CCCCCC"/>
+              <w:left w:val="single" w:sz="1" w:space="0" w:color="CCCCCC"/>
+              <w:bottom w:val="single" w:sz="1" w:space="0" w:color="CCCCCC"/>
+              <w:right w:val="single" w:sz="1" w:space="0" w:color="CCCCCC"/>
+            </w:tcBorders>
+            <w:shd w:val="clear" w:color="auto" w:fill="EBF5FB"/>
+            <w:tcMar>
+              <w:top w:w="40" w:type="dxa"/>
+              <w:left w:w="90" w:type="dxa"/>
+              <w:bottom w:w="40" w:type="dxa"/>
+              <w:right w:w="90" w:type="dxa"/>
+            </w:tcMar>
+            <w:vAlign w:val="center"/>
+          </w:tcPr>
+          <w:p>
+            <w:pPr>
+              <w:rPr>
+                <w:rFonts w:ascii="ヒラギノ丸ゴ Pro W4" w:eastAsia="ヒラギノ丸ゴ Pro W4" w:hAnsi="ヒラギノ丸ゴ Pro W4" w:hint="eastAsia"/>
+                <w:color w:val="5D6D7E"/>
+                <w:sz w:val="16"/>
+                <w:szCs w:val="16"/>
+              </w:rPr>
+            </w:pPr>
+            <w:r>
+              <w:rPr>
+                <w:rFonts w:ascii="ヒラギノ丸ゴ Pro W4" w:eastAsia="ヒラギノ丸ゴ Pro W4" w:hAnsi="ヒラギノ丸ゴ Pro W4" w:hint="eastAsia"/>
+                <w:color w:val="5D6D7E"/>
+                <w:sz w:val="16"/>
+                <w:szCs w:val="16"/>
+              </w:rPr>
+              <w:t xml:space="preserve">カステラ1切れ＋オレンジジュース：約245kcal／52g（0.9g/kg）／5g</w:t>
+            </w:r>
+          </w:p>
+          <w:p>
+            <w:pPr>
+              <w:rPr>
+                <w:rFonts w:ascii="ヒラギノ丸ゴ Pro W4" w:eastAsia="ヒラギノ丸ゴ Pro W4" w:hAnsi="ヒラギノ丸ゴ Pro W4" w:hint="eastAsia"/>
+                <w:color w:val="5D6D7E"/>
+                <w:sz w:val="16"/>
+                <w:szCs w:val="16"/>
+              </w:rPr>
+            </w:pPr>
+            <w:r>
+              <w:rPr>
+                <w:rFonts w:ascii="ヒラギノ丸ゴ Pro W4" w:eastAsia="ヒラギノ丸ゴ Pro W4" w:hAnsi="ヒラギノ丸ゴ Pro W4" w:hint="eastAsia"/>
+                <w:color w:val="5D6D7E"/>
+                <w:sz w:val="16"/>
+                <w:szCs w:val="16"/>
+              </w:rPr>
+              <w:t xml:space="preserve">あんぱん：約215kcal／40g（0.7g/kg）／6g</w:t>
+            </w:r>
+          </w:p>
+        </w:tc>
+      </w:tr>
+      <w:tr>
+        <w:trPr>
+          <w:cantSplit/>
+        </w:trPr>
+        <w:tc>
+          <w:tcPr>
+            <w:tcW w:w="780" w:type="dxa"/>
+            <w:tcBorders>
+              <w:top w:val="single" w:sz="1" w:space="0" w:color="CCCCCC"/>
+              <w:left w:val="single" w:sz="1" w:space="0" w:color="CCCCCC"/>
+              <w:bottom w:val="single" w:sz="1" w:space="0" w:color="CCCCCC"/>
+              <w:right w:val="single" w:sz="1" w:space="0" w:color="CCCCCC"/>
+            </w:tcBorders>
+            <w:shd w:val="clear" w:color="auto" w:fill="EBF5FB"/>
+            <w:tcMar>
+              <w:top w:w="40" w:type="dxa"/>
+              <w:left w:w="90" w:type="dxa"/>
+              <w:bottom w:w="40" w:type="dxa"/>
+              <w:right w:w="90" w:type="dxa"/>
+            </w:tcMar>
+            <w:vAlign w:val="center"/>
+          </w:tcPr>
+          <w:p>
+            <w:pPr>
+              <w:jc w:val="center"/>
+              <w:rPr>
+                <w:rFonts w:ascii="ヒラギノ丸ゴ Pro W4" w:eastAsia="ヒラギノ丸ゴ Pro W4" w:hAnsi="ヒラギノ丸ゴ Pro W4" w:hint="eastAsia"/>
+                <w:color w:val="2C3E50"/>
+                <w:sz w:val="17"/>
+                <w:szCs w:val="17"/>
+              </w:rPr>
+            </w:pPr>
+            <w:r>
+              <w:rPr>
+                <w:rFonts w:ascii="ヒラギノ丸ゴ Pro W4" w:eastAsia="ヒラギノ丸ゴ Pro W4" w:hAnsi="ヒラギノ丸ゴ Pro W4" w:hint="eastAsia"/>
+                <w:color w:val="2C3E50"/>
+                <w:sz w:val="17"/>
+                <w:szCs w:val="17"/>
+              </w:rPr>
+              <w:t xml:space="preserve">18:00〜</w:t>
+            </w:r>
+          </w:p>
+        </w:tc>
+        <w:tc>
+          <w:tcPr>
+            <w:tcW w:w="880" w:type="dxa"/>
+            <w:tcBorders>
+              <w:top w:val="single" w:sz="1" w:space="0" w:color="CCCCCC"/>
+              <w:left w:val="single" w:sz="1" w:space="0" w:color="CCCCCC"/>
+              <w:bottom w:val="single" w:sz="1" w:space="0" w:color="CCCCCC"/>
+              <w:right w:val="single" w:sz="1" w:space="0" w:color="CCCCCC"/>
+            </w:tcBorders>
+            <w:shd w:val="clear" w:color="auto" w:fill="EBF5FB"/>
+            <w:tcMar>
+              <w:top w:w="40" w:type="dxa"/>
+              <w:left w:w="90" w:type="dxa"/>
+              <w:bottom w:w="40" w:type="dxa"/>
+              <w:right w:w="90" w:type="dxa"/>
+            </w:tcMar>
+            <w:vAlign w:val="center"/>
+          </w:tcPr>
+          <w:p>
+            <w:pPr>
+              <w:jc w:val="center"/>
+              <w:rPr>
+                <w:rFonts w:ascii="ヒラギノ丸ゴ Pro W4" w:eastAsia="ヒラギノ丸ゴ Pro W4" w:hAnsi="ヒラギノ丸ゴ Pro W4" w:hint="eastAsia"/>
+                <w:b/>
+                <w:bCs/>
+                <w:color w:val="922B21"/>
+                <w:sz w:val="18"/>
+                <w:szCs w:val="18"/>
+              </w:rPr>
+            </w:pPr>
+            <w:r>
+              <w:rPr>
+                <w:rFonts w:ascii="ヒラギノ丸ゴ Pro W4" w:eastAsia="ヒラギノ丸ゴ Pro W4" w:hAnsi="ヒラギノ丸ゴ Pro W4" w:hint="eastAsia"/>
+                <w:b/>
+                <w:bCs/>
+                <w:color w:val="922B21"/>
+                <w:sz w:val="18"/>
+                <w:szCs w:val="18"/>
+              </w:rPr>
+              <w:t xml:space="preserve">夕食</w:t>
+            </w:r>
+          </w:p>
+        </w:tc>
+        <w:tc>
+          <w:tcPr>
+            <w:tcW w:w="2420" w:type="dxa"/>
+            <w:tcBorders>
+              <w:top w:val="single" w:sz="1" w:space="0" w:color="CCCCCC"/>
+              <w:left w:val="single" w:sz="1" w:space="0" w:color="CCCCCC"/>
+              <w:bottom w:val="single" w:sz="1" w:space="0" w:color="CCCCCC"/>
+              <w:right w:val="single" w:sz="1" w:space="0" w:color="CCCCCC"/>
+            </w:tcBorders>
+            <w:shd w:val="clear" w:color="auto" w:fill="EBF5FB"/>
+            <w:tcMar>
+              <w:top w:w="40" w:type="dxa"/>
+              <w:left w:w="90" w:type="dxa"/>
+              <w:bottom w:w="40" w:type="dxa"/>
+              <w:right w:w="90" w:type="dxa"/>
+            </w:tcMar>
+            <w:vAlign w:val="center"/>
+          </w:tcPr>
+          <w:p>
+            <w:pPr>
+              <w:rPr>
+                <w:rFonts w:ascii="ヒラギノ丸ゴ Pro W4" w:eastAsia="ヒラギノ丸ゴ Pro W4" w:hAnsi="ヒラギノ丸ゴ Pro W4" w:hint="eastAsia"/>
+                <w:color w:val="2C3E50"/>
+                <w:sz w:val="17"/>
+                <w:szCs w:val="17"/>
+              </w:rPr>
+            </w:pPr>
+            <w:r>
+              <w:rPr>
+                <w:rFonts w:ascii="ヒラギノ丸ゴ Pro W4" w:eastAsia="ヒラギノ丸ゴ Pro W4" w:hAnsi="ヒラギノ丸ゴ Pro W4" w:hint="eastAsia"/>
+                <w:color w:val="2C3E50"/>
+                <w:sz w:val="17"/>
+                <w:szCs w:val="17"/>
+              </w:rPr>
+              <w:t xml:space="preserve">既存の計画どおり</w:t>
+            </w:r>
+          </w:p>
+        </w:tc>
+        <w:tc>
+          <w:tcPr>
+            <w:tcW w:w="1120" w:type="dxa"/>
+            <w:tcBorders>
+              <w:top w:val="single" w:sz="1" w:space="0" w:color="CCCCCC"/>
+              <w:left w:val="single" w:sz="1" w:space="0" w:color="CCCCCC"/>
+              <w:bottom w:val="single" w:sz="1" w:space="0" w:color="CCCCCC"/>
+              <w:right w:val="single" w:sz="1" w:space="0" w:color="CCCCCC"/>
+            </w:tcBorders>
+            <w:shd w:val="clear" w:color="auto" w:fill="EBF5FB"/>
+            <w:tcMar>
+              <w:top w:w="40" w:type="dxa"/>
+              <w:left w:w="90" w:type="dxa"/>
+              <w:bottom w:w="40" w:type="dxa"/>
+              <w:right w:w="90" w:type="dxa"/>
+            </w:tcMar>
+            <w:vAlign w:val="center"/>
+          </w:tcPr>
+          <w:p>
+            <w:pPr>
+              <w:jc w:val="center"/>
+              <w:rPr>
+                <w:rFonts w:ascii="ヒラギノ丸ゴ Pro W4" w:eastAsia="ヒラギノ丸ゴ Pro W4" w:hAnsi="ヒラギノ丸ゴ Pro W4" w:hint="eastAsia"/>
+                <w:b/>
+                <w:bCs/>
+                <w:color w:val="2C3E50"/>
+                <w:sz w:val="17"/>
+                <w:szCs w:val="17"/>
+              </w:rPr>
+            </w:pPr>
+            <w:r>
+              <w:rPr>
+                <w:rFonts w:ascii="ヒラギノ丸ゴ Pro W4" w:eastAsia="ヒラギノ丸ゴ Pro W4" w:hAnsi="ヒラギノ丸ゴ Pro W4" w:hint="eastAsia"/>
+                <w:b/>
+                <w:bCs/>
+                <w:color w:val="2C3E50"/>
+                <w:sz w:val="17"/>
+                <w:szCs w:val="17"/>
+              </w:rPr>
+              <w:t xml:space="preserve">約790kcal</w:t>
+            </w:r>
+          </w:p>
+        </w:tc>
+        <w:tc>
+          <w:tcPr>
+            <w:tcW w:w="880" w:type="dxa"/>
+            <w:tcBorders>
+              <w:top w:val="single" w:sz="1" w:space="0" w:color="CCCCCC"/>
+              <w:left w:val="single" w:sz="1" w:space="0" w:color="CCCCCC"/>
+              <w:bottom w:val="single" w:sz="1" w:space="0" w:color="CCCCCC"/>
+              <w:right w:val="single" w:sz="1" w:space="0" w:color="CCCCCC"/>
+            </w:tcBorders>
+            <w:shd w:val="clear" w:color="auto" w:fill="EBF5FB"/>
+            <w:tcMar>
+              <w:top w:w="40" w:type="dxa"/>
+              <w:left w:w="90" w:type="dxa"/>
+              <w:bottom w:w="40" w:type="dxa"/>
+              <w:right w:w="90" w:type="dxa"/>
+            </w:tcMar>
+            <w:vAlign w:val="center"/>
+          </w:tcPr>
+          <w:p>
+            <w:pPr>
+              <w:jc w:val="center"/>
+              <w:rPr>
+                <w:rFonts w:ascii="ヒラギノ丸ゴ Pro W4" w:eastAsia="ヒラギノ丸ゴ Pro W4" w:hAnsi="ヒラギノ丸ゴ Pro W4" w:hint="eastAsia"/>
+                <w:b/>
+                <w:bCs/>
+                <w:color w:val="922B21"/>
+                <w:sz w:val="17"/>
+                <w:szCs w:val="17"/>
+              </w:rPr>
+            </w:pPr>
+            <w:r>
+              <w:rPr>
+                <w:rFonts w:ascii="ヒラギノ丸ゴ Pro W4" w:eastAsia="ヒラギノ丸ゴ Pro W4" w:hAnsi="ヒラギノ丸ゴ Pro W4" w:hint="eastAsia"/>
+                <w:b/>
+                <w:bCs/>
+                <w:color w:val="922B21"/>
+                <w:sz w:val="17"/>
+                <w:szCs w:val="17"/>
+              </w:rPr>
+              <w:t xml:space="preserve">約130g</w:t>
+            </w:r>
+          </w:p>
+        </w:tc>
+        <w:tc>
+          <w:tcPr>
+            <w:tcW w:w="760" w:type="dxa"/>
+            <w:tcBorders>
+              <w:top w:val="single" w:sz="1" w:space="0" w:color="CCCCCC"/>
+              <w:left w:val="single" w:sz="1" w:space="0" w:color="CCCCCC"/>
+              <w:bottom w:val="single" w:sz="1" w:space="0" w:color="CCCCCC"/>
+              <w:right w:val="single" w:sz="1" w:space="0" w:color="CCCCCC"/>
+            </w:tcBorders>
+            <w:shd w:val="clear" w:color="auto" w:fill="EBF5FB"/>
+            <w:tcMar>
+              <w:top w:w="40" w:type="dxa"/>
+              <w:left w:w="90" w:type="dxa"/>
+              <w:bottom w:w="40" w:type="dxa"/>
+              <w:right w:w="90" w:type="dxa"/>
+            </w:tcMar>
+            <w:vAlign w:val="center"/>
+          </w:tcPr>
+          <w:p>
+            <w:pPr>
+              <w:jc w:val="center"/>
+              <w:rPr>
+                <w:rFonts w:ascii="ヒラギノ丸ゴ Pro W4" w:eastAsia="ヒラギノ丸ゴ Pro W4" w:hAnsi="ヒラギノ丸ゴ Pro W4" w:hint="eastAsia"/>
+                <w:b/>
+                <w:bCs/>
+                <w:color w:val="922B21"/>
+                <w:sz w:val="17"/>
+                <w:szCs w:val="17"/>
+              </w:rPr>
+            </w:pPr>
+            <w:r>
+              <w:rPr>
+                <w:rFonts w:ascii="ヒラギノ丸ゴ Pro W4" w:eastAsia="ヒラギノ丸ゴ Pro W4" w:hAnsi="ヒラギノ丸ゴ Pro W4" w:hint="eastAsia"/>
+                <w:b/>
+                <w:bCs/>
+                <w:color w:val="922B21"/>
+                <w:sz w:val="17"/>
+                <w:szCs w:val="17"/>
+              </w:rPr>
+              <w:t xml:space="preserve">2.1</w:t>
+            </w:r>
+          </w:p>
+        </w:tc>
+        <w:tc>
+          <w:tcPr>
+            <w:tcW w:w="830" w:type="dxa"/>
+            <w:tcBorders>
+              <w:top w:val="single" w:sz="1" w:space="0" w:color="CCCCCC"/>
+              <w:left w:val="single" w:sz="1" w:space="0" w:color="CCCCCC"/>
+              <w:bottom w:val="single" w:sz="1" w:space="0" w:color="CCCCCC"/>
+              <w:right w:val="single" w:sz="1" w:space="0" w:color="CCCCCC"/>
+            </w:tcBorders>
+            <w:shd w:val="clear" w:color="auto" w:fill="EBF5FB"/>
+            <w:tcMar>
+              <w:top w:w="40" w:type="dxa"/>
+              <w:left w:w="90" w:type="dxa"/>
+              <w:bottom w:w="40" w:type="dxa"/>
+              <w:right w:w="90" w:type="dxa"/>
+            </w:tcMar>
+            <w:vAlign w:val="center"/>
+          </w:tcPr>
+          <w:p>
+            <w:pPr>
+              <w:jc w:val="center"/>
+              <w:rPr>
+                <w:rFonts w:ascii="ヒラギノ丸ゴ Pro W4" w:eastAsia="ヒラギノ丸ゴ Pro W4" w:hAnsi="ヒラギノ丸ゴ Pro W4" w:hint="eastAsia"/>
+                <w:b/>
+                <w:bCs/>
+                <w:color w:val="2C3E50"/>
+                <w:sz w:val="17"/>
+                <w:szCs w:val="17"/>
+              </w:rPr>
+            </w:pPr>
+            <w:r>
+              <w:rPr>
+                <w:rFonts w:ascii="ヒラギノ丸ゴ Pro W4" w:eastAsia="ヒラギノ丸ゴ Pro W4" w:hAnsi="ヒラギノ丸ゴ Pro W4" w:hint="eastAsia"/>
+                <w:b/>
+                <w:bCs/>
+                <w:color w:val="2C3E50"/>
+                <w:sz w:val="17"/>
+                <w:szCs w:val="17"/>
+              </w:rPr>
+              <w:t xml:space="preserve">約28g</w:t>
+            </w:r>
+          </w:p>
+        </w:tc>
+        <w:tc>
+          <w:tcPr>
+            <w:tcW w:w="2394" w:type="dxa"/>
+            <w:tcBorders>
+              <w:top w:val="single" w:sz="1" w:space="0" w:color="CCCCCC"/>
+              <w:left w:val="single" w:sz="1" w:space="0" w:color="CCCCCC"/>
+              <w:bottom w:val="single" w:sz="1" w:space="0" w:color="CCCCCC"/>
+              <w:right w:val="single" w:sz="1" w:space="0" w:color="CCCCCC"/>
+            </w:tcBorders>
+            <w:shd w:val="clear" w:color="auto" w:fill="EBF5FB"/>
+            <w:tcMar>
+              <w:top w:w="40" w:type="dxa"/>
+              <w:left w:w="90" w:type="dxa"/>
+              <w:bottom w:w="40" w:type="dxa"/>
+              <w:right w:w="90" w:type="dxa"/>
+            </w:tcMar>
+            <w:vAlign w:val="center"/>
+          </w:tcPr>
+          <w:p>
+            <w:pPr>
+              <w:rPr>
+                <w:rFonts w:ascii="ヒラギノ丸ゴ Pro W4" w:eastAsia="ヒラギノ丸ゴ Pro W4" w:hAnsi="ヒラギノ丸ゴ Pro W4" w:hint="eastAsia"/>
+                <w:color w:val="5D6D7E"/>
+                <w:sz w:val="16"/>
+                <w:szCs w:val="16"/>
+              </w:rPr>
+            </w:pPr>
+            <w:r>
+              <w:rPr>
+                <w:rFonts w:ascii="ヒラギノ丸ゴ Pro W4" w:eastAsia="ヒラギノ丸ゴ Pro W4" w:hAnsi="ヒラギノ丸ゴ Pro W4" w:hint="eastAsia"/>
+                <w:color w:val="5D6D7E"/>
+                <w:sz w:val="16"/>
+                <w:szCs w:val="16"/>
+              </w:rPr>
+              <w:t xml:space="preserve">既存の計画の想定：780〜800kcal、糖質120〜140g（2.0〜2.3g/kg）</w:t>
+            </w:r>
+          </w:p>
+        </w:tc>
+      </w:tr>
+      <w:tr>
+        <w:trPr>
+          <w:cantSplit/>
+        </w:trPr>
+        <w:tc>
+          <w:tcPr>
+            <w:tcW w:w="780" w:type="dxa"/>
+            <w:tcBorders>
+              <w:top w:val="single" w:sz="1" w:space="0" w:color="CCCCCC"/>
+              <w:left w:val="single" w:sz="1" w:space="0" w:color="CCCCCC"/>
+              <w:bottom w:val="single" w:sz="1" w:space="0" w:color="CCCCCC"/>
+              <w:right w:val="single" w:sz="1" w:space="0" w:color="CCCCCC"/>
+            </w:tcBorders>
+            <w:shd w:val="clear" w:color="auto" w:fill="EBF5FB"/>
+            <w:tcMar>
+              <w:top w:w="40" w:type="dxa"/>
+              <w:left w:w="90" w:type="dxa"/>
+              <w:bottom w:w="40" w:type="dxa"/>
+              <w:right w:w="90" w:type="dxa"/>
+            </w:tcMar>
+            <w:vAlign w:val="center"/>
+          </w:tcPr>
+          <w:p>
+            <w:pPr>
+              <w:jc w:val="center"/>
+              <w:rPr>
+                <w:rFonts w:ascii="ヒラギノ丸ゴ Pro W4" w:eastAsia="ヒラギノ丸ゴ Pro W4" w:hAnsi="ヒラギノ丸ゴ Pro W4" w:hint="eastAsia"/>
+                <w:color w:val="2C3E50"/>
+                <w:sz w:val="17"/>
+                <w:szCs w:val="17"/>
+              </w:rPr>
+            </w:pPr>
+            <w:r>
+              <w:rPr>
+                <w:rFonts w:ascii="ヒラギノ丸ゴ Pro W4" w:eastAsia="ヒラギノ丸ゴ Pro W4" w:hAnsi="ヒラギノ丸ゴ Pro W4" w:hint="eastAsia"/>
+                <w:color w:val="2C3E50"/>
+                <w:sz w:val="17"/>
+                <w:szCs w:val="17"/>
+              </w:rPr>
+              <w:t xml:space="preserve">21:00頃</w:t>
+            </w:r>
+          </w:p>
+        </w:tc>
+        <w:tc>
+          <w:tcPr>
+            <w:tcW w:w="880" w:type="dxa"/>
+            <w:tcBorders>
+              <w:top w:val="single" w:sz="1" w:space="0" w:color="CCCCCC"/>
+              <w:left w:val="single" w:sz="1" w:space="0" w:color="CCCCCC"/>
+              <w:bottom w:val="single" w:sz="1" w:space="0" w:color="CCCCCC"/>
+              <w:right w:val="single" w:sz="1" w:space="0" w:color="CCCCCC"/>
+            </w:tcBorders>
+            <w:shd w:val="clear" w:color="auto" w:fill="EBF5FB"/>
+            <w:tcMar>
+              <w:top w:w="40" w:type="dxa"/>
+              <w:left w:w="90" w:type="dxa"/>
+              <w:bottom w:w="40" w:type="dxa"/>
+              <w:right w:w="90" w:type="dxa"/>
+            </w:tcMar>
+            <w:vAlign w:val="center"/>
+          </w:tcPr>
+          <w:p>
+            <w:pPr>
+              <w:jc w:val="center"/>
+              <w:rPr>
+                <w:rFonts w:ascii="ヒラギノ丸ゴ Pro W4" w:eastAsia="ヒラギノ丸ゴ Pro W4" w:hAnsi="ヒラギノ丸ゴ Pro W4" w:hint="eastAsia"/>
+                <w:b/>
+                <w:bCs/>
+                <w:color w:val="922B21"/>
+                <w:sz w:val="18"/>
+                <w:szCs w:val="18"/>
+              </w:rPr>
+            </w:pPr>
+            <w:r>
+              <w:rPr>
+                <w:rFonts w:ascii="ヒラギノ丸ゴ Pro W4" w:eastAsia="ヒラギノ丸ゴ Pro W4" w:hAnsi="ヒラギノ丸ゴ Pro W4" w:hint="eastAsia"/>
+                <w:b/>
+                <w:bCs/>
+                <w:color w:val="922B21"/>
+                <w:sz w:val="18"/>
+                <w:szCs w:val="18"/>
+              </w:rPr>
+              <w:t xml:space="preserve">補食③</w:t>
+            </w:r>
+          </w:p>
+          <w:p>
+            <w:pPr>
+              <w:jc w:val="center"/>
+              <w:rPr>
+                <w:rFonts w:ascii="ヒラギノ丸ゴ Pro W4" w:eastAsia="ヒラギノ丸ゴ Pro W4" w:hAnsi="ヒラギノ丸ゴ Pro W4" w:hint="eastAsia"/>
+                <w:b/>
+                <w:bCs/>
+                <w:color w:val="922B21"/>
+                <w:sz w:val="18"/>
+                <w:szCs w:val="18"/>
+              </w:rPr>
+            </w:pPr>
+            <w:r>
+              <w:rPr>
+                <w:rFonts w:ascii="ヒラギノ丸ゴ Pro W4" w:eastAsia="ヒラギノ丸ゴ Pro W4" w:hAnsi="ヒラギノ丸ゴ Pro W4" w:hint="eastAsia"/>
+                <w:b/>
+                <w:bCs/>
+                <w:color w:val="922B21"/>
+                <w:sz w:val="18"/>
+                <w:szCs w:val="18"/>
+              </w:rPr>
+              <w:t xml:space="preserve">（任意）</w:t>
+            </w:r>
+          </w:p>
+        </w:tc>
+        <w:tc>
+          <w:tcPr>
+            <w:tcW w:w="2420" w:type="dxa"/>
+            <w:tcBorders>
+              <w:top w:val="single" w:sz="1" w:space="0" w:color="CCCCCC"/>
+              <w:left w:val="single" w:sz="1" w:space="0" w:color="CCCCCC"/>
+              <w:bottom w:val="single" w:sz="1" w:space="0" w:color="CCCCCC"/>
+              <w:right w:val="single" w:sz="1" w:space="0" w:color="CCCCCC"/>
+            </w:tcBorders>
+            <w:shd w:val="clear" w:color="auto" w:fill="EBF5FB"/>
+            <w:tcMar>
+              <w:top w:w="40" w:type="dxa"/>
+              <w:left w:w="90" w:type="dxa"/>
+              <w:bottom w:w="40" w:type="dxa"/>
+              <w:right w:w="90" w:type="dxa"/>
+            </w:tcMar>
+            <w:vAlign w:val="center"/>
+          </w:tcPr>
+          <w:p>
+            <w:pPr>
+              <w:rPr>
+                <w:rFonts w:ascii="ヒラギノ丸ゴ Pro W4" w:eastAsia="ヒラギノ丸ゴ Pro W4" w:hAnsi="ヒラギノ丸ゴ Pro W4" w:hint="eastAsia"/>
+                <w:color w:val="2C3E50"/>
+                <w:sz w:val="17"/>
+                <w:szCs w:val="17"/>
+              </w:rPr>
+            </w:pPr>
+            <w:r>
+              <w:rPr>
+                <w:rFonts w:ascii="ヒラギノ丸ゴ Pro W4" w:eastAsia="ヒラギノ丸ゴ Pro W4" w:hAnsi="ヒラギノ丸ゴ Pro W4" w:hint="eastAsia"/>
+                <w:color w:val="2C3E50"/>
+                <w:sz w:val="17"/>
+                <w:szCs w:val="17"/>
+              </w:rPr>
+              <w:t xml:space="preserve">ヨーグルト＋はちみつ大さじ1</w:t>
+            </w:r>
+          </w:p>
+        </w:tc>
+        <w:tc>
+          <w:tcPr>
+            <w:tcW w:w="1120" w:type="dxa"/>
+            <w:tcBorders>
+              <w:top w:val="single" w:sz="1" w:space="0" w:color="CCCCCC"/>
+              <w:left w:val="single" w:sz="1" w:space="0" w:color="CCCCCC"/>
+              <w:bottom w:val="single" w:sz="1" w:space="0" w:color="CCCCCC"/>
+              <w:right w:val="single" w:sz="1" w:space="0" w:color="CCCCCC"/>
+            </w:tcBorders>
+            <w:shd w:val="clear" w:color="auto" w:fill="EBF5FB"/>
+            <w:tcMar>
+              <w:top w:w="40" w:type="dxa"/>
+              <w:left w:w="90" w:type="dxa"/>
+              <w:bottom w:w="40" w:type="dxa"/>
+              <w:right w:w="90" w:type="dxa"/>
+            </w:tcMar>
+            <w:vAlign w:val="center"/>
+          </w:tcPr>
+          <w:p>
+            <w:pPr>
+              <w:jc w:val="center"/>
+              <w:rPr>
+                <w:rFonts w:ascii="ヒラギノ丸ゴ Pro W4" w:eastAsia="ヒラギノ丸ゴ Pro W4" w:hAnsi="ヒラギノ丸ゴ Pro W4" w:hint="eastAsia"/>
+                <w:b/>
+                <w:bCs/>
+                <w:color w:val="2C3E50"/>
+                <w:sz w:val="17"/>
+                <w:szCs w:val="17"/>
+              </w:rPr>
+            </w:pPr>
+            <w:r>
+              <w:rPr>
+                <w:rFonts w:ascii="ヒラギノ丸ゴ Pro W4" w:eastAsia="ヒラギノ丸ゴ Pro W4" w:hAnsi="ヒラギノ丸ゴ Pro W4" w:hint="eastAsia"/>
+                <w:b/>
+                <w:bCs/>
+                <w:color w:val="2C3E50"/>
+                <w:sz w:val="17"/>
+                <w:szCs w:val="17"/>
+              </w:rPr>
+              <w:t xml:space="preserve">約125kcal</w:t>
+            </w:r>
+          </w:p>
+        </w:tc>
+        <w:tc>
+          <w:tcPr>
+            <w:tcW w:w="880" w:type="dxa"/>
+            <w:tcBorders>
+              <w:top w:val="single" w:sz="1" w:space="0" w:color="CCCCCC"/>
+              <w:left w:val="single" w:sz="1" w:space="0" w:color="CCCCCC"/>
+              <w:bottom w:val="single" w:sz="1" w:space="0" w:color="CCCCCC"/>
+              <w:right w:val="single" w:sz="1" w:space="0" w:color="CCCCCC"/>
+            </w:tcBorders>
+            <w:shd w:val="clear" w:color="auto" w:fill="EBF5FB"/>
+            <w:tcMar>
+              <w:top w:w="40" w:type="dxa"/>
+              <w:left w:w="90" w:type="dxa"/>
+              <w:bottom w:w="40" w:type="dxa"/>
+              <w:right w:w="90" w:type="dxa"/>
+            </w:tcMar>
+            <w:vAlign w:val="center"/>
+          </w:tcPr>
+          <w:p>
+            <w:pPr>
+              <w:jc w:val="center"/>
+              <w:rPr>
+                <w:rFonts w:ascii="ヒラギノ丸ゴ Pro W4" w:eastAsia="ヒラギノ丸ゴ Pro W4" w:hAnsi="ヒラギノ丸ゴ Pro W4" w:hint="eastAsia"/>
+                <w:b/>
+                <w:bCs/>
+                <w:color w:val="922B21"/>
+                <w:sz w:val="17"/>
+                <w:szCs w:val="17"/>
+              </w:rPr>
+            </w:pPr>
+            <w:r>
+              <w:rPr>
+                <w:rFonts w:ascii="ヒラギノ丸ゴ Pro W4" w:eastAsia="ヒラギノ丸ゴ Pro W4" w:hAnsi="ヒラギノ丸ゴ Pro W4" w:hint="eastAsia"/>
+                <w:b/>
+                <w:bCs/>
+                <w:color w:val="922B21"/>
+                <w:sz w:val="17"/>
+                <w:szCs w:val="17"/>
+              </w:rPr>
+              <w:t xml:space="preserve">約22g</w:t>
+            </w:r>
+          </w:p>
+        </w:tc>
+        <w:tc>
+          <w:tcPr>
+            <w:tcW w:w="760" w:type="dxa"/>
+            <w:tcBorders>
+              <w:top w:val="single" w:sz="1" w:space="0" w:color="CCCCCC"/>
+              <w:left w:val="single" w:sz="1" w:space="0" w:color="CCCCCC"/>
+              <w:bottom w:val="single" w:sz="1" w:space="0" w:color="CCCCCC"/>
+              <w:right w:val="single" w:sz="1" w:space="0" w:color="CCCCCC"/>
+            </w:tcBorders>
+            <w:shd w:val="clear" w:color="auto" w:fill="EBF5FB"/>
+            <w:tcMar>
+              <w:top w:w="40" w:type="dxa"/>
+              <w:left w:w="90" w:type="dxa"/>
+              <w:bottom w:w="40" w:type="dxa"/>
+              <w:right w:w="90" w:type="dxa"/>
+            </w:tcMar>
+            <w:vAlign w:val="center"/>
+          </w:tcPr>
+          <w:p>
+            <w:pPr>
+              <w:jc w:val="center"/>
+              <w:rPr>
+                <w:rFonts w:ascii="ヒラギノ丸ゴ Pro W4" w:eastAsia="ヒラギノ丸ゴ Pro W4" w:hAnsi="ヒラギノ丸ゴ Pro W4" w:hint="eastAsia"/>
+                <w:b/>
+                <w:bCs/>
+                <w:color w:val="922B21"/>
+                <w:sz w:val="17"/>
+                <w:szCs w:val="17"/>
+              </w:rPr>
+            </w:pPr>
+            <w:r>
+              <w:rPr>
+                <w:rFonts w:ascii="ヒラギノ丸ゴ Pro W4" w:eastAsia="ヒラギノ丸ゴ Pro W4" w:hAnsi="ヒラギノ丸ゴ Pro W4" w:hint="eastAsia"/>
+                <w:b/>
+                <w:bCs/>
+                <w:color w:val="922B21"/>
+                <w:sz w:val="17"/>
+                <w:szCs w:val="17"/>
+              </w:rPr>
+              <w:t xml:space="preserve">0.4</w:t>
+            </w:r>
+          </w:p>
+        </w:tc>
+        <w:tc>
+          <w:tcPr>
+            <w:tcW w:w="830" w:type="dxa"/>
+            <w:tcBorders>
+              <w:top w:val="single" w:sz="1" w:space="0" w:color="CCCCCC"/>
+              <w:left w:val="single" w:sz="1" w:space="0" w:color="CCCCCC"/>
+              <w:bottom w:val="single" w:sz="1" w:space="0" w:color="CCCCCC"/>
+              <w:right w:val="single" w:sz="1" w:space="0" w:color="CCCCCC"/>
+            </w:tcBorders>
+            <w:shd w:val="clear" w:color="auto" w:fill="EBF5FB"/>
+            <w:tcMar>
+              <w:top w:w="40" w:type="dxa"/>
+              <w:left w:w="90" w:type="dxa"/>
+              <w:bottom w:w="40" w:type="dxa"/>
+              <w:right w:w="90" w:type="dxa"/>
+            </w:tcMar>
+            <w:vAlign w:val="center"/>
+          </w:tcPr>
+          <w:p>
+            <w:pPr>
+              <w:jc w:val="center"/>
+              <w:rPr>
+                <w:rFonts w:ascii="ヒラギノ丸ゴ Pro W4" w:eastAsia="ヒラギノ丸ゴ Pro W4" w:hAnsi="ヒラギノ丸ゴ Pro W4" w:hint="eastAsia"/>
+                <w:b/>
+                <w:bCs/>
+                <w:color w:val="2C3E50"/>
+                <w:sz w:val="17"/>
+                <w:szCs w:val="17"/>
+              </w:rPr>
+            </w:pPr>
+            <w:r>
+              <w:rPr>
+                <w:rFonts w:ascii="ヒラギノ丸ゴ Pro W4" w:eastAsia="ヒラギノ丸ゴ Pro W4" w:hAnsi="ヒラギノ丸ゴ Pro W4" w:hint="eastAsia"/>
+                <w:b/>
+                <w:bCs/>
+                <w:color w:val="2C3E50"/>
+                <w:sz w:val="17"/>
+                <w:szCs w:val="17"/>
+              </w:rPr>
+              <w:t xml:space="preserve">約4g</w:t>
+            </w:r>
+          </w:p>
+        </w:tc>
+        <w:tc>
+          <w:tcPr>
+            <w:tcW w:w="2394" w:type="dxa"/>
+            <w:tcBorders>
+              <w:top w:val="single" w:sz="1" w:space="0" w:color="CCCCCC"/>
+              <w:left w:val="single" w:sz="1" w:space="0" w:color="CCCCCC"/>
+              <w:bottom w:val="single" w:sz="1" w:space="0" w:color="CCCCCC"/>
+              <w:right w:val="single" w:sz="1" w:space="0" w:color="CCCCCC"/>
+            </w:tcBorders>
+            <w:shd w:val="clear" w:color="auto" w:fill="EBF5FB"/>
+            <w:tcMar>
+              <w:top w:w="40" w:type="dxa"/>
+              <w:left w:w="90" w:type="dxa"/>
+              <w:bottom w:w="40" w:type="dxa"/>
+              <w:right w:w="90" w:type="dxa"/>
+            </w:tcMar>
+            <w:vAlign w:val="center"/>
+          </w:tcPr>
+          <w:p>
+            <w:pPr>
+              <w:rPr>
+                <w:rFonts w:ascii="ヒラギノ丸ゴ Pro W4" w:eastAsia="ヒラギノ丸ゴ Pro W4" w:hAnsi="ヒラギノ丸ゴ Pro W4" w:hint="eastAsia"/>
+                <w:color w:val="5D6D7E"/>
+                <w:sz w:val="16"/>
+                <w:szCs w:val="16"/>
+              </w:rPr>
+            </w:pPr>
+            <w:r>
+              <w:rPr>
+                <w:rFonts w:ascii="ヒラギノ丸ゴ Pro W4" w:eastAsia="ヒラギノ丸ゴ Pro W4" w:hAnsi="ヒラギノ丸ゴ Pro W4" w:hint="eastAsia"/>
+                <w:color w:val="5D6D7E"/>
+                <w:sz w:val="16"/>
+                <w:szCs w:val="16"/>
+              </w:rPr>
+              <w:t xml:space="preserve">バナナ半分：約45kcal／11g（0.2g/kg）／1g</w:t>
+            </w:r>
+          </w:p>
+        </w:tc>
+      </w:tr>
+      <w:tr>
+        <w:trPr>
+          <w:cantSplit/>
+        </w:trPr>
+        <w:tc>
+          <w:tcPr>
+            <w:tcW w:w="4080" w:type="dxa"/>
+            <w:gridSpan w:val="3"/>
+            <w:tcBorders>
+              <w:top w:val="single" w:sz="1" w:space="0" w:color="CCCCCC"/>
+              <w:left w:val="single" w:sz="1" w:space="0" w:color="CCCCCC"/>
+              <w:bottom w:val="single" w:sz="1" w:space="0" w:color="CCCCCC"/>
+              <w:right w:val="single" w:sz="1" w:space="0" w:color="CCCCCC"/>
+            </w:tcBorders>
+            <w:shd w:val="clear" w:color="auto" w:fill="FDEDEC"/>
+            <w:tcMar>
+              <w:top w:w="40" w:type="dxa"/>
+              <w:left w:w="90" w:type="dxa"/>
+              <w:bottom w:w="40" w:type="dxa"/>
+              <w:right w:w="90" w:type="dxa"/>
+            </w:tcMar>
+            <w:vAlign w:val="center"/>
+          </w:tcPr>
+          <w:p>
+            <w:pPr>
+              <w:jc w:val="center"/>
+              <w:rPr>
+                <w:rFonts w:ascii="ヒラギノ丸ゴ Pro W4" w:eastAsia="ヒラギノ丸ゴ Pro W4" w:hAnsi="ヒラギノ丸ゴ Pro W4" w:hint="eastAsia"/>
+                <w:b/>
+                <w:bCs/>
+                <w:color w:val="922B21"/>
+                <w:sz w:val="18"/>
+                <w:szCs w:val="18"/>
+              </w:rPr>
+            </w:pPr>
+            <w:r>
+              <w:rPr>
+                <w:rFonts w:ascii="ヒラギノ丸ゴ Pro W4" w:eastAsia="ヒラギノ丸ゴ Pro W4" w:hAnsi="ヒラギノ丸ゴ Pro W4" w:hint="eastAsia"/>
+                <w:b/>
+                <w:bCs/>
+                <w:color w:val="922B21"/>
+                <w:sz w:val="18"/>
+                <w:szCs w:val="18"/>
+              </w:rPr>
+              <w:t xml:space="preserve">前日合計</w:t>
+            </w:r>
+          </w:p>
+        </w:tc>
+        <w:tc>
+          <w:tcPr>
+            <w:tcW w:w="1120" w:type="dxa"/>
+            <w:tcBorders>
+              <w:top w:val="single" w:sz="1" w:space="0" w:color="CCCCCC"/>
+              <w:left w:val="single" w:sz="1" w:space="0" w:color="CCCCCC"/>
+              <w:bottom w:val="single" w:sz="1" w:space="0" w:color="CCCCCC"/>
+              <w:right w:val="single" w:sz="1" w:space="0" w:color="CCCCCC"/>
+            </w:tcBorders>
+            <w:shd w:val="clear" w:color="auto" w:fill="FDEDEC"/>
+            <w:tcMar>
+              <w:top w:w="40" w:type="dxa"/>
+              <w:left w:w="90" w:type="dxa"/>
+              <w:bottom w:w="40" w:type="dxa"/>
+              <w:right w:w="90" w:type="dxa"/>
+            </w:tcMar>
+            <w:vAlign w:val="center"/>
+          </w:tcPr>
+          <w:p>
+            <w:pPr>
+              <w:jc w:val="center"/>
+              <w:rPr>
+                <w:rFonts w:ascii="ヒラギノ丸ゴ Pro W4" w:eastAsia="ヒラギノ丸ゴ Pro W4" w:hAnsi="ヒラギノ丸ゴ Pro W4" w:hint="eastAsia"/>
+                <w:b/>
+                <w:bCs/>
+                <w:color w:val="2C3E50"/>
+                <w:sz w:val="17"/>
+                <w:szCs w:val="17"/>
+              </w:rPr>
+            </w:pPr>
+            <w:r>
+              <w:rPr>
+                <w:rFonts w:ascii="ヒラギノ丸ゴ Pro W4" w:eastAsia="ヒラギノ丸ゴ Pro W4" w:hAnsi="ヒラギノ丸ゴ Pro W4" w:hint="eastAsia"/>
+                <w:b/>
+                <w:bCs/>
+                <w:color w:val="2C3E50"/>
+                <w:sz w:val="17"/>
+                <w:szCs w:val="17"/>
+              </w:rPr>
+              <w:t xml:space="preserve">約2,640kcal</w:t>
+            </w:r>
+          </w:p>
+        </w:tc>
+        <w:tc>
+          <w:tcPr>
+            <w:tcW w:w="880" w:type="dxa"/>
+            <w:tcBorders>
+              <w:top w:val="single" w:sz="1" w:space="0" w:color="CCCCCC"/>
+              <w:left w:val="single" w:sz="1" w:space="0" w:color="CCCCCC"/>
+              <w:bottom w:val="single" w:sz="1" w:space="0" w:color="CCCCCC"/>
+              <w:right w:val="single" w:sz="1" w:space="0" w:color="CCCCCC"/>
+            </w:tcBorders>
+            <w:shd w:val="clear" w:color="auto" w:fill="FDEDEC"/>
+            <w:tcMar>
+              <w:top w:w="40" w:type="dxa"/>
+              <w:left w:w="90" w:type="dxa"/>
+              <w:bottom w:w="40" w:type="dxa"/>
+              <w:right w:w="90" w:type="dxa"/>
+            </w:tcMar>
+            <w:vAlign w:val="center"/>
+          </w:tcPr>
+          <w:p>
+            <w:pPr>
+              <w:jc w:val="center"/>
+              <w:rPr>
+                <w:rFonts w:ascii="ヒラギノ丸ゴ Pro W4" w:eastAsia="ヒラギノ丸ゴ Pro W4" w:hAnsi="ヒラギノ丸ゴ Pro W4" w:hint="eastAsia"/>
+                <w:b/>
+                <w:bCs/>
+                <w:color w:val="922B21"/>
+                <w:sz w:val="17"/>
+                <w:szCs w:val="17"/>
+              </w:rPr>
+            </w:pPr>
+            <w:r>
+              <w:rPr>
+                <w:rFonts w:ascii="ヒラギノ丸ゴ Pro W4" w:eastAsia="ヒラギノ丸ゴ Pro W4" w:hAnsi="ヒラギノ丸ゴ Pro W4" w:hint="eastAsia"/>
+                <w:b/>
+                <w:bCs/>
+                <w:color w:val="922B21"/>
+                <w:sz w:val="17"/>
+                <w:szCs w:val="17"/>
+              </w:rPr>
+              <w:t xml:space="preserve">約480g</w:t>
+            </w:r>
+          </w:p>
+        </w:tc>
+        <w:tc>
+          <w:tcPr>
+            <w:tcW w:w="760" w:type="dxa"/>
+            <w:tcBorders>
+              <w:top w:val="single" w:sz="1" w:space="0" w:color="CCCCCC"/>
+              <w:left w:val="single" w:sz="1" w:space="0" w:color="CCCCCC"/>
+              <w:bottom w:val="single" w:sz="1" w:space="0" w:color="CCCCCC"/>
+              <w:right w:val="single" w:sz="1" w:space="0" w:color="CCCCCC"/>
+            </w:tcBorders>
+            <w:shd w:val="clear" w:color="auto" w:fill="FDEDEC"/>
+            <w:tcMar>
+              <w:top w:w="40" w:type="dxa"/>
+              <w:left w:w="90" w:type="dxa"/>
+              <w:bottom w:w="40" w:type="dxa"/>
+              <w:right w:w="90" w:type="dxa"/>
+            </w:tcMar>
+            <w:vAlign w:val="center"/>
+          </w:tcPr>
+          <w:p>
+            <w:pPr>
+              <w:jc w:val="center"/>
+              <w:rPr>
+                <w:rFonts w:ascii="ヒラギノ丸ゴ Pro W4" w:eastAsia="ヒラギノ丸ゴ Pro W4" w:hAnsi="ヒラギノ丸ゴ Pro W4" w:hint="eastAsia"/>
+                <w:b/>
+                <w:bCs/>
+                <w:color w:val="922B21"/>
+                <w:sz w:val="17"/>
+                <w:szCs w:val="17"/>
+              </w:rPr>
+            </w:pPr>
+            <w:r>
+              <w:rPr>
+                <w:rFonts w:ascii="ヒラギノ丸ゴ Pro W4" w:eastAsia="ヒラギノ丸ゴ Pro W4" w:hAnsi="ヒラギノ丸ゴ Pro W4" w:hint="eastAsia"/>
+                <w:b/>
+                <w:bCs/>
+                <w:color w:val="922B21"/>
+                <w:sz w:val="17"/>
+                <w:szCs w:val="17"/>
+              </w:rPr>
+              <w:t xml:space="preserve">7.9</w:t>
+            </w:r>
+          </w:p>
+        </w:tc>
+        <w:tc>
+          <w:tcPr>
+            <w:tcW w:w="830" w:type="dxa"/>
+            <w:tcBorders>
+              <w:top w:val="single" w:sz="1" w:space="0" w:color="CCCCCC"/>
+              <w:left w:val="single" w:sz="1" w:space="0" w:color="CCCCCC"/>
+              <w:bottom w:val="single" w:sz="1" w:space="0" w:color="CCCCCC"/>
+              <w:right w:val="single" w:sz="1" w:space="0" w:color="CCCCCC"/>
+            </w:tcBorders>
+            <w:shd w:val="clear" w:color="auto" w:fill="FDEDEC"/>
+            <w:tcMar>
+              <w:top w:w="40" w:type="dxa"/>
+              <w:left w:w="90" w:type="dxa"/>
+              <w:bottom w:w="40" w:type="dxa"/>
+              <w:right w:w="90" w:type="dxa"/>
+            </w:tcMar>
+            <w:vAlign w:val="center"/>
+          </w:tcPr>
+          <w:p>
+            <w:pPr>
+              <w:jc w:val="center"/>
+              <w:rPr>
+                <w:rFonts w:ascii="ヒラギノ丸ゴ Pro W4" w:eastAsia="ヒラギノ丸ゴ Pro W4" w:hAnsi="ヒラギノ丸ゴ Pro W4" w:hint="eastAsia"/>
+                <w:b/>
+                <w:bCs/>
+                <w:color w:val="2C3E50"/>
+                <w:sz w:val="17"/>
+                <w:szCs w:val="17"/>
+              </w:rPr>
+            </w:pPr>
+            <w:r>
+              <w:rPr>
+                <w:rFonts w:ascii="ヒラギノ丸ゴ Pro W4" w:eastAsia="ヒラギノ丸ゴ Pro W4" w:hAnsi="ヒラギノ丸ゴ Pro W4" w:hint="eastAsia"/>
+                <w:b/>
+                <w:bCs/>
+                <w:color w:val="2C3E50"/>
+                <w:sz w:val="17"/>
+                <w:szCs w:val="17"/>
+              </w:rPr>
+              <w:t xml:space="preserve">約88g</w:t>
+            </w:r>
+          </w:p>
+        </w:tc>
+        <w:tc>
+          <w:tcPr>
+            <w:tcW w:w="2394" w:type="dxa"/>
+            <w:tcBorders>
+              <w:top w:val="single" w:sz="1" w:space="0" w:color="CCCCCC"/>
+              <w:left w:val="single" w:sz="1" w:space="0" w:color="CCCCCC"/>
+              <w:bottom w:val="single" w:sz="1" w:space="0" w:color="CCCCCC"/>
+              <w:right w:val="single" w:sz="1" w:space="0" w:color="CCCCCC"/>
+            </w:tcBorders>
+            <w:shd w:val="clear" w:color="auto" w:fill="FDEDEC"/>
+            <w:tcMar>
+              <w:top w:w="40" w:type="dxa"/>
+              <w:left w:w="90" w:type="dxa"/>
+              <w:bottom w:w="40" w:type="dxa"/>
+              <w:right w:w="90" w:type="dxa"/>
+            </w:tcMar>
+            <w:vAlign w:val="center"/>
+          </w:tcPr>
+          <w:p>
+            <w:pPr>
+              <w:rPr>
+                <w:rFonts w:ascii="ヒラギノ丸ゴ Pro W4" w:eastAsia="ヒラギノ丸ゴ Pro W4" w:hAnsi="ヒラギノ丸ゴ Pro W4" w:hint="eastAsia"/>
+                <w:color w:val="5D6D7E"/>
+                <w:sz w:val="16"/>
+                <w:szCs w:val="16"/>
+              </w:rPr>
+            </w:pPr>
+            <w:r>
+              <w:rPr>
+                <w:rFonts w:ascii="ヒラギノ丸ゴ Pro W4" w:eastAsia="ヒラギノ丸ゴ Pro W4" w:hAnsi="ヒラギノ丸ゴ Pro W4" w:hint="eastAsia"/>
+                <w:color w:val="5D6D7E"/>
+                <w:sz w:val="16"/>
+                <w:szCs w:val="16"/>
+              </w:rPr>
+              <w:t xml:space="preserve">エネルギー 約43kcal/kg、たんぱく質 約1.4g/kg</w:t>
+            </w:r>
+          </w:p>
+        </w:tc>
+      </w:tr>
+      <w:tr>
+        <w:trPr>
+          <w:cantSplit/>
+        </w:trPr>
+        <w:tc>
+          <w:tcPr>
+            <w:tcW w:w="10064" w:type="dxa"/>
+            <w:gridSpan w:val="8"/>
+            <w:tcBorders>
+              <w:top w:val="single" w:sz="1" w:space="0" w:color="CCCCCC"/>
+              <w:left w:val="single" w:sz="1" w:space="0" w:color="CCCCCC"/>
+              <w:bottom w:val="single" w:sz="1" w:space="0" w:color="CCCCCC"/>
+              <w:right w:val="single" w:sz="1" w:space="0" w:color="CCCCCC"/>
+            </w:tcBorders>
+            <w:shd w:val="clear" w:color="auto" w:fill="1B2631"/>
+            <w:tcMar>
+              <w:top w:w="40" w:type="dxa"/>
+              <w:left w:w="90" w:type="dxa"/>
+              <w:bottom w:w="40" w:type="dxa"/>
+              <w:right w:w="90" w:type="dxa"/>
+            </w:tcMar>
+            <w:vAlign w:val="center"/>
+          </w:tcPr>
+          <w:p>
+            <w:pPr>
+              <w:rPr>
+                <w:rFonts w:ascii="ヒラギノ丸ゴ Pro W4" w:eastAsia="ヒラギノ丸ゴ Pro W4" w:hAnsi="ヒラギノ丸ゴ Pro W4" w:hint="eastAsia"/>
+                <w:b/>
+                <w:bCs/>
+                <w:color w:val="FFFFFF"/>
+                <w:sz w:val="19"/>
+                <w:szCs w:val="19"/>
+              </w:rPr>
+            </w:pPr>
+            <w:r>
+              <w:rPr>
+                <w:rFonts w:ascii="ヒラギノ丸ゴ Pro W4" w:eastAsia="ヒラギノ丸ゴ Pro W4" w:hAnsi="ヒラギノ丸ゴ Pro W4" w:hint="eastAsia"/>
+                <w:b/>
+                <w:bCs/>
+                <w:color w:val="FFFFFF"/>
+                <w:sz w:val="19"/>
+                <w:szCs w:val="19"/>
+              </w:rPr>
+              <w:t xml:space="preserve">試合当日（400mのレースまで）</w:t>
+            </w:r>
+          </w:p>
+        </w:tc>
+      </w:tr>
+      <w:tr>
+        <w:trPr>
+          <w:cantSplit/>
+        </w:trPr>
+        <w:tc>
+          <w:tcPr>
+            <w:tcW w:w="780" w:type="dxa"/>
+            <w:tcBorders>
+              <w:top w:val="single" w:sz="1" w:space="0" w:color="CCCCCC"/>
+              <w:left w:val="single" w:sz="1" w:space="0" w:color="CCCCCC"/>
+              <w:bottom w:val="single" w:sz="1" w:space="0" w:color="CCCCCC"/>
+              <w:right w:val="single" w:sz="1" w:space="0" w:color="CCCCCC"/>
+            </w:tcBorders>
+            <w:shd w:val="clear" w:color="auto" w:fill="FEF9E7"/>
+            <w:tcMar>
+              <w:top w:w="40" w:type="dxa"/>
+              <w:left w:w="90" w:type="dxa"/>
+              <w:bottom w:w="40" w:type="dxa"/>
+              <w:right w:w="90" w:type="dxa"/>
+            </w:tcMar>
+            <w:vAlign w:val="center"/>
+          </w:tcPr>
+          <w:p>
+            <w:pPr>
+              <w:jc w:val="center"/>
+              <w:rPr>
+                <w:rFonts w:ascii="ヒラギノ丸ゴ Pro W4" w:eastAsia="ヒラギノ丸ゴ Pro W4" w:hAnsi="ヒラギノ丸ゴ Pro W4" w:hint="eastAsia"/>
+                <w:color w:val="2C3E50"/>
+                <w:sz w:val="17"/>
+                <w:szCs w:val="17"/>
+              </w:rPr>
+            </w:pPr>
+            <w:r>
+              <w:rPr>
+                <w:rFonts w:ascii="ヒラギノ丸ゴ Pro W4" w:eastAsia="ヒラギノ丸ゴ Pro W4" w:hAnsi="ヒラギノ丸ゴ Pro W4" w:hint="eastAsia"/>
+                <w:color w:val="2C3E50"/>
+                <w:sz w:val="17"/>
+                <w:szCs w:val="17"/>
+              </w:rPr>
+              <w:t xml:space="preserve">〜6:30</w:t>
+            </w:r>
+          </w:p>
+        </w:tc>
+        <w:tc>
+          <w:tcPr>
+            <w:tcW w:w="880" w:type="dxa"/>
+            <w:tcBorders>
+              <w:top w:val="single" w:sz="1" w:space="0" w:color="CCCCCC"/>
+              <w:left w:val="single" w:sz="1" w:space="0" w:color="CCCCCC"/>
+              <w:bottom w:val="single" w:sz="1" w:space="0" w:color="CCCCCC"/>
+              <w:right w:val="single" w:sz="1" w:space="0" w:color="CCCCCC"/>
+            </w:tcBorders>
+            <w:shd w:val="clear" w:color="auto" w:fill="FEF9E7"/>
+            <w:tcMar>
+              <w:top w:w="40" w:type="dxa"/>
+              <w:left w:w="90" w:type="dxa"/>
+              <w:bottom w:w="40" w:type="dxa"/>
+              <w:right w:w="90" w:type="dxa"/>
+            </w:tcMar>
+            <w:vAlign w:val="center"/>
+          </w:tcPr>
+          <w:p>
+            <w:pPr>
+              <w:jc w:val="center"/>
+              <w:rPr>
+                <w:rFonts w:ascii="ヒラギノ丸ゴ Pro W4" w:eastAsia="ヒラギノ丸ゴ Pro W4" w:hAnsi="ヒラギノ丸ゴ Pro W4" w:hint="eastAsia"/>
+                <w:b/>
+                <w:bCs/>
+                <w:color w:val="922B21"/>
+                <w:sz w:val="18"/>
+                <w:szCs w:val="18"/>
+              </w:rPr>
+            </w:pPr>
+            <w:r>
+              <w:rPr>
+                <w:rFonts w:ascii="ヒラギノ丸ゴ Pro W4" w:eastAsia="ヒラギノ丸ゴ Pro W4" w:hAnsi="ヒラギノ丸ゴ Pro W4" w:hint="eastAsia"/>
+                <w:b/>
+                <w:bCs/>
+                <w:color w:val="922B21"/>
+                <w:sz w:val="18"/>
+                <w:szCs w:val="18"/>
+              </w:rPr>
+              <w:t xml:space="preserve">朝食</w:t>
+            </w:r>
+          </w:p>
+        </w:tc>
+        <w:tc>
+          <w:tcPr>
+            <w:tcW w:w="2420" w:type="dxa"/>
+            <w:tcBorders>
+              <w:top w:val="single" w:sz="1" w:space="0" w:color="CCCCCC"/>
+              <w:left w:val="single" w:sz="1" w:space="0" w:color="CCCCCC"/>
+              <w:bottom w:val="single" w:sz="1" w:space="0" w:color="CCCCCC"/>
+              <w:right w:val="single" w:sz="1" w:space="0" w:color="CCCCCC"/>
+            </w:tcBorders>
+            <w:shd w:val="clear" w:color="auto" w:fill="FEF9E7"/>
+            <w:tcMar>
+              <w:top w:w="40" w:type="dxa"/>
+              <w:left w:w="90" w:type="dxa"/>
+              <w:bottom w:w="40" w:type="dxa"/>
+              <w:right w:w="90" w:type="dxa"/>
+            </w:tcMar>
+            <w:vAlign w:val="center"/>
+          </w:tcPr>
+          <w:p>
+            <w:pPr>
+              <w:rPr>
+                <w:rFonts w:ascii="ヒラギノ丸ゴ Pro W4" w:eastAsia="ヒラギノ丸ゴ Pro W4" w:hAnsi="ヒラギノ丸ゴ Pro W4" w:hint="eastAsia"/>
+                <w:color w:val="2C3E50"/>
+                <w:sz w:val="17"/>
+                <w:szCs w:val="17"/>
+              </w:rPr>
+            </w:pPr>
+            <w:r>
+              <w:rPr>
+                <w:rFonts w:ascii="ヒラギノ丸ゴ Pro W4" w:eastAsia="ヒラギノ丸ゴ Pro W4" w:hAnsi="ヒラギノ丸ゴ Pro W4" w:hint="eastAsia"/>
+                <w:color w:val="2C3E50"/>
+                <w:sz w:val="17"/>
+                <w:szCs w:val="17"/>
+              </w:rPr>
+              <w:t xml:space="preserve">ご飯180g＋ふりかけ、味噌汁、コーヒー（ブラック）</w:t>
+            </w:r>
+          </w:p>
+        </w:tc>
+        <w:tc>
+          <w:tcPr>
+            <w:tcW w:w="1120" w:type="dxa"/>
+            <w:tcBorders>
+              <w:top w:val="single" w:sz="1" w:space="0" w:color="CCCCCC"/>
+              <w:left w:val="single" w:sz="1" w:space="0" w:color="CCCCCC"/>
+              <w:bottom w:val="single" w:sz="1" w:space="0" w:color="CCCCCC"/>
+              <w:right w:val="single" w:sz="1" w:space="0" w:color="CCCCCC"/>
+            </w:tcBorders>
+            <w:shd w:val="clear" w:color="auto" w:fill="FEF9E7"/>
+            <w:tcMar>
+              <w:top w:w="40" w:type="dxa"/>
+              <w:left w:w="90" w:type="dxa"/>
+              <w:bottom w:w="40" w:type="dxa"/>
+              <w:right w:w="90" w:type="dxa"/>
+            </w:tcMar>
+            <w:vAlign w:val="center"/>
+          </w:tcPr>
+          <w:p>
+            <w:pPr>
+              <w:jc w:val="center"/>
+              <w:rPr>
+                <w:rFonts w:ascii="ヒラギノ丸ゴ Pro W4" w:eastAsia="ヒラギノ丸ゴ Pro W4" w:hAnsi="ヒラギノ丸ゴ Pro W4" w:hint="eastAsia"/>
+                <w:b/>
+                <w:bCs/>
+                <w:color w:val="2C3E50"/>
+                <w:sz w:val="17"/>
+                <w:szCs w:val="17"/>
+              </w:rPr>
+            </w:pPr>
+            <w:r>
+              <w:rPr>
+                <w:rFonts w:ascii="ヒラギノ丸ゴ Pro W4" w:eastAsia="ヒラギノ丸ゴ Pro W4" w:hAnsi="ヒラギノ丸ゴ Pro W4" w:hint="eastAsia"/>
+                <w:b/>
+                <w:bCs/>
+                <w:color w:val="2C3E50"/>
+                <w:sz w:val="17"/>
+                <w:szCs w:val="17"/>
+              </w:rPr>
+              <w:t xml:space="preserve">約340kcal</w:t>
+            </w:r>
+          </w:p>
+        </w:tc>
+        <w:tc>
+          <w:tcPr>
+            <w:tcW w:w="880" w:type="dxa"/>
+            <w:tcBorders>
+              <w:top w:val="single" w:sz="1" w:space="0" w:color="CCCCCC"/>
+              <w:left w:val="single" w:sz="1" w:space="0" w:color="CCCCCC"/>
+              <w:bottom w:val="single" w:sz="1" w:space="0" w:color="CCCCCC"/>
+              <w:right w:val="single" w:sz="1" w:space="0" w:color="CCCCCC"/>
+            </w:tcBorders>
+            <w:shd w:val="clear" w:color="auto" w:fill="FEF9E7"/>
+            <w:tcMar>
+              <w:top w:w="40" w:type="dxa"/>
+              <w:left w:w="90" w:type="dxa"/>
+              <w:bottom w:w="40" w:type="dxa"/>
+              <w:right w:w="90" w:type="dxa"/>
+            </w:tcMar>
+            <w:vAlign w:val="center"/>
+          </w:tcPr>
+          <w:p>
+            <w:pPr>
+              <w:jc w:val="center"/>
+              <w:rPr>
+                <w:rFonts w:ascii="ヒラギノ丸ゴ Pro W4" w:eastAsia="ヒラギノ丸ゴ Pro W4" w:hAnsi="ヒラギノ丸ゴ Pro W4" w:hint="eastAsia"/>
+                <w:b/>
+                <w:bCs/>
+                <w:color w:val="922B21"/>
+                <w:sz w:val="17"/>
+                <w:szCs w:val="17"/>
+              </w:rPr>
+            </w:pPr>
+            <w:r>
+              <w:rPr>
+                <w:rFonts w:ascii="ヒラギノ丸ゴ Pro W4" w:eastAsia="ヒラギノ丸ゴ Pro W4" w:hAnsi="ヒラギノ丸ゴ Pro W4" w:hint="eastAsia"/>
+                <w:b/>
+                <w:bCs/>
+                <w:color w:val="922B21"/>
+                <w:sz w:val="17"/>
+                <w:szCs w:val="17"/>
+              </w:rPr>
+              <w:t xml:space="preserve">約71g</w:t>
+            </w:r>
+          </w:p>
+        </w:tc>
+        <w:tc>
+          <w:tcPr>
+            <w:tcW w:w="760" w:type="dxa"/>
+            <w:tcBorders>
+              <w:top w:val="single" w:sz="1" w:space="0" w:color="CCCCCC"/>
+              <w:left w:val="single" w:sz="1" w:space="0" w:color="CCCCCC"/>
+              <w:bottom w:val="single" w:sz="1" w:space="0" w:color="CCCCCC"/>
+              <w:right w:val="single" w:sz="1" w:space="0" w:color="CCCCCC"/>
+            </w:tcBorders>
+            <w:shd w:val="clear" w:color="auto" w:fill="FEF9E7"/>
+            <w:tcMar>
+              <w:top w:w="40" w:type="dxa"/>
+              <w:left w:w="90" w:type="dxa"/>
+              <w:bottom w:w="40" w:type="dxa"/>
+              <w:right w:w="90" w:type="dxa"/>
+            </w:tcMar>
+            <w:vAlign w:val="center"/>
+          </w:tcPr>
+          <w:p>
+            <w:pPr>
+              <w:jc w:val="center"/>
+              <w:rPr>
+                <w:rFonts w:ascii="ヒラギノ丸ゴ Pro W4" w:eastAsia="ヒラギノ丸ゴ Pro W4" w:hAnsi="ヒラギノ丸ゴ Pro W4" w:hint="eastAsia"/>
+                <w:b/>
+                <w:bCs/>
+                <w:color w:val="922B21"/>
+                <w:sz w:val="17"/>
+                <w:szCs w:val="17"/>
+              </w:rPr>
+            </w:pPr>
+            <w:r>
+              <w:rPr>
+                <w:rFonts w:ascii="ヒラギノ丸ゴ Pro W4" w:eastAsia="ヒラギノ丸ゴ Pro W4" w:hAnsi="ヒラギノ丸ゴ Pro W4" w:hint="eastAsia"/>
+                <w:b/>
+                <w:bCs/>
+                <w:color w:val="922B21"/>
+                <w:sz w:val="17"/>
+                <w:szCs w:val="17"/>
+              </w:rPr>
+              <w:t xml:space="preserve">1.2</w:t>
+            </w:r>
+          </w:p>
+        </w:tc>
+        <w:tc>
+          <w:tcPr>
+            <w:tcW w:w="830" w:type="dxa"/>
+            <w:tcBorders>
+              <w:top w:val="single" w:sz="1" w:space="0" w:color="CCCCCC"/>
+              <w:left w:val="single" w:sz="1" w:space="0" w:color="CCCCCC"/>
+              <w:bottom w:val="single" w:sz="1" w:space="0" w:color="CCCCCC"/>
+              <w:right w:val="single" w:sz="1" w:space="0" w:color="CCCCCC"/>
+            </w:tcBorders>
+            <w:shd w:val="clear" w:color="auto" w:fill="FEF9E7"/>
+            <w:tcMar>
+              <w:top w:w="40" w:type="dxa"/>
+              <w:left w:w="90" w:type="dxa"/>
+              <w:bottom w:w="40" w:type="dxa"/>
+              <w:right w:w="90" w:type="dxa"/>
+            </w:tcMar>
+            <w:vAlign w:val="center"/>
+          </w:tcPr>
+          <w:p>
+            <w:pPr>
+              <w:jc w:val="center"/>
+              <w:rPr>
+                <w:rFonts w:ascii="ヒラギノ丸ゴ Pro W4" w:eastAsia="ヒラギノ丸ゴ Pro W4" w:hAnsi="ヒラギノ丸ゴ Pro W4" w:hint="eastAsia"/>
+                <w:b/>
+                <w:bCs/>
+                <w:color w:val="2C3E50"/>
+                <w:sz w:val="17"/>
+                <w:szCs w:val="17"/>
+              </w:rPr>
+            </w:pPr>
+            <w:r>
+              <w:rPr>
+                <w:rFonts w:ascii="ヒラギノ丸ゴ Pro W4" w:eastAsia="ヒラギノ丸ゴ Pro W4" w:hAnsi="ヒラギノ丸ゴ Pro W4" w:hint="eastAsia"/>
+                <w:b/>
+                <w:bCs/>
+                <w:color w:val="2C3E50"/>
+                <w:sz w:val="17"/>
+                <w:szCs w:val="17"/>
+              </w:rPr>
+              <w:t xml:space="preserve">約8g</w:t>
+            </w:r>
+          </w:p>
+        </w:tc>
+        <w:tc>
+          <w:tcPr>
+            <w:tcW w:w="2394" w:type="dxa"/>
+            <w:tcBorders>
+              <w:top w:val="single" w:sz="1" w:space="0" w:color="CCCCCC"/>
+              <w:left w:val="single" w:sz="1" w:space="0" w:color="CCCCCC"/>
+              <w:bottom w:val="single" w:sz="1" w:space="0" w:color="CCCCCC"/>
+              <w:right w:val="single" w:sz="1" w:space="0" w:color="CCCCCC"/>
+            </w:tcBorders>
+            <w:shd w:val="clear" w:color="auto" w:fill="FEF9E7"/>
+            <w:tcMar>
+              <w:top w:w="40" w:type="dxa"/>
+              <w:left w:w="90" w:type="dxa"/>
+              <w:bottom w:w="40" w:type="dxa"/>
+              <w:right w:w="90" w:type="dxa"/>
+            </w:tcMar>
+            <w:vAlign w:val="center"/>
+          </w:tcPr>
+          <w:p>
+            <w:pPr>
+              <w:rPr>
+                <w:rFonts w:ascii="ヒラギノ丸ゴ Pro W4" w:eastAsia="ヒラギノ丸ゴ Pro W4" w:hAnsi="ヒラギノ丸ゴ Pro W4" w:hint="eastAsia"/>
+                <w:color w:val="5D6D7E"/>
+                <w:sz w:val="16"/>
+                <w:szCs w:val="16"/>
+              </w:rPr>
+            </w:pPr>
+            <w:r>
+              <w:rPr>
+                <w:rFonts w:ascii="ヒラギノ丸ゴ Pro W4" w:eastAsia="ヒラギノ丸ゴ Pro W4" w:hAnsi="ヒラギノ丸ゴ Pro W4" w:hint="eastAsia"/>
+                <w:color w:val="5D6D7E"/>
+                <w:sz w:val="16"/>
+                <w:szCs w:val="16"/>
+              </w:rPr>
+              <w:t xml:space="preserve">＋ヨーグルト＋ジャム：約445kcal／89g（1.5g/kg）／12g</w:t>
+            </w:r>
+          </w:p>
+          <w:p>
+            <w:pPr>
+              <w:rPr>
+                <w:rFonts w:ascii="ヒラギノ丸ゴ Pro W4" w:eastAsia="ヒラギノ丸ゴ Pro W4" w:hAnsi="ヒラギノ丸ゴ Pro W4" w:hint="eastAsia"/>
+                <w:color w:val="5D6D7E"/>
+                <w:sz w:val="16"/>
+                <w:szCs w:val="16"/>
+              </w:rPr>
+            </w:pPr>
+            <w:r>
+              <w:rPr>
+                <w:rFonts w:ascii="ヒラギノ丸ゴ Pro W4" w:eastAsia="ヒラギノ丸ゴ Pro W4" w:hAnsi="ヒラギノ丸ゴ Pro W4" w:hint="eastAsia"/>
+                <w:color w:val="5D6D7E"/>
+                <w:sz w:val="16"/>
+                <w:szCs w:val="16"/>
+              </w:rPr>
+              <w:t xml:space="preserve">＋果物数切れ：約400kcal／86g（1.4g/kg）／9g</w:t>
+            </w:r>
+          </w:p>
+          <w:p>
+            <w:pPr>
+              <w:rPr>
+                <w:rFonts w:ascii="ヒラギノ丸ゴ Pro W4" w:eastAsia="ヒラギノ丸ゴ Pro W4" w:hAnsi="ヒラギノ丸ゴ Pro W4" w:hint="eastAsia"/>
+                <w:color w:val="5D6D7E"/>
+                <w:sz w:val="16"/>
+                <w:szCs w:val="16"/>
+              </w:rPr>
+            </w:pPr>
+            <w:r>
+              <w:rPr>
+                <w:rFonts w:ascii="ヒラギノ丸ゴ Pro W4" w:eastAsia="ヒラギノ丸ゴ Pro W4" w:hAnsi="ヒラギノ丸ゴ Pro W4" w:hint="eastAsia"/>
+                <w:color w:val="5D6D7E"/>
+                <w:sz w:val="16"/>
+                <w:szCs w:val="16"/>
+              </w:rPr>
+              <w:t xml:space="preserve">＋納豆：たんぱく質 約＋7g</w:t>
+            </w:r>
+          </w:p>
+        </w:tc>
+      </w:tr>
+      <w:tr>
+        <w:trPr>
+          <w:cantSplit/>
+        </w:trPr>
+        <w:tc>
+          <w:tcPr>
+            <w:tcW w:w="780" w:type="dxa"/>
+            <w:tcBorders>
+              <w:top w:val="single" w:sz="1" w:space="0" w:color="CCCCCC"/>
+              <w:left w:val="single" w:sz="1" w:space="0" w:color="CCCCCC"/>
+              <w:bottom w:val="single" w:sz="1" w:space="0" w:color="CCCCCC"/>
+              <w:right w:val="single" w:sz="1" w:space="0" w:color="CCCCCC"/>
+            </w:tcBorders>
+            <w:shd w:val="clear" w:color="auto" w:fill="FEF9E7"/>
+            <w:tcMar>
+              <w:top w:w="40" w:type="dxa"/>
+              <w:left w:w="90" w:type="dxa"/>
+              <w:bottom w:w="40" w:type="dxa"/>
+              <w:right w:w="90" w:type="dxa"/>
+            </w:tcMar>
+            <w:vAlign w:val="center"/>
+          </w:tcPr>
+          <w:p>
+            <w:pPr>
+              <w:jc w:val="center"/>
+              <w:rPr>
+                <w:rFonts w:ascii="ヒラギノ丸ゴ Pro W4" w:eastAsia="ヒラギノ丸ゴ Pro W4" w:hAnsi="ヒラギノ丸ゴ Pro W4" w:hint="eastAsia"/>
+                <w:color w:val="2C3E50"/>
+                <w:sz w:val="17"/>
+                <w:szCs w:val="17"/>
+              </w:rPr>
+            </w:pPr>
+            <w:r>
+              <w:rPr>
+                <w:rFonts w:ascii="ヒラギノ丸ゴ Pro W4" w:eastAsia="ヒラギノ丸ゴ Pro W4" w:hAnsi="ヒラギノ丸ゴ Pro W4" w:hint="eastAsia"/>
+                <w:color w:val="2C3E50"/>
+                <w:sz w:val="17"/>
+                <w:szCs w:val="17"/>
+              </w:rPr>
+              <w:t xml:space="preserve">8:00頃</w:t>
+            </w:r>
+          </w:p>
+        </w:tc>
+        <w:tc>
+          <w:tcPr>
+            <w:tcW w:w="880" w:type="dxa"/>
+            <w:tcBorders>
+              <w:top w:val="single" w:sz="1" w:space="0" w:color="CCCCCC"/>
+              <w:left w:val="single" w:sz="1" w:space="0" w:color="CCCCCC"/>
+              <w:bottom w:val="single" w:sz="1" w:space="0" w:color="CCCCCC"/>
+              <w:right w:val="single" w:sz="1" w:space="0" w:color="CCCCCC"/>
+            </w:tcBorders>
+            <w:shd w:val="clear" w:color="auto" w:fill="FEF9E7"/>
+            <w:tcMar>
+              <w:top w:w="40" w:type="dxa"/>
+              <w:left w:w="90" w:type="dxa"/>
+              <w:bottom w:w="40" w:type="dxa"/>
+              <w:right w:w="90" w:type="dxa"/>
+            </w:tcMar>
+            <w:vAlign w:val="center"/>
+          </w:tcPr>
+          <w:p>
+            <w:pPr>
+              <w:jc w:val="center"/>
+              <w:rPr>
+                <w:rFonts w:ascii="ヒラギノ丸ゴ Pro W4" w:eastAsia="ヒラギノ丸ゴ Pro W4" w:hAnsi="ヒラギノ丸ゴ Pro W4" w:hint="eastAsia"/>
+                <w:b/>
+                <w:bCs/>
+                <w:color w:val="922B21"/>
+                <w:sz w:val="18"/>
+                <w:szCs w:val="18"/>
+              </w:rPr>
+            </w:pPr>
+            <w:r>
+              <w:rPr>
+                <w:rFonts w:ascii="ヒラギノ丸ゴ Pro W4" w:eastAsia="ヒラギノ丸ゴ Pro W4" w:hAnsi="ヒラギノ丸ゴ Pro W4" w:hint="eastAsia"/>
+                <w:b/>
+                <w:bCs/>
+                <w:color w:val="922B21"/>
+                <w:sz w:val="18"/>
+                <w:szCs w:val="18"/>
+              </w:rPr>
+              <w:t xml:space="preserve">補食①</w:t>
+            </w:r>
+          </w:p>
+        </w:tc>
+        <w:tc>
+          <w:tcPr>
+            <w:tcW w:w="2420" w:type="dxa"/>
+            <w:tcBorders>
+              <w:top w:val="single" w:sz="1" w:space="0" w:color="CCCCCC"/>
+              <w:left w:val="single" w:sz="1" w:space="0" w:color="CCCCCC"/>
+              <w:bottom w:val="single" w:sz="1" w:space="0" w:color="CCCCCC"/>
+              <w:right w:val="single" w:sz="1" w:space="0" w:color="CCCCCC"/>
+            </w:tcBorders>
+            <w:shd w:val="clear" w:color="auto" w:fill="FEF9E7"/>
+            <w:tcMar>
+              <w:top w:w="40" w:type="dxa"/>
+              <w:left w:w="90" w:type="dxa"/>
+              <w:bottom w:w="40" w:type="dxa"/>
+              <w:right w:w="90" w:type="dxa"/>
+            </w:tcMar>
+            <w:vAlign w:val="center"/>
+          </w:tcPr>
+          <w:p>
+            <w:pPr>
+              <w:rPr>
+                <w:rFonts w:ascii="ヒラギノ丸ゴ Pro W4" w:eastAsia="ヒラギノ丸ゴ Pro W4" w:hAnsi="ヒラギノ丸ゴ Pro W4" w:hint="eastAsia"/>
+                <w:color w:val="2C3E50"/>
+                <w:sz w:val="17"/>
+                <w:szCs w:val="17"/>
+              </w:rPr>
+            </w:pPr>
+            <w:r>
+              <w:rPr>
+                <w:rFonts w:ascii="ヒラギノ丸ゴ Pro W4" w:eastAsia="ヒラギノ丸ゴ Pro W4" w:hAnsi="ヒラギノ丸ゴ Pro W4" w:hint="eastAsia"/>
+                <w:color w:val="2C3E50"/>
+                <w:sz w:val="17"/>
+                <w:szCs w:val="17"/>
+              </w:rPr>
+              <w:t xml:space="preserve">オレンジジュース200ml、またはバナナ1本</w:t>
+            </w:r>
+          </w:p>
+        </w:tc>
+        <w:tc>
+          <w:tcPr>
+            <w:tcW w:w="1120" w:type="dxa"/>
+            <w:tcBorders>
+              <w:top w:val="single" w:sz="1" w:space="0" w:color="CCCCCC"/>
+              <w:left w:val="single" w:sz="1" w:space="0" w:color="CCCCCC"/>
+              <w:bottom w:val="single" w:sz="1" w:space="0" w:color="CCCCCC"/>
+              <w:right w:val="single" w:sz="1" w:space="0" w:color="CCCCCC"/>
+            </w:tcBorders>
+            <w:shd w:val="clear" w:color="auto" w:fill="FEF9E7"/>
+            <w:tcMar>
+              <w:top w:w="40" w:type="dxa"/>
+              <w:left w:w="90" w:type="dxa"/>
+              <w:bottom w:w="40" w:type="dxa"/>
+              <w:right w:w="90" w:type="dxa"/>
+            </w:tcMar>
+            <w:vAlign w:val="center"/>
+          </w:tcPr>
+          <w:p>
+            <w:pPr>
+              <w:jc w:val="center"/>
+              <w:rPr>
+                <w:rFonts w:ascii="ヒラギノ丸ゴ Pro W4" w:eastAsia="ヒラギノ丸ゴ Pro W4" w:hAnsi="ヒラギノ丸ゴ Pro W4" w:hint="eastAsia"/>
+                <w:b/>
+                <w:bCs/>
+                <w:color w:val="2C3E50"/>
+                <w:sz w:val="17"/>
+                <w:szCs w:val="17"/>
+              </w:rPr>
+            </w:pPr>
+            <w:r>
+              <w:rPr>
+                <w:rFonts w:ascii="ヒラギノ丸ゴ Pro W4" w:eastAsia="ヒラギノ丸ゴ Pro W4" w:hAnsi="ヒラギノ丸ゴ Pro W4" w:hint="eastAsia"/>
+                <w:b/>
+                <w:bCs/>
+                <w:color w:val="2C3E50"/>
+                <w:sz w:val="17"/>
+                <w:szCs w:val="17"/>
+              </w:rPr>
+              <w:t xml:space="preserve">約90kcal</w:t>
+            </w:r>
+          </w:p>
+        </w:tc>
+        <w:tc>
+          <w:tcPr>
+            <w:tcW w:w="880" w:type="dxa"/>
+            <w:tcBorders>
+              <w:top w:val="single" w:sz="1" w:space="0" w:color="CCCCCC"/>
+              <w:left w:val="single" w:sz="1" w:space="0" w:color="CCCCCC"/>
+              <w:bottom w:val="single" w:sz="1" w:space="0" w:color="CCCCCC"/>
+              <w:right w:val="single" w:sz="1" w:space="0" w:color="CCCCCC"/>
+            </w:tcBorders>
+            <w:shd w:val="clear" w:color="auto" w:fill="FEF9E7"/>
+            <w:tcMar>
+              <w:top w:w="40" w:type="dxa"/>
+              <w:left w:w="90" w:type="dxa"/>
+              <w:bottom w:w="40" w:type="dxa"/>
+              <w:right w:w="90" w:type="dxa"/>
+            </w:tcMar>
+            <w:vAlign w:val="center"/>
+          </w:tcPr>
+          <w:p>
+            <w:pPr>
+              <w:jc w:val="center"/>
+              <w:rPr>
+                <w:rFonts w:ascii="ヒラギノ丸ゴ Pro W4" w:eastAsia="ヒラギノ丸ゴ Pro W4" w:hAnsi="ヒラギノ丸ゴ Pro W4" w:hint="eastAsia"/>
+                <w:b/>
+                <w:bCs/>
+                <w:color w:val="922B21"/>
+                <w:sz w:val="17"/>
+                <w:szCs w:val="17"/>
+              </w:rPr>
+            </w:pPr>
+            <w:r>
+              <w:rPr>
+                <w:rFonts w:ascii="ヒラギノ丸ゴ Pro W4" w:eastAsia="ヒラギノ丸ゴ Pro W4" w:hAnsi="ヒラギノ丸ゴ Pro W4" w:hint="eastAsia"/>
+                <w:b/>
+                <w:bCs/>
+                <w:color w:val="922B21"/>
+                <w:sz w:val="17"/>
+                <w:szCs w:val="17"/>
+              </w:rPr>
+              <w:t xml:space="preserve">約21g</w:t>
+            </w:r>
+          </w:p>
+        </w:tc>
+        <w:tc>
+          <w:tcPr>
+            <w:tcW w:w="760" w:type="dxa"/>
+            <w:tcBorders>
+              <w:top w:val="single" w:sz="1" w:space="0" w:color="CCCCCC"/>
+              <w:left w:val="single" w:sz="1" w:space="0" w:color="CCCCCC"/>
+              <w:bottom w:val="single" w:sz="1" w:space="0" w:color="CCCCCC"/>
+              <w:right w:val="single" w:sz="1" w:space="0" w:color="CCCCCC"/>
+            </w:tcBorders>
+            <w:shd w:val="clear" w:color="auto" w:fill="FEF9E7"/>
+            <w:tcMar>
+              <w:top w:w="40" w:type="dxa"/>
+              <w:left w:w="90" w:type="dxa"/>
+              <w:bottom w:w="40" w:type="dxa"/>
+              <w:right w:w="90" w:type="dxa"/>
+            </w:tcMar>
+            <w:vAlign w:val="center"/>
+          </w:tcPr>
+          <w:p>
+            <w:pPr>
+              <w:jc w:val="center"/>
+              <w:rPr>
+                <w:rFonts w:ascii="ヒラギノ丸ゴ Pro W4" w:eastAsia="ヒラギノ丸ゴ Pro W4" w:hAnsi="ヒラギノ丸ゴ Pro W4" w:hint="eastAsia"/>
+                <w:b/>
+                <w:bCs/>
+                <w:color w:val="922B21"/>
+                <w:sz w:val="17"/>
+                <w:szCs w:val="17"/>
+              </w:rPr>
+            </w:pPr>
+            <w:r>
+              <w:rPr>
+                <w:rFonts w:ascii="ヒラギノ丸ゴ Pro W4" w:eastAsia="ヒラギノ丸ゴ Pro W4" w:hAnsi="ヒラギノ丸ゴ Pro W4" w:hint="eastAsia"/>
+                <w:b/>
+                <w:bCs/>
+                <w:color w:val="922B21"/>
+                <w:sz w:val="17"/>
+                <w:szCs w:val="17"/>
+              </w:rPr>
+              <w:t xml:space="preserve">0.3</w:t>
+            </w:r>
+          </w:p>
+        </w:tc>
+        <w:tc>
+          <w:tcPr>
+            <w:tcW w:w="830" w:type="dxa"/>
+            <w:tcBorders>
+              <w:top w:val="single" w:sz="1" w:space="0" w:color="CCCCCC"/>
+              <w:left w:val="single" w:sz="1" w:space="0" w:color="CCCCCC"/>
+              <w:bottom w:val="single" w:sz="1" w:space="0" w:color="CCCCCC"/>
+              <w:right w:val="single" w:sz="1" w:space="0" w:color="CCCCCC"/>
+            </w:tcBorders>
+            <w:shd w:val="clear" w:color="auto" w:fill="FEF9E7"/>
+            <w:tcMar>
+              <w:top w:w="40" w:type="dxa"/>
+              <w:left w:w="90" w:type="dxa"/>
+              <w:bottom w:w="40" w:type="dxa"/>
+              <w:right w:w="90" w:type="dxa"/>
+            </w:tcMar>
+            <w:vAlign w:val="center"/>
+          </w:tcPr>
+          <w:p>
+            <w:pPr>
+              <w:jc w:val="center"/>
+              <w:rPr>
+                <w:rFonts w:ascii="ヒラギノ丸ゴ Pro W4" w:eastAsia="ヒラギノ丸ゴ Pro W4" w:hAnsi="ヒラギノ丸ゴ Pro W4" w:hint="eastAsia"/>
+                <w:b/>
+                <w:bCs/>
+                <w:color w:val="2C3E50"/>
+                <w:sz w:val="17"/>
+                <w:szCs w:val="17"/>
+              </w:rPr>
+            </w:pPr>
+            <w:r>
+              <w:rPr>
+                <w:rFonts w:ascii="ヒラギノ丸ゴ Pro W4" w:eastAsia="ヒラギノ丸ゴ Pro W4" w:hAnsi="ヒラギノ丸ゴ Pro W4" w:hint="eastAsia"/>
+                <w:b/>
+                <w:bCs/>
+                <w:color w:val="2C3E50"/>
+                <w:sz w:val="17"/>
+                <w:szCs w:val="17"/>
+              </w:rPr>
+              <w:t xml:space="preserve">約1g</w:t>
+            </w:r>
+          </w:p>
+        </w:tc>
+        <w:tc>
+          <w:tcPr>
+            <w:tcW w:w="2394" w:type="dxa"/>
+            <w:tcBorders>
+              <w:top w:val="single" w:sz="1" w:space="0" w:color="CCCCCC"/>
+              <w:left w:val="single" w:sz="1" w:space="0" w:color="CCCCCC"/>
+              <w:bottom w:val="single" w:sz="1" w:space="0" w:color="CCCCCC"/>
+              <w:right w:val="single" w:sz="1" w:space="0" w:color="CCCCCC"/>
+            </w:tcBorders>
+            <w:shd w:val="clear" w:color="auto" w:fill="FEF9E7"/>
+            <w:tcMar>
+              <w:top w:w="40" w:type="dxa"/>
+              <w:left w:w="90" w:type="dxa"/>
+              <w:bottom w:w="40" w:type="dxa"/>
+              <w:right w:w="90" w:type="dxa"/>
+            </w:tcMar>
+            <w:vAlign w:val="center"/>
+          </w:tcPr>
+          <w:p>
+            <w:pPr>
+              <w:rPr>
+                <w:rFonts w:ascii="ヒラギノ丸ゴ Pro W4" w:eastAsia="ヒラギノ丸ゴ Pro W4" w:hAnsi="ヒラギノ丸ゴ Pro W4" w:hint="eastAsia"/>
+                <w:color w:val="5D6D7E"/>
+                <w:sz w:val="16"/>
+                <w:szCs w:val="16"/>
+              </w:rPr>
+            </w:pPr>
+            <w:r>
+              <w:rPr>
+                <w:rFonts w:ascii="ヒラギノ丸ゴ Pro W4" w:eastAsia="ヒラギノ丸ゴ Pro W4" w:hAnsi="ヒラギノ丸ゴ Pro W4" w:hint="eastAsia"/>
+                <w:color w:val="5D6D7E"/>
+                <w:sz w:val="16"/>
+                <w:szCs w:val="16"/>
+              </w:rPr>
+              <w:t xml:space="preserve">カステラ1切れ：約155kcal／31g（0.5g/kg）／4g</w:t>
+            </w:r>
+          </w:p>
+        </w:tc>
+      </w:tr>
+      <w:tr>
+        <w:trPr>
+          <w:cantSplit/>
+        </w:trPr>
+        <w:tc>
+          <w:tcPr>
+            <w:tcW w:w="780" w:type="dxa"/>
+            <w:tcBorders>
+              <w:top w:val="single" w:sz="1" w:space="0" w:color="CCCCCC"/>
+              <w:left w:val="single" w:sz="1" w:space="0" w:color="CCCCCC"/>
+              <w:bottom w:val="single" w:sz="1" w:space="0" w:color="CCCCCC"/>
+              <w:right w:val="single" w:sz="1" w:space="0" w:color="CCCCCC"/>
+            </w:tcBorders>
+            <w:shd w:val="clear" w:color="auto" w:fill="FEF9E7"/>
+            <w:tcMar>
+              <w:top w:w="40" w:type="dxa"/>
+              <w:left w:w="90" w:type="dxa"/>
+              <w:bottom w:w="40" w:type="dxa"/>
+              <w:right w:w="90" w:type="dxa"/>
+            </w:tcMar>
+            <w:vAlign w:val="center"/>
+          </w:tcPr>
+          <w:p>
+            <w:pPr>
+              <w:jc w:val="center"/>
+              <w:rPr>
+                <w:rFonts w:ascii="ヒラギノ丸ゴ Pro W4" w:eastAsia="ヒラギノ丸ゴ Pro W4" w:hAnsi="ヒラギノ丸ゴ Pro W4" w:hint="eastAsia"/>
+                <w:color w:val="2C3E50"/>
+                <w:sz w:val="17"/>
+                <w:szCs w:val="17"/>
+              </w:rPr>
+            </w:pPr>
+            <w:r>
+              <w:rPr>
+                <w:rFonts w:ascii="ヒラギノ丸ゴ Pro W4" w:eastAsia="ヒラギノ丸ゴ Pro W4" w:hAnsi="ヒラギノ丸ゴ Pro W4" w:hint="eastAsia"/>
+                <w:color w:val="2C3E50"/>
+                <w:sz w:val="17"/>
+                <w:szCs w:val="17"/>
+              </w:rPr>
+              <w:t xml:space="preserve">8:45〜</w:t>
+            </w:r>
+          </w:p>
+        </w:tc>
+        <w:tc>
+          <w:tcPr>
+            <w:tcW w:w="880" w:type="dxa"/>
+            <w:tcBorders>
+              <w:top w:val="single" w:sz="1" w:space="0" w:color="CCCCCC"/>
+              <w:left w:val="single" w:sz="1" w:space="0" w:color="CCCCCC"/>
+              <w:bottom w:val="single" w:sz="1" w:space="0" w:color="CCCCCC"/>
+              <w:right w:val="single" w:sz="1" w:space="0" w:color="CCCCCC"/>
+            </w:tcBorders>
+            <w:shd w:val="clear" w:color="auto" w:fill="FEF9E7"/>
+            <w:tcMar>
+              <w:top w:w="40" w:type="dxa"/>
+              <w:left w:w="90" w:type="dxa"/>
+              <w:bottom w:w="40" w:type="dxa"/>
+              <w:right w:w="90" w:type="dxa"/>
+            </w:tcMar>
+            <w:vAlign w:val="center"/>
+          </w:tcPr>
+          <w:p>
+            <w:pPr>
+              <w:jc w:val="center"/>
+              <w:rPr>
+                <w:rFonts w:ascii="ヒラギノ丸ゴ Pro W4" w:eastAsia="ヒラギノ丸ゴ Pro W4" w:hAnsi="ヒラギノ丸ゴ Pro W4" w:hint="eastAsia"/>
+                <w:b/>
+                <w:bCs/>
+                <w:color w:val="922B21"/>
+                <w:sz w:val="18"/>
+                <w:szCs w:val="18"/>
+              </w:rPr>
+            </w:pPr>
+            <w:r>
+              <w:rPr>
+                <w:rFonts w:ascii="ヒラギノ丸ゴ Pro W4" w:eastAsia="ヒラギノ丸ゴ Pro W4" w:hAnsi="ヒラギノ丸ゴ Pro W4" w:hint="eastAsia"/>
+                <w:b/>
+                <w:bCs/>
+                <w:color w:val="922B21"/>
+                <w:sz w:val="18"/>
+                <w:szCs w:val="18"/>
+              </w:rPr>
+              <w:t xml:space="preserve">任意補食</w:t>
+            </w:r>
+          </w:p>
+        </w:tc>
+        <w:tc>
+          <w:tcPr>
+            <w:tcW w:w="2420" w:type="dxa"/>
+            <w:tcBorders>
+              <w:top w:val="single" w:sz="1" w:space="0" w:color="CCCCCC"/>
+              <w:left w:val="single" w:sz="1" w:space="0" w:color="CCCCCC"/>
+              <w:bottom w:val="single" w:sz="1" w:space="0" w:color="CCCCCC"/>
+              <w:right w:val="single" w:sz="1" w:space="0" w:color="CCCCCC"/>
+            </w:tcBorders>
+            <w:shd w:val="clear" w:color="auto" w:fill="FEF9E7"/>
+            <w:tcMar>
+              <w:top w:w="40" w:type="dxa"/>
+              <w:left w:w="90" w:type="dxa"/>
+              <w:bottom w:w="40" w:type="dxa"/>
+              <w:right w:w="90" w:type="dxa"/>
+            </w:tcMar>
+            <w:vAlign w:val="center"/>
+          </w:tcPr>
+          <w:p>
+            <w:pPr>
+              <w:rPr>
+                <w:rFonts w:ascii="ヒラギノ丸ゴ Pro W4" w:eastAsia="ヒラギノ丸ゴ Pro W4" w:hAnsi="ヒラギノ丸ゴ Pro W4" w:hint="eastAsia"/>
+                <w:color w:val="2C3E50"/>
+                <w:sz w:val="17"/>
+                <w:szCs w:val="17"/>
+              </w:rPr>
+            </w:pPr>
+            <w:r>
+              <w:rPr>
+                <w:rFonts w:ascii="ヒラギノ丸ゴ Pro W4" w:eastAsia="ヒラギノ丸ゴ Pro W4" w:hAnsi="ヒラギノ丸ゴ Pro W4" w:hint="eastAsia"/>
+                <w:color w:val="2C3E50"/>
+                <w:sz w:val="17"/>
+                <w:szCs w:val="17"/>
+              </w:rPr>
+              <w:t xml:space="preserve">スポーツドリンク150ml</w:t>
+            </w:r>
+          </w:p>
+        </w:tc>
+        <w:tc>
+          <w:tcPr>
+            <w:tcW w:w="1120" w:type="dxa"/>
+            <w:tcBorders>
+              <w:top w:val="single" w:sz="1" w:space="0" w:color="CCCCCC"/>
+              <w:left w:val="single" w:sz="1" w:space="0" w:color="CCCCCC"/>
+              <w:bottom w:val="single" w:sz="1" w:space="0" w:color="CCCCCC"/>
+              <w:right w:val="single" w:sz="1" w:space="0" w:color="CCCCCC"/>
+            </w:tcBorders>
+            <w:shd w:val="clear" w:color="auto" w:fill="FEF9E7"/>
+            <w:tcMar>
+              <w:top w:w="40" w:type="dxa"/>
+              <w:left w:w="90" w:type="dxa"/>
+              <w:bottom w:w="40" w:type="dxa"/>
+              <w:right w:w="90" w:type="dxa"/>
+            </w:tcMar>
+            <w:vAlign w:val="center"/>
+          </w:tcPr>
+          <w:p>
+            <w:pPr>
+              <w:jc w:val="center"/>
+              <w:rPr>
+                <w:rFonts w:ascii="ヒラギノ丸ゴ Pro W4" w:eastAsia="ヒラギノ丸ゴ Pro W4" w:hAnsi="ヒラギノ丸ゴ Pro W4" w:hint="eastAsia"/>
+                <w:b/>
+                <w:bCs/>
+                <w:color w:val="2C3E50"/>
+                <w:sz w:val="17"/>
+                <w:szCs w:val="17"/>
+              </w:rPr>
+            </w:pPr>
+            <w:r>
+              <w:rPr>
+                <w:rFonts w:ascii="ヒラギノ丸ゴ Pro W4" w:eastAsia="ヒラギノ丸ゴ Pro W4" w:hAnsi="ヒラギノ丸ゴ Pro W4" w:hint="eastAsia"/>
+                <w:b/>
+                <w:bCs/>
+                <w:color w:val="2C3E50"/>
+                <w:sz w:val="17"/>
+                <w:szCs w:val="17"/>
+              </w:rPr>
+              <w:t xml:space="preserve">約40kcal</w:t>
+            </w:r>
+          </w:p>
+        </w:tc>
+        <w:tc>
+          <w:tcPr>
+            <w:tcW w:w="880" w:type="dxa"/>
+            <w:tcBorders>
+              <w:top w:val="single" w:sz="1" w:space="0" w:color="CCCCCC"/>
+              <w:left w:val="single" w:sz="1" w:space="0" w:color="CCCCCC"/>
+              <w:bottom w:val="single" w:sz="1" w:space="0" w:color="CCCCCC"/>
+              <w:right w:val="single" w:sz="1" w:space="0" w:color="CCCCCC"/>
+            </w:tcBorders>
+            <w:shd w:val="clear" w:color="auto" w:fill="FEF9E7"/>
+            <w:tcMar>
+              <w:top w:w="40" w:type="dxa"/>
+              <w:left w:w="90" w:type="dxa"/>
+              <w:bottom w:w="40" w:type="dxa"/>
+              <w:right w:w="90" w:type="dxa"/>
+            </w:tcMar>
+            <w:vAlign w:val="center"/>
+          </w:tcPr>
+          <w:p>
+            <w:pPr>
+              <w:jc w:val="center"/>
+              <w:rPr>
+                <w:rFonts w:ascii="ヒラギノ丸ゴ Pro W4" w:eastAsia="ヒラギノ丸ゴ Pro W4" w:hAnsi="ヒラギノ丸ゴ Pro W4" w:hint="eastAsia"/>
+                <w:b/>
+                <w:bCs/>
+                <w:color w:val="922B21"/>
+                <w:sz w:val="17"/>
+                <w:szCs w:val="17"/>
+              </w:rPr>
+            </w:pPr>
+            <w:r>
+              <w:rPr>
+                <w:rFonts w:ascii="ヒラギノ丸ゴ Pro W4" w:eastAsia="ヒラギノ丸ゴ Pro W4" w:hAnsi="ヒラギノ丸ゴ Pro W4" w:hint="eastAsia"/>
+                <w:b/>
+                <w:bCs/>
+                <w:color w:val="922B21"/>
+                <w:sz w:val="17"/>
+                <w:szCs w:val="17"/>
+              </w:rPr>
+              <w:t xml:space="preserve">約10g</w:t>
+            </w:r>
+          </w:p>
+        </w:tc>
+        <w:tc>
+          <w:tcPr>
+            <w:tcW w:w="760" w:type="dxa"/>
+            <w:tcBorders>
+              <w:top w:val="single" w:sz="1" w:space="0" w:color="CCCCCC"/>
+              <w:left w:val="single" w:sz="1" w:space="0" w:color="CCCCCC"/>
+              <w:bottom w:val="single" w:sz="1" w:space="0" w:color="CCCCCC"/>
+              <w:right w:val="single" w:sz="1" w:space="0" w:color="CCCCCC"/>
+            </w:tcBorders>
+            <w:shd w:val="clear" w:color="auto" w:fill="FEF9E7"/>
+            <w:tcMar>
+              <w:top w:w="40" w:type="dxa"/>
+              <w:left w:w="90" w:type="dxa"/>
+              <w:bottom w:w="40" w:type="dxa"/>
+              <w:right w:w="90" w:type="dxa"/>
+            </w:tcMar>
+            <w:vAlign w:val="center"/>
+          </w:tcPr>
+          <w:p>
+            <w:pPr>
+              <w:jc w:val="center"/>
+              <w:rPr>
+                <w:rFonts w:ascii="ヒラギノ丸ゴ Pro W4" w:eastAsia="ヒラギノ丸ゴ Pro W4" w:hAnsi="ヒラギノ丸ゴ Pro W4" w:hint="eastAsia"/>
+                <w:b/>
+                <w:bCs/>
+                <w:color w:val="922B21"/>
+                <w:sz w:val="17"/>
+                <w:szCs w:val="17"/>
+              </w:rPr>
+            </w:pPr>
+            <w:r>
+              <w:rPr>
+                <w:rFonts w:ascii="ヒラギノ丸ゴ Pro W4" w:eastAsia="ヒラギノ丸ゴ Pro W4" w:hAnsi="ヒラギノ丸ゴ Pro W4" w:hint="eastAsia"/>
+                <w:b/>
+                <w:bCs/>
+                <w:color w:val="922B21"/>
+                <w:sz w:val="17"/>
+                <w:szCs w:val="17"/>
+              </w:rPr>
+              <w:t xml:space="preserve">0.2</w:t>
+            </w:r>
+          </w:p>
+        </w:tc>
+        <w:tc>
+          <w:tcPr>
+            <w:tcW w:w="830" w:type="dxa"/>
+            <w:tcBorders>
+              <w:top w:val="single" w:sz="1" w:space="0" w:color="CCCCCC"/>
+              <w:left w:val="single" w:sz="1" w:space="0" w:color="CCCCCC"/>
+              <w:bottom w:val="single" w:sz="1" w:space="0" w:color="CCCCCC"/>
+              <w:right w:val="single" w:sz="1" w:space="0" w:color="CCCCCC"/>
+            </w:tcBorders>
+            <w:shd w:val="clear" w:color="auto" w:fill="FEF9E7"/>
+            <w:tcMar>
+              <w:top w:w="40" w:type="dxa"/>
+              <w:left w:w="90" w:type="dxa"/>
+              <w:bottom w:w="40" w:type="dxa"/>
+              <w:right w:w="90" w:type="dxa"/>
+            </w:tcMar>
+            <w:vAlign w:val="center"/>
+          </w:tcPr>
+          <w:p>
+            <w:pPr>
+              <w:jc w:val="center"/>
+              <w:rPr>
+                <w:rFonts w:ascii="ヒラギノ丸ゴ Pro W4" w:eastAsia="ヒラギノ丸ゴ Pro W4" w:hAnsi="ヒラギノ丸ゴ Pro W4" w:hint="eastAsia"/>
+                <w:b/>
+                <w:bCs/>
+                <w:color w:val="2C3E50"/>
+                <w:sz w:val="17"/>
+                <w:szCs w:val="17"/>
+              </w:rPr>
+            </w:pPr>
+            <w:r>
+              <w:rPr>
+                <w:rFonts w:ascii="ヒラギノ丸ゴ Pro W4" w:eastAsia="ヒラギノ丸ゴ Pro W4" w:hAnsi="ヒラギノ丸ゴ Pro W4" w:hint="eastAsia"/>
+                <w:b/>
+                <w:bCs/>
+                <w:color w:val="2C3E50"/>
+                <w:sz w:val="17"/>
+                <w:szCs w:val="17"/>
+              </w:rPr>
+              <w:t xml:space="preserve">0g</w:t>
+            </w:r>
+          </w:p>
+        </w:tc>
+        <w:tc>
+          <w:tcPr>
+            <w:tcW w:w="2394" w:type="dxa"/>
+            <w:tcBorders>
+              <w:top w:val="single" w:sz="1" w:space="0" w:color="CCCCCC"/>
+              <w:left w:val="single" w:sz="1" w:space="0" w:color="CCCCCC"/>
+              <w:bottom w:val="single" w:sz="1" w:space="0" w:color="CCCCCC"/>
+              <w:right w:val="single" w:sz="1" w:space="0" w:color="CCCCCC"/>
+            </w:tcBorders>
+            <w:shd w:val="clear" w:color="auto" w:fill="FEF9E7"/>
+            <w:tcMar>
+              <w:top w:w="40" w:type="dxa"/>
+              <w:left w:w="90" w:type="dxa"/>
+              <w:bottom w:w="40" w:type="dxa"/>
+              <w:right w:w="90" w:type="dxa"/>
+            </w:tcMar>
+            <w:vAlign w:val="center"/>
+          </w:tcPr>
+          <w:p>
+            <w:pPr>
+              <w:rPr>
+                <w:rFonts w:ascii="ヒラギノ丸ゴ Pro W4" w:eastAsia="ヒラギノ丸ゴ Pro W4" w:hAnsi="ヒラギノ丸ゴ Pro W4" w:hint="eastAsia"/>
+                <w:color w:val="5D6D7E"/>
+                <w:sz w:val="16"/>
+                <w:szCs w:val="16"/>
+              </w:rPr>
+            </w:pPr>
+            <w:r>
+              <w:rPr>
+                <w:rFonts w:ascii="ヒラギノ丸ゴ Pro W4" w:eastAsia="ヒラギノ丸ゴ Pro W4" w:hAnsi="ヒラギノ丸ゴ Pro W4" w:hint="eastAsia"/>
+                <w:color w:val="5D6D7E"/>
+                <w:sz w:val="16"/>
+                <w:szCs w:val="16"/>
+              </w:rPr>
+              <w:t xml:space="preserve">ワンハンド羊羹1本：約110kcal／27g（0.4g/kg）／1g</w:t>
+            </w:r>
+          </w:p>
+        </w:tc>
+      </w:tr>
+      <w:tr>
+        <w:trPr>
+          <w:cantSplit/>
+        </w:trPr>
+        <w:tc>
+          <w:tcPr>
+            <w:tcW w:w="4080" w:type="dxa"/>
+            <w:gridSpan w:val="3"/>
+            <w:tcBorders>
+              <w:top w:val="single" w:sz="1" w:space="0" w:color="CCCCCC"/>
+              <w:left w:val="single" w:sz="1" w:space="0" w:color="CCCCCC"/>
+              <w:bottom w:val="single" w:sz="1" w:space="0" w:color="CCCCCC"/>
+              <w:right w:val="single" w:sz="1" w:space="0" w:color="CCCCCC"/>
+            </w:tcBorders>
+            <w:shd w:val="clear" w:color="auto" w:fill="FDEDEC"/>
+            <w:tcMar>
+              <w:top w:w="40" w:type="dxa"/>
+              <w:left w:w="90" w:type="dxa"/>
+              <w:bottom w:w="40" w:type="dxa"/>
+              <w:right w:w="90" w:type="dxa"/>
+            </w:tcMar>
+            <w:vAlign w:val="center"/>
+          </w:tcPr>
+          <w:p>
+            <w:pPr>
+              <w:jc w:val="center"/>
+              <w:rPr>
+                <w:rFonts w:ascii="ヒラギノ丸ゴ Pro W4" w:eastAsia="ヒラギノ丸ゴ Pro W4" w:hAnsi="ヒラギノ丸ゴ Pro W4" w:hint="eastAsia"/>
+                <w:b/>
+                <w:bCs/>
+                <w:color w:val="922B21"/>
+                <w:sz w:val="18"/>
+                <w:szCs w:val="18"/>
+              </w:rPr>
+            </w:pPr>
+            <w:r>
+              <w:rPr>
+                <w:rFonts w:ascii="ヒラギノ丸ゴ Pro W4" w:eastAsia="ヒラギノ丸ゴ Pro W4" w:hAnsi="ヒラギノ丸ゴ Pro W4" w:hint="eastAsia"/>
+                <w:b/>
+                <w:bCs/>
+                <w:color w:val="922B21"/>
+                <w:sz w:val="18"/>
+                <w:szCs w:val="18"/>
+              </w:rPr>
+              <w:t xml:space="preserve">当日合計（レースまで）</w:t>
+            </w:r>
+          </w:p>
+        </w:tc>
+        <w:tc>
+          <w:tcPr>
+            <w:tcW w:w="1120" w:type="dxa"/>
+            <w:tcBorders>
+              <w:top w:val="single" w:sz="1" w:space="0" w:color="CCCCCC"/>
+              <w:left w:val="single" w:sz="1" w:space="0" w:color="CCCCCC"/>
+              <w:bottom w:val="single" w:sz="1" w:space="0" w:color="CCCCCC"/>
+              <w:right w:val="single" w:sz="1" w:space="0" w:color="CCCCCC"/>
+            </w:tcBorders>
+            <w:shd w:val="clear" w:color="auto" w:fill="FDEDEC"/>
+            <w:tcMar>
+              <w:top w:w="40" w:type="dxa"/>
+              <w:left w:w="90" w:type="dxa"/>
+              <w:bottom w:w="40" w:type="dxa"/>
+              <w:right w:w="90" w:type="dxa"/>
+            </w:tcMar>
+            <w:vAlign w:val="center"/>
+          </w:tcPr>
+          <w:p>
+            <w:pPr>
+              <w:jc w:val="center"/>
+              <w:rPr>
+                <w:rFonts w:ascii="ヒラギノ丸ゴ Pro W4" w:eastAsia="ヒラギノ丸ゴ Pro W4" w:hAnsi="ヒラギノ丸ゴ Pro W4" w:hint="eastAsia"/>
+                <w:b/>
+                <w:bCs/>
+                <w:color w:val="2C3E50"/>
+                <w:sz w:val="17"/>
+                <w:szCs w:val="17"/>
+              </w:rPr>
+            </w:pPr>
+            <w:r>
+              <w:rPr>
+                <w:rFonts w:ascii="ヒラギノ丸ゴ Pro W4" w:eastAsia="ヒラギノ丸ゴ Pro W4" w:hAnsi="ヒラギノ丸ゴ Pro W4" w:hint="eastAsia"/>
+                <w:b/>
+                <w:bCs/>
+                <w:color w:val="2C3E50"/>
+                <w:sz w:val="17"/>
+                <w:szCs w:val="17"/>
+              </w:rPr>
+              <w:t xml:space="preserve">約470kcal</w:t>
+            </w:r>
+          </w:p>
+        </w:tc>
+        <w:tc>
+          <w:tcPr>
+            <w:tcW w:w="880" w:type="dxa"/>
+            <w:tcBorders>
+              <w:top w:val="single" w:sz="1" w:space="0" w:color="CCCCCC"/>
+              <w:left w:val="single" w:sz="1" w:space="0" w:color="CCCCCC"/>
+              <w:bottom w:val="single" w:sz="1" w:space="0" w:color="CCCCCC"/>
+              <w:right w:val="single" w:sz="1" w:space="0" w:color="CCCCCC"/>
+            </w:tcBorders>
+            <w:shd w:val="clear" w:color="auto" w:fill="FDEDEC"/>
+            <w:tcMar>
+              <w:top w:w="40" w:type="dxa"/>
+              <w:left w:w="90" w:type="dxa"/>
+              <w:bottom w:w="40" w:type="dxa"/>
+              <w:right w:w="90" w:type="dxa"/>
+            </w:tcMar>
+            <w:vAlign w:val="center"/>
+          </w:tcPr>
+          <w:p>
+            <w:pPr>
+              <w:jc w:val="center"/>
+              <w:rPr>
+                <w:rFonts w:ascii="ヒラギノ丸ゴ Pro W4" w:eastAsia="ヒラギノ丸ゴ Pro W4" w:hAnsi="ヒラギノ丸ゴ Pro W4" w:hint="eastAsia"/>
+                <w:b/>
+                <w:bCs/>
+                <w:color w:val="922B21"/>
+                <w:sz w:val="17"/>
+                <w:szCs w:val="17"/>
+              </w:rPr>
+            </w:pPr>
+            <w:r>
+              <w:rPr>
+                <w:rFonts w:ascii="ヒラギノ丸ゴ Pro W4" w:eastAsia="ヒラギノ丸ゴ Pro W4" w:hAnsi="ヒラギノ丸ゴ Pro W4" w:hint="eastAsia"/>
+                <w:b/>
+                <w:bCs/>
+                <w:color w:val="922B21"/>
+                <w:sz w:val="17"/>
+                <w:szCs w:val="17"/>
+              </w:rPr>
+              <w:t xml:space="preserve">約100g</w:t>
+            </w:r>
+          </w:p>
+        </w:tc>
+        <w:tc>
+          <w:tcPr>
+            <w:tcW w:w="760" w:type="dxa"/>
+            <w:tcBorders>
+              <w:top w:val="single" w:sz="1" w:space="0" w:color="CCCCCC"/>
+              <w:left w:val="single" w:sz="1" w:space="0" w:color="CCCCCC"/>
+              <w:bottom w:val="single" w:sz="1" w:space="0" w:color="CCCCCC"/>
+              <w:right w:val="single" w:sz="1" w:space="0" w:color="CCCCCC"/>
+            </w:tcBorders>
+            <w:shd w:val="clear" w:color="auto" w:fill="FDEDEC"/>
+            <w:tcMar>
+              <w:top w:w="40" w:type="dxa"/>
+              <w:left w:w="90" w:type="dxa"/>
+              <w:bottom w:w="40" w:type="dxa"/>
+              <w:right w:w="90" w:type="dxa"/>
+            </w:tcMar>
+            <w:vAlign w:val="center"/>
+          </w:tcPr>
+          <w:p>
+            <w:pPr>
+              <w:jc w:val="center"/>
+              <w:rPr>
+                <w:rFonts w:ascii="ヒラギノ丸ゴ Pro W4" w:eastAsia="ヒラギノ丸ゴ Pro W4" w:hAnsi="ヒラギノ丸ゴ Pro W4" w:hint="eastAsia"/>
+                <w:b/>
+                <w:bCs/>
+                <w:color w:val="922B21"/>
+                <w:sz w:val="17"/>
+                <w:szCs w:val="17"/>
+              </w:rPr>
+            </w:pPr>
+            <w:r>
+              <w:rPr>
+                <w:rFonts w:ascii="ヒラギノ丸ゴ Pro W4" w:eastAsia="ヒラギノ丸ゴ Pro W4" w:hAnsi="ヒラギノ丸ゴ Pro W4" w:hint="eastAsia"/>
+                <w:b/>
+                <w:bCs/>
+                <w:color w:val="922B21"/>
+                <w:sz w:val="17"/>
+                <w:szCs w:val="17"/>
+              </w:rPr>
+              <w:t xml:space="preserve">1.7</w:t>
+            </w:r>
+          </w:p>
+        </w:tc>
+        <w:tc>
+          <w:tcPr>
+            <w:tcW w:w="830" w:type="dxa"/>
+            <w:tcBorders>
+              <w:top w:val="single" w:sz="1" w:space="0" w:color="CCCCCC"/>
+              <w:left w:val="single" w:sz="1" w:space="0" w:color="CCCCCC"/>
+              <w:bottom w:val="single" w:sz="1" w:space="0" w:color="CCCCCC"/>
+              <w:right w:val="single" w:sz="1" w:space="0" w:color="CCCCCC"/>
+            </w:tcBorders>
+            <w:shd w:val="clear" w:color="auto" w:fill="FDEDEC"/>
+            <w:tcMar>
+              <w:top w:w="40" w:type="dxa"/>
+              <w:left w:w="90" w:type="dxa"/>
+              <w:bottom w:w="40" w:type="dxa"/>
+              <w:right w:w="90" w:type="dxa"/>
+            </w:tcMar>
+            <w:vAlign w:val="center"/>
+          </w:tcPr>
+          <w:p>
+            <w:pPr>
+              <w:jc w:val="center"/>
+              <w:rPr>
+                <w:rFonts w:ascii="ヒラギノ丸ゴ Pro W4" w:eastAsia="ヒラギノ丸ゴ Pro W4" w:hAnsi="ヒラギノ丸ゴ Pro W4" w:hint="eastAsia"/>
+                <w:b/>
+                <w:bCs/>
+                <w:color w:val="2C3E50"/>
+                <w:sz w:val="17"/>
+                <w:szCs w:val="17"/>
+              </w:rPr>
+            </w:pPr>
+            <w:r>
+              <w:rPr>
+                <w:rFonts w:ascii="ヒラギノ丸ゴ Pro W4" w:eastAsia="ヒラギノ丸ゴ Pro W4" w:hAnsi="ヒラギノ丸ゴ Pro W4" w:hint="eastAsia"/>
+                <w:b/>
+                <w:bCs/>
+                <w:color w:val="2C3E50"/>
+                <w:sz w:val="17"/>
+                <w:szCs w:val="17"/>
+              </w:rPr>
+              <w:t xml:space="preserve">約9g</w:t>
+            </w:r>
+          </w:p>
+        </w:tc>
+        <w:tc>
+          <w:tcPr>
+            <w:tcW w:w="2394" w:type="dxa"/>
+            <w:tcBorders>
+              <w:top w:val="single" w:sz="1" w:space="0" w:color="CCCCCC"/>
+              <w:left w:val="single" w:sz="1" w:space="0" w:color="CCCCCC"/>
+              <w:bottom w:val="single" w:sz="1" w:space="0" w:color="CCCCCC"/>
+              <w:right w:val="single" w:sz="1" w:space="0" w:color="CCCCCC"/>
+            </w:tcBorders>
+            <w:shd w:val="clear" w:color="auto" w:fill="FDEDEC"/>
+            <w:tcMar>
+              <w:top w:w="40" w:type="dxa"/>
+              <w:left w:w="90" w:type="dxa"/>
+              <w:bottom w:w="40" w:type="dxa"/>
+              <w:right w:w="90" w:type="dxa"/>
+            </w:tcMar>
+            <w:vAlign w:val="center"/>
+          </w:tcPr>
+          <w:p>
+            <w:pPr>
+              <w:rPr>
+                <w:rFonts w:ascii="ヒラギノ丸ゴ Pro W4" w:eastAsia="ヒラギノ丸ゴ Pro W4" w:hAnsi="ヒラギノ丸ゴ Pro W4" w:hint="eastAsia"/>
+                <w:color w:val="5D6D7E"/>
+                <w:sz w:val="16"/>
+                <w:szCs w:val="16"/>
+              </w:rPr>
+            </w:pPr>
+            <w:r>
+              <w:rPr>
+                <w:rFonts w:ascii="ヒラギノ丸ゴ Pro W4" w:eastAsia="ヒラギノ丸ゴ Pro W4" w:hAnsi="ヒラギノ丸ゴ Pro W4" w:hint="eastAsia"/>
+                <w:color w:val="5D6D7E"/>
+                <w:sz w:val="16"/>
+                <w:szCs w:val="16"/>
+              </w:rPr>
+              <w:t xml:space="preserve">朝食に追加した場合：約120g（2.0g/kg）程度</w:t>
+            </w:r>
+          </w:p>
+        </w:tc>
+      </w:tr>
+    </w:tbl>
+    <w:p>
+      <w:pPr>
+        <w:spacing w:before="100" w:after="40"/>
+        <w:rPr>
+          <w:rFonts w:ascii="ヒラギノ丸ゴ Pro W4" w:eastAsia="ヒラギノ丸ゴ Pro W4" w:hAnsi="ヒラギノ丸ゴ Pro W4" w:hint="eastAsia"/>
+          <w:b/>
+          <w:bCs/>
+          <w:color w:val="1A5276"/>
+          <w:sz w:val="19"/>
+          <w:szCs w:val="19"/>
+        </w:rPr>
+      </w:pPr>
+      <w:r>
+        <w:rPr>
+          <w:rFonts w:ascii="ヒラギノ丸ゴ Pro W4" w:eastAsia="ヒラギノ丸ゴ Pro W4" w:hAnsi="ヒラギノ丸ゴ Pro W4" w:hint="eastAsia"/>
+          <w:b/>
+          <w:bCs/>
+          <w:color w:val="1A5276"/>
+          <w:sz w:val="19"/>
+          <w:szCs w:val="19"/>
+        </w:rPr>
+        <w:t xml:space="preserve">ポイント</w:t>
+      </w:r>
+    </w:p>
+    <w:p>
+      <w:pPr>
+        <w:spacing w:before="0" w:after="20"/>
+        <w:rPr>
+          <w:rFonts w:ascii="ヒラギノ丸ゴ Pro W4" w:eastAsia="ヒラギノ丸ゴ Pro W4" w:hAnsi="ヒラギノ丸ゴ Pro W4" w:hint="eastAsia"/>
+          <w:color w:val="2C3E50"/>
+          <w:sz w:val="17"/>
+          <w:szCs w:val="17"/>
+        </w:rPr>
+      </w:pPr>
+      <w:r>
+        <w:rPr>
+          <w:rFonts w:ascii="ヒラギノ丸ゴ Pro W4" w:eastAsia="ヒラギノ丸ゴ Pro W4" w:hAnsi="ヒラギノ丸ゴ Pro W4" w:hint="eastAsia"/>
+          <w:color w:val="2C3E50"/>
+          <w:sz w:val="17"/>
+          <w:szCs w:val="17"/>
+        </w:rPr>
+        <w:t xml:space="preserve">・前日の糖質は約480g（7.9g/kg）で目標の8g/kgとほぼ同じ。3食（各2.1〜2.2g/kg）を軸に補食で上乗せしています。</w:t>
+      </w:r>
+    </w:p>
+    <w:p>
+      <w:pPr>
+        <w:spacing w:before="0" w:after="20"/>
+        <w:rPr>
+          <w:rFonts w:ascii="ヒラギノ丸ゴ Pro W4" w:eastAsia="ヒラギノ丸ゴ Pro W4" w:hAnsi="ヒラギノ丸ゴ Pro W4" w:hint="eastAsia"/>
+          <w:color w:val="2C3E50"/>
+          <w:sz w:val="17"/>
+          <w:szCs w:val="17"/>
+        </w:rPr>
+      </w:pPr>
+      <w:r>
+        <w:rPr>
+          <w:rFonts w:ascii="ヒラギノ丸ゴ Pro W4" w:eastAsia="ヒラギノ丸ゴ Pro W4" w:hAnsi="ヒラギノ丸ゴ Pro W4" w:hint="eastAsia"/>
+          <w:color w:val="2C3E50"/>
+          <w:sz w:val="17"/>
+          <w:szCs w:val="17"/>
+        </w:rPr>
+        <w:t xml:space="preserve">・前日のたんぱく質は約88g（約1.4g/kg）で、糖質を優先する日としては十分。増やすなら朝食に納豆か温泉卵（約＋7g）。</w:t>
+      </w:r>
+    </w:p>
+    <w:p>
+      <w:pPr>
+        <w:spacing w:before="0" w:after="20"/>
+        <w:rPr>
+          <w:rFonts w:ascii="ヒラギノ丸ゴ Pro W4" w:eastAsia="ヒラギノ丸ゴ Pro W4" w:hAnsi="ヒラギノ丸ゴ Pro W4" w:hint="eastAsia"/>
+          <w:color w:val="2C3E50"/>
+          <w:sz w:val="17"/>
+          <w:szCs w:val="17"/>
+        </w:rPr>
+      </w:pPr>
+      <w:r>
+        <w:rPr>
+          <w:rFonts w:ascii="ヒラギノ丸ゴ Pro W4" w:eastAsia="ヒラギノ丸ゴ Pro W4" w:hAnsi="ヒラギノ丸ゴ Pro W4" w:hint="eastAsia"/>
+          <w:color w:val="2C3E50"/>
+          <w:sz w:val="17"/>
+          <w:szCs w:val="17"/>
+        </w:rPr>
+        <w:t xml:space="preserve">・前日のエネルギーは約2,640kcal（約43kcal/kg）。普段より大幅に多ければ補食③を省くなどで調整。</w:t>
+      </w:r>
+    </w:p>
+    <w:p>
+      <w:pPr>
+        <w:spacing w:before="0" w:after="20"/>
+        <w:rPr>
+          <w:rFonts w:ascii="ヒラギノ丸ゴ Pro W4" w:eastAsia="ヒラギノ丸ゴ Pro W4" w:hAnsi="ヒラギノ丸ゴ Pro W4" w:hint="eastAsia"/>
+          <w:color w:val="2C3E50"/>
+          <w:sz w:val="17"/>
+          <w:szCs w:val="17"/>
+        </w:rPr>
+      </w:pPr>
+      <w:r>
+        <w:rPr>
+          <w:rFonts w:ascii="ヒラギノ丸ゴ Pro W4" w:eastAsia="ヒラギノ丸ゴ Pro W4" w:hAnsi="ヒラギノ丸ゴ Pro W4" w:hint="eastAsia"/>
+          <w:color w:val="2C3E50"/>
+          <w:sz w:val="17"/>
+          <w:szCs w:val="17"/>
+        </w:rPr>
+        <w:t xml:space="preserve">・当日の任意補食：ワンハンド羊羹1本だと糖質約27g。約10gにするなら羊羹1/3本程度かスポーツドリンク150ml程度。</w:t>
+      </w:r>
+    </w:p>
     <w:p>
       <w:pPr>
         <w:rPr>

</xml_diff>

<commit_message>
Remove optional evening snack and recalculate day-before totals
Co-Authored-By: Claude Opus 5.5 <noreply@anthropic.com>
Claude-Session: https://claude.ai/code/session_01XUw637tvGB6AwL1RKiBxvF
</commit_message>
<xml_diff>
--- a/I選手_前日朝〜試合当日_食事・補食プラン.docx
+++ b/I選手_前日朝〜試合当日_食事・補食プラン.docx
@@ -2260,14 +2260,15 @@
         </w:trPr>
         <w:tc>
           <w:tcPr>
-            <w:tcW w:w="919" w:type="dxa"/>
-            <w:tcBorders>
-              <w:top w:val="single" w:sz="1" w:space="0" w:color="CCCCCC"/>
-              <w:left w:val="single" w:sz="1" w:space="0" w:color="CCCCCC"/>
-              <w:bottom w:val="single" w:sz="1" w:space="0" w:color="CCCCCC"/>
-              <w:right w:val="single" w:sz="1" w:space="0" w:color="CCCCCC"/>
-            </w:tcBorders>
-            <w:shd w:val="clear" w:color="auto" w:fill="EBF5FB"/>
+            <w:tcW w:w="10064" w:type="dxa"/>
+            <w:gridSpan w:val="5"/>
+            <w:tcBorders>
+              <w:top w:val="single" w:sz="1" w:space="0" w:color="CCCCCC"/>
+              <w:left w:val="single" w:sz="1" w:space="0" w:color="CCCCCC"/>
+              <w:bottom w:val="single" w:sz="1" w:space="0" w:color="CCCCCC"/>
+              <w:right w:val="single" w:sz="1" w:space="0" w:color="CCCCCC"/>
+            </w:tcBorders>
+            <w:shd w:val="clear" w:color="auto" w:fill="FEF9E7"/>
             <w:tcMar>
               <w:top w:w="100" w:type="dxa"/>
               <w:left w:w="130" w:type="dxa"/>
@@ -2278,46 +2279,6 @@
           </w:tcPr>
           <w:p>
             <w:pPr>
-              <w:jc w:val="center"/>
-              <w:rPr>
-                <w:rFonts w:ascii="ヒラギノ丸ゴ Pro W4" w:eastAsia="ヒラギノ丸ゴ Pro W4" w:hAnsi="ヒラギノ丸ゴ Pro W4" w:hint="eastAsia"/>
-                <w:color w:val="2C3E50"/>
-                <w:sz w:val="19"/>
-                <w:szCs w:val="19"/>
-              </w:rPr>
-            </w:pPr>
-            <w:r>
-              <w:rPr>
-                <w:rFonts w:ascii="ヒラギノ丸ゴ Pro W4" w:eastAsia="ヒラギノ丸ゴ Pro W4" w:hAnsi="ヒラギノ丸ゴ Pro W4" w:hint="eastAsia"/>
-                <w:color w:val="2C3E50"/>
-                <w:sz w:val="19"/>
-                <w:szCs w:val="19"/>
-              </w:rPr>
-              <w:t xml:space="preserve">21:00頃</w:t>
-            </w:r>
-          </w:p>
-        </w:tc>
-        <w:tc>
-          <w:tcPr>
-            <w:tcW w:w="1519" w:type="dxa"/>
-            <w:tcBorders>
-              <w:top w:val="single" w:sz="1" w:space="0" w:color="CCCCCC"/>
-              <w:left w:val="single" w:sz="1" w:space="0" w:color="CCCCCC"/>
-              <w:bottom w:val="single" w:sz="1" w:space="0" w:color="CCCCCC"/>
-              <w:right w:val="single" w:sz="1" w:space="0" w:color="CCCCCC"/>
-            </w:tcBorders>
-            <w:shd w:val="clear" w:color="auto" w:fill="EBF5FB"/>
-            <w:tcMar>
-              <w:top w:w="100" w:type="dxa"/>
-              <w:left w:w="130" w:type="dxa"/>
-              <w:bottom w:w="100" w:type="dxa"/>
-              <w:right w:w="130" w:type="dxa"/>
-            </w:tcMar>
-            <w:vAlign w:val="center"/>
-          </w:tcPr>
-          <w:p>
-            <w:pPr>
-              <w:jc w:val="center"/>
               <w:rPr>
                 <w:rFonts w:ascii="ヒラギノ丸ゴ Pro W4" w:eastAsia="ヒラギノ丸ゴ Pro W4" w:hAnsi="ヒラギノ丸ゴ Pro W4" w:hint="eastAsia"/>
                 <w:b/>
@@ -2336,230 +2297,7 @@
                 <w:sz w:val="20"/>
                 <w:szCs w:val="20"/>
               </w:rPr>
-              <w:t xml:space="preserve">補食③</w:t>
-            </w:r>
-          </w:p>
-          <w:p>
-            <w:pPr>
-              <w:jc w:val="center"/>
-              <w:rPr>
-                <w:rFonts w:ascii="ヒラギノ丸ゴ Pro W4" w:eastAsia="ヒラギノ丸ゴ Pro W4" w:hAnsi="ヒラギノ丸ゴ Pro W4" w:hint="eastAsia"/>
-                <w:b/>
-                <w:bCs/>
-                <w:color w:val="922B21"/>
-                <w:sz w:val="16"/>
-                <w:szCs w:val="16"/>
-              </w:rPr>
-            </w:pPr>
-            <w:r>
-              <w:rPr>
-                <w:rFonts w:ascii="ヒラギノ丸ゴ Pro W4" w:eastAsia="ヒラギノ丸ゴ Pro W4" w:hAnsi="ヒラギノ丸ゴ Pro W4" w:hint="eastAsia"/>
-                <w:b/>
-                <w:bCs/>
-                <w:color w:val="922B21"/>
-                <w:sz w:val="16"/>
-                <w:szCs w:val="16"/>
-              </w:rPr>
-              <w:t xml:space="preserve">（任意）</w:t>
-            </w:r>
-          </w:p>
-        </w:tc>
-        <w:tc>
-          <w:tcPr>
-            <w:tcW w:w="3082" w:type="dxa"/>
-            <w:tcBorders>
-              <w:top w:val="single" w:sz="1" w:space="0" w:color="CCCCCC"/>
-              <w:left w:val="single" w:sz="1" w:space="0" w:color="CCCCCC"/>
-              <w:bottom w:val="single" w:sz="1" w:space="0" w:color="CCCCCC"/>
-              <w:right w:val="single" w:sz="1" w:space="0" w:color="CCCCCC"/>
-            </w:tcBorders>
-            <w:shd w:val="clear" w:color="auto" w:fill="EBF5FB"/>
-            <w:tcMar>
-              <w:top w:w="100" w:type="dxa"/>
-              <w:left w:w="130" w:type="dxa"/>
-              <w:bottom w:w="100" w:type="dxa"/>
-              <w:right w:w="130" w:type="dxa"/>
-            </w:tcMar>
-            <w:vAlign w:val="center"/>
-          </w:tcPr>
-          <w:p>
-            <w:pPr>
-              <w:rPr>
-                <w:rFonts w:ascii="ヒラギノ丸ゴ Pro W4" w:eastAsia="ヒラギノ丸ゴ Pro W4" w:hAnsi="ヒラギノ丸ゴ Pro W4" w:hint="eastAsia"/>
-                <w:sz w:val="19"/>
-                <w:szCs w:val="19"/>
-              </w:rPr>
-            </w:pPr>
-            <w:r>
-              <w:rPr>
-                <w:rFonts w:ascii="ヒラギノ丸ゴ Pro W4" w:eastAsia="ヒラギノ丸ゴ Pro W4" w:hAnsi="ヒラギノ丸ゴ Pro W4" w:hint="eastAsia"/>
-                <w:sz w:val="19"/>
-                <w:szCs w:val="19"/>
-              </w:rPr>
-              <w:t xml:space="preserve">・ヨーグルト＋はちみつ</w:t>
-            </w:r>
-          </w:p>
-          <w:p>
-            <w:pPr>
-              <w:rPr>
-                <w:rFonts w:ascii="ヒラギノ丸ゴ Pro W4" w:eastAsia="ヒラギノ丸ゴ Pro W4" w:hAnsi="ヒラギノ丸ゴ Pro W4" w:hint="eastAsia"/>
-                <w:sz w:val="19"/>
-                <w:szCs w:val="19"/>
-              </w:rPr>
-            </w:pPr>
-            <w:r>
-              <w:rPr>
-                <w:rFonts w:ascii="ヒラギノ丸ゴ Pro W4" w:eastAsia="ヒラギノ丸ゴ Pro W4" w:hAnsi="ヒラギノ丸ゴ Pro W4" w:hint="eastAsia"/>
-                <w:sz w:val="19"/>
-                <w:szCs w:val="19"/>
-              </w:rPr>
-              <w:t xml:space="preserve">　または</w:t>
-            </w:r>
-          </w:p>
-          <w:p>
-            <w:pPr>
-              <w:rPr>
-                <w:rFonts w:ascii="ヒラギノ丸ゴ Pro W4" w:eastAsia="ヒラギノ丸ゴ Pro W4" w:hAnsi="ヒラギノ丸ゴ Pro W4" w:hint="eastAsia"/>
-                <w:sz w:val="19"/>
-                <w:szCs w:val="19"/>
-              </w:rPr>
-            </w:pPr>
-            <w:r>
-              <w:rPr>
-                <w:rFonts w:ascii="ヒラギノ丸ゴ Pro W4" w:eastAsia="ヒラギノ丸ゴ Pro W4" w:hAnsi="ヒラギノ丸ゴ Pro W4" w:hint="eastAsia"/>
-                <w:sz w:val="19"/>
-                <w:szCs w:val="19"/>
-              </w:rPr>
-              <w:t xml:space="preserve">・バナナ半分</w:t>
-            </w:r>
-          </w:p>
-        </w:tc>
-        <w:tc>
-          <w:tcPr>
-            <w:tcW w:w="765" w:type="dxa"/>
-            <w:tcBorders>
-              <w:top w:val="single" w:sz="1" w:space="0" w:color="CCCCCC"/>
-              <w:left w:val="single" w:sz="1" w:space="0" w:color="CCCCCC"/>
-              <w:bottom w:val="single" w:sz="1" w:space="0" w:color="CCCCCC"/>
-              <w:right w:val="single" w:sz="1" w:space="0" w:color="CCCCCC"/>
-            </w:tcBorders>
-            <w:shd w:val="clear" w:color="auto" w:fill="EBF5FB"/>
-            <w:tcMar>
-              <w:top w:w="100" w:type="dxa"/>
-              <w:left w:w="130" w:type="dxa"/>
-              <w:bottom w:w="100" w:type="dxa"/>
-              <w:right w:w="130" w:type="dxa"/>
-            </w:tcMar>
-            <w:vAlign w:val="center"/>
-          </w:tcPr>
-          <w:p>
-            <w:pPr>
-              <w:jc w:val="center"/>
-              <w:rPr>
-                <w:rFonts w:ascii="ヒラギノ丸ゴ Pro W4" w:eastAsia="ヒラギノ丸ゴ Pro W4" w:hAnsi="ヒラギノ丸ゴ Pro W4" w:hint="eastAsia"/>
-                <w:b/>
-                <w:bCs/>
-                <w:color w:val="922B21"/>
-                <w:sz w:val="19"/>
-                <w:szCs w:val="19"/>
-              </w:rPr>
-            </w:pPr>
-            <w:r>
-              <w:rPr>
-                <w:rFonts w:ascii="ヒラギノ丸ゴ Pro W4" w:eastAsia="ヒラギノ丸ゴ Pro W4" w:hAnsi="ヒラギノ丸ゴ Pro W4" w:hint="eastAsia"/>
-                <w:b/>
-                <w:bCs/>
-                <w:color w:val="922B21"/>
-                <w:sz w:val="19"/>
-                <w:szCs w:val="19"/>
-              </w:rPr>
-              <w:t xml:space="preserve">約15〜20g</w:t>
-            </w:r>
-          </w:p>
-        </w:tc>
-        <w:tc>
-          <w:tcPr>
-            <w:tcW w:w="3779" w:type="dxa"/>
-            <w:tcBorders>
-              <w:top w:val="single" w:sz="1" w:space="0" w:color="CCCCCC"/>
-              <w:left w:val="single" w:sz="1" w:space="0" w:color="CCCCCC"/>
-              <w:bottom w:val="single" w:sz="1" w:space="0" w:color="CCCCCC"/>
-              <w:right w:val="single" w:sz="1" w:space="0" w:color="CCCCCC"/>
-            </w:tcBorders>
-            <w:shd w:val="clear" w:color="auto" w:fill="EBF5FB"/>
-            <w:tcMar>
-              <w:top w:w="100" w:type="dxa"/>
-              <w:left w:w="130" w:type="dxa"/>
-              <w:bottom w:w="100" w:type="dxa"/>
-              <w:right w:w="130" w:type="dxa"/>
-            </w:tcMar>
-            <w:vAlign w:val="center"/>
-          </w:tcPr>
-          <w:p>
-            <w:pPr>
-              <w:rPr>
-                <w:rFonts w:ascii="ヒラギノ丸ゴ Pro W4" w:eastAsia="ヒラギノ丸ゴ Pro W4" w:hAnsi="ヒラギノ丸ゴ Pro W4" w:hint="eastAsia"/>
-                <w:color w:val="5D6D7E"/>
-                <w:sz w:val="19"/>
-                <w:szCs w:val="19"/>
-              </w:rPr>
-            </w:pPr>
-            <w:r>
-              <w:rPr>
-                <w:rFonts w:ascii="ヒラギノ丸ゴ Pro W4" w:eastAsia="ヒラギノ丸ゴ Pro W4" w:hAnsi="ヒラギノ丸ゴ Pro W4" w:hint="eastAsia"/>
-                <w:color w:val="5D6D7E"/>
-                <w:sz w:val="19"/>
-                <w:szCs w:val="19"/>
-              </w:rPr>
-              <w:t xml:space="preserve">夕食が少なかった日だけでOK。満腹なら無理にとらない。</w:t>
-            </w:r>
-          </w:p>
-        </w:tc>
-      </w:tr>
-      <w:tr>
-        <w:trPr>
-          <w:cantSplit/>
-        </w:trPr>
-        <w:tc>
-          <w:tcPr>
-            <w:tcW w:w="10064" w:type="dxa"/>
-            <w:gridSpan w:val="5"/>
-            <w:tcBorders>
-              <w:top w:val="single" w:sz="1" w:space="0" w:color="CCCCCC"/>
-              <w:left w:val="single" w:sz="1" w:space="0" w:color="CCCCCC"/>
-              <w:bottom w:val="single" w:sz="1" w:space="0" w:color="CCCCCC"/>
-              <w:right w:val="single" w:sz="1" w:space="0" w:color="CCCCCC"/>
-            </w:tcBorders>
-            <w:shd w:val="clear" w:color="auto" w:fill="FEF9E7"/>
-            <w:tcMar>
-              <w:top w:w="100" w:type="dxa"/>
-              <w:left w:w="130" w:type="dxa"/>
-              <w:bottom w:w="100" w:type="dxa"/>
-              <w:right w:w="130" w:type="dxa"/>
-            </w:tcMar>
-            <w:vAlign w:val="center"/>
-          </w:tcPr>
-          <w:p>
-            <w:pPr>
-              <w:rPr>
-                <w:rFonts w:ascii="ヒラギノ丸ゴ Pro W4" w:eastAsia="ヒラギノ丸ゴ Pro W4" w:hAnsi="ヒラギノ丸ゴ Pro W4" w:hint="eastAsia"/>
-                <w:b/>
-                <w:bCs/>
-                <w:color w:val="922B21"/>
-                <w:sz w:val="20"/>
-                <w:szCs w:val="20"/>
-              </w:rPr>
-            </w:pPr>
-            <w:r>
-              <w:rPr>
-                <w:rFonts w:ascii="ヒラギノ丸ゴ Pro W4" w:eastAsia="ヒラギノ丸ゴ Pro W4" w:hAnsi="ヒラギノ丸ゴ Pro W4" w:hint="eastAsia"/>
-                <w:b/>
-                <w:bCs/>
-                <w:color w:val="922B21"/>
-                <w:sz w:val="20"/>
-                <w:szCs w:val="20"/>
-              </w:rPr>
-              <w:t xml:space="preserve">前日の糖質合計：約460〜500g（体重61kg × 約8g/kg）</w:t>
+              <w:t xml:space="preserve">前日の糖質合計：約460g（体重61kg × 約7.5g/kg）</w:t>
             </w:r>
           </w:p>
           <w:p>
@@ -7566,14 +7304,15 @@
         </w:trPr>
         <w:tc>
           <w:tcPr>
-            <w:tcW w:w="780" w:type="dxa"/>
-            <w:tcBorders>
-              <w:top w:val="single" w:sz="1" w:space="0" w:color="CCCCCC"/>
-              <w:left w:val="single" w:sz="1" w:space="0" w:color="CCCCCC"/>
-              <w:bottom w:val="single" w:sz="1" w:space="0" w:color="CCCCCC"/>
-              <w:right w:val="single" w:sz="1" w:space="0" w:color="CCCCCC"/>
-            </w:tcBorders>
-            <w:shd w:val="clear" w:color="auto" w:fill="EBF5FB"/>
+            <w:tcW w:w="4080" w:type="dxa"/>
+            <w:gridSpan w:val="3"/>
+            <w:tcBorders>
+              <w:top w:val="single" w:sz="1" w:space="0" w:color="CCCCCC"/>
+              <w:left w:val="single" w:sz="1" w:space="0" w:color="CCCCCC"/>
+              <w:bottom w:val="single" w:sz="1" w:space="0" w:color="CCCCCC"/>
+              <w:right w:val="single" w:sz="1" w:space="0" w:color="CCCCCC"/>
+            </w:tcBorders>
+            <w:shd w:val="clear" w:color="auto" w:fill="FDEDEC"/>
             <w:tcMar>
               <w:top w:w="40" w:type="dxa"/>
               <w:left w:w="90" w:type="dxa"/>
@@ -7587,32 +7326,36 @@
               <w:jc w:val="center"/>
               <w:rPr>
                 <w:rFonts w:ascii="ヒラギノ丸ゴ Pro W4" w:eastAsia="ヒラギノ丸ゴ Pro W4" w:hAnsi="ヒラギノ丸ゴ Pro W4" w:hint="eastAsia"/>
-                <w:color w:val="2C3E50"/>
-                <w:sz w:val="17"/>
-                <w:szCs w:val="17"/>
-              </w:rPr>
-            </w:pPr>
-            <w:r>
-              <w:rPr>
-                <w:rFonts w:ascii="ヒラギノ丸ゴ Pro W4" w:eastAsia="ヒラギノ丸ゴ Pro W4" w:hAnsi="ヒラギノ丸ゴ Pro W4" w:hint="eastAsia"/>
-                <w:color w:val="2C3E50"/>
-                <w:sz w:val="17"/>
-                <w:szCs w:val="17"/>
-              </w:rPr>
-              <w:t xml:space="preserve">21:00頃</w:t>
-            </w:r>
-          </w:p>
-        </w:tc>
-        <w:tc>
-          <w:tcPr>
-            <w:tcW w:w="880" w:type="dxa"/>
-            <w:tcBorders>
-              <w:top w:val="single" w:sz="1" w:space="0" w:color="CCCCCC"/>
-              <w:left w:val="single" w:sz="1" w:space="0" w:color="CCCCCC"/>
-              <w:bottom w:val="single" w:sz="1" w:space="0" w:color="CCCCCC"/>
-              <w:right w:val="single" w:sz="1" w:space="0" w:color="CCCCCC"/>
-            </w:tcBorders>
-            <w:shd w:val="clear" w:color="auto" w:fill="EBF5FB"/>
+                <w:b/>
+                <w:bCs/>
+                <w:color w:val="922B21"/>
+                <w:sz w:val="18"/>
+                <w:szCs w:val="18"/>
+              </w:rPr>
+            </w:pPr>
+            <w:r>
+              <w:rPr>
+                <w:rFonts w:ascii="ヒラギノ丸ゴ Pro W4" w:eastAsia="ヒラギノ丸ゴ Pro W4" w:hAnsi="ヒラギノ丸ゴ Pro W4" w:hint="eastAsia"/>
+                <w:b/>
+                <w:bCs/>
+                <w:color w:val="922B21"/>
+                <w:sz w:val="18"/>
+                <w:szCs w:val="18"/>
+              </w:rPr>
+              <w:t xml:space="preserve">前日合計</w:t>
+            </w:r>
+          </w:p>
+        </w:tc>
+        <w:tc>
+          <w:tcPr>
+            <w:tcW w:w="1120" w:type="dxa"/>
+            <w:tcBorders>
+              <w:top w:val="single" w:sz="1" w:space="0" w:color="CCCCCC"/>
+              <w:left w:val="single" w:sz="1" w:space="0" w:color="CCCCCC"/>
+              <w:bottom w:val="single" w:sz="1" w:space="0" w:color="CCCCCC"/>
+              <w:right w:val="single" w:sz="1" w:space="0" w:color="CCCCCC"/>
+            </w:tcBorders>
+            <w:shd w:val="clear" w:color="auto" w:fill="FDEDEC"/>
             <w:tcMar>
               <w:top w:w="40" w:type="dxa"/>
               <w:left w:w="90" w:type="dxa"/>
@@ -7628,58 +7371,34 @@
                 <w:rFonts w:ascii="ヒラギノ丸ゴ Pro W4" w:eastAsia="ヒラギノ丸ゴ Pro W4" w:hAnsi="ヒラギノ丸ゴ Pro W4" w:hint="eastAsia"/>
                 <w:b/>
                 <w:bCs/>
-                <w:color w:val="922B21"/>
-                <w:sz w:val="18"/>
-                <w:szCs w:val="18"/>
-              </w:rPr>
-            </w:pPr>
-            <w:r>
-              <w:rPr>
-                <w:rFonts w:ascii="ヒラギノ丸ゴ Pro W4" w:eastAsia="ヒラギノ丸ゴ Pro W4" w:hAnsi="ヒラギノ丸ゴ Pro W4" w:hint="eastAsia"/>
-                <w:b/>
-                <w:bCs/>
-                <w:color w:val="922B21"/>
-                <w:sz w:val="18"/>
-                <w:szCs w:val="18"/>
-              </w:rPr>
-              <w:t xml:space="preserve">補食③</w:t>
-            </w:r>
-          </w:p>
-          <w:p>
-            <w:pPr>
-              <w:jc w:val="center"/>
-              <w:rPr>
-                <w:rFonts w:ascii="ヒラギノ丸ゴ Pro W4" w:eastAsia="ヒラギノ丸ゴ Pro W4" w:hAnsi="ヒラギノ丸ゴ Pro W4" w:hint="eastAsia"/>
-                <w:b/>
-                <w:bCs/>
-                <w:color w:val="922B21"/>
-                <w:sz w:val="18"/>
-                <w:szCs w:val="18"/>
-              </w:rPr>
-            </w:pPr>
-            <w:r>
-              <w:rPr>
-                <w:rFonts w:ascii="ヒラギノ丸ゴ Pro W4" w:eastAsia="ヒラギノ丸ゴ Pro W4" w:hAnsi="ヒラギノ丸ゴ Pro W4" w:hint="eastAsia"/>
-                <w:b/>
-                <w:bCs/>
-                <w:color w:val="922B21"/>
-                <w:sz w:val="18"/>
-                <w:szCs w:val="18"/>
-              </w:rPr>
-              <w:t xml:space="preserve">（任意）</w:t>
-            </w:r>
-          </w:p>
-        </w:tc>
-        <w:tc>
-          <w:tcPr>
-            <w:tcW w:w="2420" w:type="dxa"/>
-            <w:tcBorders>
-              <w:top w:val="single" w:sz="1" w:space="0" w:color="CCCCCC"/>
-              <w:left w:val="single" w:sz="1" w:space="0" w:color="CCCCCC"/>
-              <w:bottom w:val="single" w:sz="1" w:space="0" w:color="CCCCCC"/>
-              <w:right w:val="single" w:sz="1" w:space="0" w:color="CCCCCC"/>
-            </w:tcBorders>
-            <w:shd w:val="clear" w:color="auto" w:fill="EBF5FB"/>
+                <w:color w:val="2C3E50"/>
+                <w:sz w:val="17"/>
+                <w:szCs w:val="17"/>
+              </w:rPr>
+            </w:pPr>
+            <w:r>
+              <w:rPr>
+                <w:rFonts w:ascii="ヒラギノ丸ゴ Pro W4" w:eastAsia="ヒラギノ丸ゴ Pro W4" w:hAnsi="ヒラギノ丸ゴ Pro W4" w:hint="eastAsia"/>
+                <w:b/>
+                <w:bCs/>
+                <w:color w:val="2C3E50"/>
+                <w:sz w:val="17"/>
+                <w:szCs w:val="17"/>
+              </w:rPr>
+              <w:t xml:space="preserve">約2,520kcal</w:t>
+            </w:r>
+          </w:p>
+        </w:tc>
+        <w:tc>
+          <w:tcPr>
+            <w:tcW w:w="880" w:type="dxa"/>
+            <w:tcBorders>
+              <w:top w:val="single" w:sz="1" w:space="0" w:color="CCCCCC"/>
+              <w:left w:val="single" w:sz="1" w:space="0" w:color="CCCCCC"/>
+              <w:bottom w:val="single" w:sz="1" w:space="0" w:color="CCCCCC"/>
+              <w:right w:val="single" w:sz="1" w:space="0" w:color="CCCCCC"/>
+            </w:tcBorders>
+            <w:shd w:val="clear" w:color="auto" w:fill="FDEDEC"/>
             <w:tcMar>
               <w:top w:w="40" w:type="dxa"/>
               <w:left w:w="90" w:type="dxa"/>
@@ -7690,34 +7409,39 @@
           </w:tcPr>
           <w:p>
             <w:pPr>
-              <w:rPr>
-                <w:rFonts w:ascii="ヒラギノ丸ゴ Pro W4" w:eastAsia="ヒラギノ丸ゴ Pro W4" w:hAnsi="ヒラギノ丸ゴ Pro W4" w:hint="eastAsia"/>
-                <w:color w:val="2C3E50"/>
-                <w:sz w:val="17"/>
-                <w:szCs w:val="17"/>
-              </w:rPr>
-            </w:pPr>
-            <w:r>
-              <w:rPr>
-                <w:rFonts w:ascii="ヒラギノ丸ゴ Pro W4" w:eastAsia="ヒラギノ丸ゴ Pro W4" w:hAnsi="ヒラギノ丸ゴ Pro W4" w:hint="eastAsia"/>
-                <w:color w:val="2C3E50"/>
-                <w:sz w:val="17"/>
-                <w:szCs w:val="17"/>
-              </w:rPr>
-              <w:t xml:space="preserve">ヨーグルト＋はちみつ大さじ1</w:t>
-            </w:r>
-          </w:p>
-        </w:tc>
-        <w:tc>
-          <w:tcPr>
-            <w:tcW w:w="1120" w:type="dxa"/>
-            <w:tcBorders>
-              <w:top w:val="single" w:sz="1" w:space="0" w:color="CCCCCC"/>
-              <w:left w:val="single" w:sz="1" w:space="0" w:color="CCCCCC"/>
-              <w:bottom w:val="single" w:sz="1" w:space="0" w:color="CCCCCC"/>
-              <w:right w:val="single" w:sz="1" w:space="0" w:color="CCCCCC"/>
-            </w:tcBorders>
-            <w:shd w:val="clear" w:color="auto" w:fill="EBF5FB"/>
+              <w:jc w:val="center"/>
+              <w:rPr>
+                <w:rFonts w:ascii="ヒラギノ丸ゴ Pro W4" w:eastAsia="ヒラギノ丸ゴ Pro W4" w:hAnsi="ヒラギノ丸ゴ Pro W4" w:hint="eastAsia"/>
+                <w:b/>
+                <w:bCs/>
+                <w:color w:val="922B21"/>
+                <w:sz w:val="17"/>
+                <w:szCs w:val="17"/>
+              </w:rPr>
+            </w:pPr>
+            <w:r>
+              <w:rPr>
+                <w:rFonts w:ascii="ヒラギノ丸ゴ Pro W4" w:eastAsia="ヒラギノ丸ゴ Pro W4" w:hAnsi="ヒラギノ丸ゴ Pro W4" w:hint="eastAsia"/>
+                <w:b/>
+                <w:bCs/>
+                <w:color w:val="922B21"/>
+                <w:sz w:val="17"/>
+                <w:szCs w:val="17"/>
+              </w:rPr>
+              <w:t xml:space="preserve">約460g</w:t>
+            </w:r>
+          </w:p>
+        </w:tc>
+        <w:tc>
+          <w:tcPr>
+            <w:tcW w:w="760" w:type="dxa"/>
+            <w:tcBorders>
+              <w:top w:val="single" w:sz="1" w:space="0" w:color="CCCCCC"/>
+              <w:left w:val="single" w:sz="1" w:space="0" w:color="CCCCCC"/>
+              <w:bottom w:val="single" w:sz="1" w:space="0" w:color="CCCCCC"/>
+              <w:right w:val="single" w:sz="1" w:space="0" w:color="CCCCCC"/>
+            </w:tcBorders>
+            <w:shd w:val="clear" w:color="auto" w:fill="FDEDEC"/>
             <w:tcMar>
               <w:top w:w="40" w:type="dxa"/>
               <w:left w:w="90" w:type="dxa"/>
@@ -7733,34 +7457,34 @@
                 <w:rFonts w:ascii="ヒラギノ丸ゴ Pro W4" w:eastAsia="ヒラギノ丸ゴ Pro W4" w:hAnsi="ヒラギノ丸ゴ Pro W4" w:hint="eastAsia"/>
                 <w:b/>
                 <w:bCs/>
-                <w:color w:val="2C3E50"/>
-                <w:sz w:val="17"/>
-                <w:szCs w:val="17"/>
-              </w:rPr>
-            </w:pPr>
-            <w:r>
-              <w:rPr>
-                <w:rFonts w:ascii="ヒラギノ丸ゴ Pro W4" w:eastAsia="ヒラギノ丸ゴ Pro W4" w:hAnsi="ヒラギノ丸ゴ Pro W4" w:hint="eastAsia"/>
-                <w:b/>
-                <w:bCs/>
-                <w:color w:val="2C3E50"/>
-                <w:sz w:val="17"/>
-                <w:szCs w:val="17"/>
-              </w:rPr>
-              <w:t xml:space="preserve">約125kcal</w:t>
-            </w:r>
-          </w:p>
-        </w:tc>
-        <w:tc>
-          <w:tcPr>
-            <w:tcW w:w="880" w:type="dxa"/>
-            <w:tcBorders>
-              <w:top w:val="single" w:sz="1" w:space="0" w:color="CCCCCC"/>
-              <w:left w:val="single" w:sz="1" w:space="0" w:color="CCCCCC"/>
-              <w:bottom w:val="single" w:sz="1" w:space="0" w:color="CCCCCC"/>
-              <w:right w:val="single" w:sz="1" w:space="0" w:color="CCCCCC"/>
-            </w:tcBorders>
-            <w:shd w:val="clear" w:color="auto" w:fill="EBF5FB"/>
+                <w:color w:val="922B21"/>
+                <w:sz w:val="17"/>
+                <w:szCs w:val="17"/>
+              </w:rPr>
+            </w:pPr>
+            <w:r>
+              <w:rPr>
+                <w:rFonts w:ascii="ヒラギノ丸ゴ Pro W4" w:eastAsia="ヒラギノ丸ゴ Pro W4" w:hAnsi="ヒラギノ丸ゴ Pro W4" w:hint="eastAsia"/>
+                <w:b/>
+                <w:bCs/>
+                <w:color w:val="922B21"/>
+                <w:sz w:val="17"/>
+                <w:szCs w:val="17"/>
+              </w:rPr>
+              <w:t xml:space="preserve">7.5</w:t>
+            </w:r>
+          </w:p>
+        </w:tc>
+        <w:tc>
+          <w:tcPr>
+            <w:tcW w:w="830" w:type="dxa"/>
+            <w:tcBorders>
+              <w:top w:val="single" w:sz="1" w:space="0" w:color="CCCCCC"/>
+              <w:left w:val="single" w:sz="1" w:space="0" w:color="CCCCCC"/>
+              <w:bottom w:val="single" w:sz="1" w:space="0" w:color="CCCCCC"/>
+              <w:right w:val="single" w:sz="1" w:space="0" w:color="CCCCCC"/>
+            </w:tcBorders>
+            <w:shd w:val="clear" w:color="auto" w:fill="FDEDEC"/>
             <w:tcMar>
               <w:top w:w="40" w:type="dxa"/>
               <w:left w:w="90" w:type="dxa"/>
@@ -7776,34 +7500,34 @@
                 <w:rFonts w:ascii="ヒラギノ丸ゴ Pro W4" w:eastAsia="ヒラギノ丸ゴ Pro W4" w:hAnsi="ヒラギノ丸ゴ Pro W4" w:hint="eastAsia"/>
                 <w:b/>
                 <w:bCs/>
-                <w:color w:val="922B21"/>
-                <w:sz w:val="17"/>
-                <w:szCs w:val="17"/>
-              </w:rPr>
-            </w:pPr>
-            <w:r>
-              <w:rPr>
-                <w:rFonts w:ascii="ヒラギノ丸ゴ Pro W4" w:eastAsia="ヒラギノ丸ゴ Pro W4" w:hAnsi="ヒラギノ丸ゴ Pro W4" w:hint="eastAsia"/>
-                <w:b/>
-                <w:bCs/>
-                <w:color w:val="922B21"/>
-                <w:sz w:val="17"/>
-                <w:szCs w:val="17"/>
-              </w:rPr>
-              <w:t xml:space="preserve">約22g</w:t>
-            </w:r>
-          </w:p>
-        </w:tc>
-        <w:tc>
-          <w:tcPr>
-            <w:tcW w:w="760" w:type="dxa"/>
-            <w:tcBorders>
-              <w:top w:val="single" w:sz="1" w:space="0" w:color="CCCCCC"/>
-              <w:left w:val="single" w:sz="1" w:space="0" w:color="CCCCCC"/>
-              <w:bottom w:val="single" w:sz="1" w:space="0" w:color="CCCCCC"/>
-              <w:right w:val="single" w:sz="1" w:space="0" w:color="CCCCCC"/>
-            </w:tcBorders>
-            <w:shd w:val="clear" w:color="auto" w:fill="EBF5FB"/>
+                <w:color w:val="2C3E50"/>
+                <w:sz w:val="17"/>
+                <w:szCs w:val="17"/>
+              </w:rPr>
+            </w:pPr>
+            <w:r>
+              <w:rPr>
+                <w:rFonts w:ascii="ヒラギノ丸ゴ Pro W4" w:eastAsia="ヒラギノ丸ゴ Pro W4" w:hAnsi="ヒラギノ丸ゴ Pro W4" w:hint="eastAsia"/>
+                <w:b/>
+                <w:bCs/>
+                <w:color w:val="2C3E50"/>
+                <w:sz w:val="17"/>
+                <w:szCs w:val="17"/>
+              </w:rPr>
+              <w:t xml:space="preserve">約84g</w:t>
+            </w:r>
+          </w:p>
+        </w:tc>
+        <w:tc>
+          <w:tcPr>
+            <w:tcW w:w="2394" w:type="dxa"/>
+            <w:tcBorders>
+              <w:top w:val="single" w:sz="1" w:space="0" w:color="CCCCCC"/>
+              <w:left w:val="single" w:sz="1" w:space="0" w:color="CCCCCC"/>
+              <w:bottom w:val="single" w:sz="1" w:space="0" w:color="CCCCCC"/>
+              <w:right w:val="single" w:sz="1" w:space="0" w:color="CCCCCC"/>
+            </w:tcBorders>
+            <w:shd w:val="clear" w:color="auto" w:fill="FDEDEC"/>
             <w:tcMar>
               <w:top w:w="40" w:type="dxa"/>
               <w:left w:w="90" w:type="dxa"/>
@@ -7814,92 +7538,6 @@
           </w:tcPr>
           <w:p>
             <w:pPr>
-              <w:jc w:val="center"/>
-              <w:rPr>
-                <w:rFonts w:ascii="ヒラギノ丸ゴ Pro W4" w:eastAsia="ヒラギノ丸ゴ Pro W4" w:hAnsi="ヒラギノ丸ゴ Pro W4" w:hint="eastAsia"/>
-                <w:b/>
-                <w:bCs/>
-                <w:color w:val="922B21"/>
-                <w:sz w:val="17"/>
-                <w:szCs w:val="17"/>
-              </w:rPr>
-            </w:pPr>
-            <w:r>
-              <w:rPr>
-                <w:rFonts w:ascii="ヒラギノ丸ゴ Pro W4" w:eastAsia="ヒラギノ丸ゴ Pro W4" w:hAnsi="ヒラギノ丸ゴ Pro W4" w:hint="eastAsia"/>
-                <w:b/>
-                <w:bCs/>
-                <w:color w:val="922B21"/>
-                <w:sz w:val="17"/>
-                <w:szCs w:val="17"/>
-              </w:rPr>
-              <w:t xml:space="preserve">0.4</w:t>
-            </w:r>
-          </w:p>
-        </w:tc>
-        <w:tc>
-          <w:tcPr>
-            <w:tcW w:w="830" w:type="dxa"/>
-            <w:tcBorders>
-              <w:top w:val="single" w:sz="1" w:space="0" w:color="CCCCCC"/>
-              <w:left w:val="single" w:sz="1" w:space="0" w:color="CCCCCC"/>
-              <w:bottom w:val="single" w:sz="1" w:space="0" w:color="CCCCCC"/>
-              <w:right w:val="single" w:sz="1" w:space="0" w:color="CCCCCC"/>
-            </w:tcBorders>
-            <w:shd w:val="clear" w:color="auto" w:fill="EBF5FB"/>
-            <w:tcMar>
-              <w:top w:w="40" w:type="dxa"/>
-              <w:left w:w="90" w:type="dxa"/>
-              <w:bottom w:w="40" w:type="dxa"/>
-              <w:right w:w="90" w:type="dxa"/>
-            </w:tcMar>
-            <w:vAlign w:val="center"/>
-          </w:tcPr>
-          <w:p>
-            <w:pPr>
-              <w:jc w:val="center"/>
-              <w:rPr>
-                <w:rFonts w:ascii="ヒラギノ丸ゴ Pro W4" w:eastAsia="ヒラギノ丸ゴ Pro W4" w:hAnsi="ヒラギノ丸ゴ Pro W4" w:hint="eastAsia"/>
-                <w:b/>
-                <w:bCs/>
-                <w:color w:val="2C3E50"/>
-                <w:sz w:val="17"/>
-                <w:szCs w:val="17"/>
-              </w:rPr>
-            </w:pPr>
-            <w:r>
-              <w:rPr>
-                <w:rFonts w:ascii="ヒラギノ丸ゴ Pro W4" w:eastAsia="ヒラギノ丸ゴ Pro W4" w:hAnsi="ヒラギノ丸ゴ Pro W4" w:hint="eastAsia"/>
-                <w:b/>
-                <w:bCs/>
-                <w:color w:val="2C3E50"/>
-                <w:sz w:val="17"/>
-                <w:szCs w:val="17"/>
-              </w:rPr>
-              <w:t xml:space="preserve">約4g</w:t>
-            </w:r>
-          </w:p>
-        </w:tc>
-        <w:tc>
-          <w:tcPr>
-            <w:tcW w:w="2394" w:type="dxa"/>
-            <w:tcBorders>
-              <w:top w:val="single" w:sz="1" w:space="0" w:color="CCCCCC"/>
-              <w:left w:val="single" w:sz="1" w:space="0" w:color="CCCCCC"/>
-              <w:bottom w:val="single" w:sz="1" w:space="0" w:color="CCCCCC"/>
-              <w:right w:val="single" w:sz="1" w:space="0" w:color="CCCCCC"/>
-            </w:tcBorders>
-            <w:shd w:val="clear" w:color="auto" w:fill="EBF5FB"/>
-            <w:tcMar>
-              <w:top w:w="40" w:type="dxa"/>
-              <w:left w:w="90" w:type="dxa"/>
-              <w:bottom w:w="40" w:type="dxa"/>
-              <w:right w:w="90" w:type="dxa"/>
-            </w:tcMar>
-            <w:vAlign w:val="center"/>
-          </w:tcPr>
-          <w:p>
-            <w:pPr>
               <w:rPr>
                 <w:rFonts w:ascii="ヒラギノ丸ゴ Pro W4" w:eastAsia="ヒラギノ丸ゴ Pro W4" w:hAnsi="ヒラギノ丸ゴ Pro W4" w:hint="eastAsia"/>
                 <w:color w:val="5D6D7E"/>
@@ -7914,266 +7552,7 @@
                 <w:sz w:val="16"/>
                 <w:szCs w:val="16"/>
               </w:rPr>
-              <w:t xml:space="preserve">バナナ半分：約45kcal／11g（0.2g/kg）／1g</w:t>
-            </w:r>
-          </w:p>
-        </w:tc>
-      </w:tr>
-      <w:tr>
-        <w:trPr>
-          <w:cantSplit/>
-        </w:trPr>
-        <w:tc>
-          <w:tcPr>
-            <w:tcW w:w="4080" w:type="dxa"/>
-            <w:gridSpan w:val="3"/>
-            <w:tcBorders>
-              <w:top w:val="single" w:sz="1" w:space="0" w:color="CCCCCC"/>
-              <w:left w:val="single" w:sz="1" w:space="0" w:color="CCCCCC"/>
-              <w:bottom w:val="single" w:sz="1" w:space="0" w:color="CCCCCC"/>
-              <w:right w:val="single" w:sz="1" w:space="0" w:color="CCCCCC"/>
-            </w:tcBorders>
-            <w:shd w:val="clear" w:color="auto" w:fill="FDEDEC"/>
-            <w:tcMar>
-              <w:top w:w="40" w:type="dxa"/>
-              <w:left w:w="90" w:type="dxa"/>
-              <w:bottom w:w="40" w:type="dxa"/>
-              <w:right w:w="90" w:type="dxa"/>
-            </w:tcMar>
-            <w:vAlign w:val="center"/>
-          </w:tcPr>
-          <w:p>
-            <w:pPr>
-              <w:jc w:val="center"/>
-              <w:rPr>
-                <w:rFonts w:ascii="ヒラギノ丸ゴ Pro W4" w:eastAsia="ヒラギノ丸ゴ Pro W4" w:hAnsi="ヒラギノ丸ゴ Pro W4" w:hint="eastAsia"/>
-                <w:b/>
-                <w:bCs/>
-                <w:color w:val="922B21"/>
-                <w:sz w:val="18"/>
-                <w:szCs w:val="18"/>
-              </w:rPr>
-            </w:pPr>
-            <w:r>
-              <w:rPr>
-                <w:rFonts w:ascii="ヒラギノ丸ゴ Pro W4" w:eastAsia="ヒラギノ丸ゴ Pro W4" w:hAnsi="ヒラギノ丸ゴ Pro W4" w:hint="eastAsia"/>
-                <w:b/>
-                <w:bCs/>
-                <w:color w:val="922B21"/>
-                <w:sz w:val="18"/>
-                <w:szCs w:val="18"/>
-              </w:rPr>
-              <w:t xml:space="preserve">前日合計</w:t>
-            </w:r>
-          </w:p>
-        </w:tc>
-        <w:tc>
-          <w:tcPr>
-            <w:tcW w:w="1120" w:type="dxa"/>
-            <w:tcBorders>
-              <w:top w:val="single" w:sz="1" w:space="0" w:color="CCCCCC"/>
-              <w:left w:val="single" w:sz="1" w:space="0" w:color="CCCCCC"/>
-              <w:bottom w:val="single" w:sz="1" w:space="0" w:color="CCCCCC"/>
-              <w:right w:val="single" w:sz="1" w:space="0" w:color="CCCCCC"/>
-            </w:tcBorders>
-            <w:shd w:val="clear" w:color="auto" w:fill="FDEDEC"/>
-            <w:tcMar>
-              <w:top w:w="40" w:type="dxa"/>
-              <w:left w:w="90" w:type="dxa"/>
-              <w:bottom w:w="40" w:type="dxa"/>
-              <w:right w:w="90" w:type="dxa"/>
-            </w:tcMar>
-            <w:vAlign w:val="center"/>
-          </w:tcPr>
-          <w:p>
-            <w:pPr>
-              <w:jc w:val="center"/>
-              <w:rPr>
-                <w:rFonts w:ascii="ヒラギノ丸ゴ Pro W4" w:eastAsia="ヒラギノ丸ゴ Pro W4" w:hAnsi="ヒラギノ丸ゴ Pro W4" w:hint="eastAsia"/>
-                <w:b/>
-                <w:bCs/>
-                <w:color w:val="2C3E50"/>
-                <w:sz w:val="17"/>
-                <w:szCs w:val="17"/>
-              </w:rPr>
-            </w:pPr>
-            <w:r>
-              <w:rPr>
-                <w:rFonts w:ascii="ヒラギノ丸ゴ Pro W4" w:eastAsia="ヒラギノ丸ゴ Pro W4" w:hAnsi="ヒラギノ丸ゴ Pro W4" w:hint="eastAsia"/>
-                <w:b/>
-                <w:bCs/>
-                <w:color w:val="2C3E50"/>
-                <w:sz w:val="17"/>
-                <w:szCs w:val="17"/>
-              </w:rPr>
-              <w:t xml:space="preserve">約2,640kcal</w:t>
-            </w:r>
-          </w:p>
-        </w:tc>
-        <w:tc>
-          <w:tcPr>
-            <w:tcW w:w="880" w:type="dxa"/>
-            <w:tcBorders>
-              <w:top w:val="single" w:sz="1" w:space="0" w:color="CCCCCC"/>
-              <w:left w:val="single" w:sz="1" w:space="0" w:color="CCCCCC"/>
-              <w:bottom w:val="single" w:sz="1" w:space="0" w:color="CCCCCC"/>
-              <w:right w:val="single" w:sz="1" w:space="0" w:color="CCCCCC"/>
-            </w:tcBorders>
-            <w:shd w:val="clear" w:color="auto" w:fill="FDEDEC"/>
-            <w:tcMar>
-              <w:top w:w="40" w:type="dxa"/>
-              <w:left w:w="90" w:type="dxa"/>
-              <w:bottom w:w="40" w:type="dxa"/>
-              <w:right w:w="90" w:type="dxa"/>
-            </w:tcMar>
-            <w:vAlign w:val="center"/>
-          </w:tcPr>
-          <w:p>
-            <w:pPr>
-              <w:jc w:val="center"/>
-              <w:rPr>
-                <w:rFonts w:ascii="ヒラギノ丸ゴ Pro W4" w:eastAsia="ヒラギノ丸ゴ Pro W4" w:hAnsi="ヒラギノ丸ゴ Pro W4" w:hint="eastAsia"/>
-                <w:b/>
-                <w:bCs/>
-                <w:color w:val="922B21"/>
-                <w:sz w:val="17"/>
-                <w:szCs w:val="17"/>
-              </w:rPr>
-            </w:pPr>
-            <w:r>
-              <w:rPr>
-                <w:rFonts w:ascii="ヒラギノ丸ゴ Pro W4" w:eastAsia="ヒラギノ丸ゴ Pro W4" w:hAnsi="ヒラギノ丸ゴ Pro W4" w:hint="eastAsia"/>
-                <w:b/>
-                <w:bCs/>
-                <w:color w:val="922B21"/>
-                <w:sz w:val="17"/>
-                <w:szCs w:val="17"/>
-              </w:rPr>
-              <w:t xml:space="preserve">約480g</w:t>
-            </w:r>
-          </w:p>
-        </w:tc>
-        <w:tc>
-          <w:tcPr>
-            <w:tcW w:w="760" w:type="dxa"/>
-            <w:tcBorders>
-              <w:top w:val="single" w:sz="1" w:space="0" w:color="CCCCCC"/>
-              <w:left w:val="single" w:sz="1" w:space="0" w:color="CCCCCC"/>
-              <w:bottom w:val="single" w:sz="1" w:space="0" w:color="CCCCCC"/>
-              <w:right w:val="single" w:sz="1" w:space="0" w:color="CCCCCC"/>
-            </w:tcBorders>
-            <w:shd w:val="clear" w:color="auto" w:fill="FDEDEC"/>
-            <w:tcMar>
-              <w:top w:w="40" w:type="dxa"/>
-              <w:left w:w="90" w:type="dxa"/>
-              <w:bottom w:w="40" w:type="dxa"/>
-              <w:right w:w="90" w:type="dxa"/>
-            </w:tcMar>
-            <w:vAlign w:val="center"/>
-          </w:tcPr>
-          <w:p>
-            <w:pPr>
-              <w:jc w:val="center"/>
-              <w:rPr>
-                <w:rFonts w:ascii="ヒラギノ丸ゴ Pro W4" w:eastAsia="ヒラギノ丸ゴ Pro W4" w:hAnsi="ヒラギノ丸ゴ Pro W4" w:hint="eastAsia"/>
-                <w:b/>
-                <w:bCs/>
-                <w:color w:val="922B21"/>
-                <w:sz w:val="17"/>
-                <w:szCs w:val="17"/>
-              </w:rPr>
-            </w:pPr>
-            <w:r>
-              <w:rPr>
-                <w:rFonts w:ascii="ヒラギノ丸ゴ Pro W4" w:eastAsia="ヒラギノ丸ゴ Pro W4" w:hAnsi="ヒラギノ丸ゴ Pro W4" w:hint="eastAsia"/>
-                <w:b/>
-                <w:bCs/>
-                <w:color w:val="922B21"/>
-                <w:sz w:val="17"/>
-                <w:szCs w:val="17"/>
-              </w:rPr>
-              <w:t xml:space="preserve">7.9</w:t>
-            </w:r>
-          </w:p>
-        </w:tc>
-        <w:tc>
-          <w:tcPr>
-            <w:tcW w:w="830" w:type="dxa"/>
-            <w:tcBorders>
-              <w:top w:val="single" w:sz="1" w:space="0" w:color="CCCCCC"/>
-              <w:left w:val="single" w:sz="1" w:space="0" w:color="CCCCCC"/>
-              <w:bottom w:val="single" w:sz="1" w:space="0" w:color="CCCCCC"/>
-              <w:right w:val="single" w:sz="1" w:space="0" w:color="CCCCCC"/>
-            </w:tcBorders>
-            <w:shd w:val="clear" w:color="auto" w:fill="FDEDEC"/>
-            <w:tcMar>
-              <w:top w:w="40" w:type="dxa"/>
-              <w:left w:w="90" w:type="dxa"/>
-              <w:bottom w:w="40" w:type="dxa"/>
-              <w:right w:w="90" w:type="dxa"/>
-            </w:tcMar>
-            <w:vAlign w:val="center"/>
-          </w:tcPr>
-          <w:p>
-            <w:pPr>
-              <w:jc w:val="center"/>
-              <w:rPr>
-                <w:rFonts w:ascii="ヒラギノ丸ゴ Pro W4" w:eastAsia="ヒラギノ丸ゴ Pro W4" w:hAnsi="ヒラギノ丸ゴ Pro W4" w:hint="eastAsia"/>
-                <w:b/>
-                <w:bCs/>
-                <w:color w:val="2C3E50"/>
-                <w:sz w:val="17"/>
-                <w:szCs w:val="17"/>
-              </w:rPr>
-            </w:pPr>
-            <w:r>
-              <w:rPr>
-                <w:rFonts w:ascii="ヒラギノ丸ゴ Pro W4" w:eastAsia="ヒラギノ丸ゴ Pro W4" w:hAnsi="ヒラギノ丸ゴ Pro W4" w:hint="eastAsia"/>
-                <w:b/>
-                <w:bCs/>
-                <w:color w:val="2C3E50"/>
-                <w:sz w:val="17"/>
-                <w:szCs w:val="17"/>
-              </w:rPr>
-              <w:t xml:space="preserve">約88g</w:t>
-            </w:r>
-          </w:p>
-        </w:tc>
-        <w:tc>
-          <w:tcPr>
-            <w:tcW w:w="2394" w:type="dxa"/>
-            <w:tcBorders>
-              <w:top w:val="single" w:sz="1" w:space="0" w:color="CCCCCC"/>
-              <w:left w:val="single" w:sz="1" w:space="0" w:color="CCCCCC"/>
-              <w:bottom w:val="single" w:sz="1" w:space="0" w:color="CCCCCC"/>
-              <w:right w:val="single" w:sz="1" w:space="0" w:color="CCCCCC"/>
-            </w:tcBorders>
-            <w:shd w:val="clear" w:color="auto" w:fill="FDEDEC"/>
-            <w:tcMar>
-              <w:top w:w="40" w:type="dxa"/>
-              <w:left w:w="90" w:type="dxa"/>
-              <w:bottom w:w="40" w:type="dxa"/>
-              <w:right w:w="90" w:type="dxa"/>
-            </w:tcMar>
-            <w:vAlign w:val="center"/>
-          </w:tcPr>
-          <w:p>
-            <w:pPr>
-              <w:rPr>
-                <w:rFonts w:ascii="ヒラギノ丸ゴ Pro W4" w:eastAsia="ヒラギノ丸ゴ Pro W4" w:hAnsi="ヒラギノ丸ゴ Pro W4" w:hint="eastAsia"/>
-                <w:color w:val="5D6D7E"/>
-                <w:sz w:val="16"/>
-                <w:szCs w:val="16"/>
-              </w:rPr>
-            </w:pPr>
-            <w:r>
-              <w:rPr>
-                <w:rFonts w:ascii="ヒラギノ丸ゴ Pro W4" w:eastAsia="ヒラギノ丸ゴ Pro W4" w:hAnsi="ヒラギノ丸ゴ Pro W4" w:hint="eastAsia"/>
-                <w:color w:val="5D6D7E"/>
-                <w:sz w:val="16"/>
-                <w:szCs w:val="16"/>
-              </w:rPr>
-              <w:t xml:space="preserve">エネルギー 約43kcal/kg、たんぱく質 約1.4g/kg</w:t>
+              <w:t xml:space="preserve">エネルギー 約41kcal/kg、たんぱく質 約1.4g/kg</w:t>
             </w:r>
           </w:p>
         </w:tc>
@@ -9570,7 +8949,7 @@
           <w:sz w:val="17"/>
           <w:szCs w:val="17"/>
         </w:rPr>
-        <w:t xml:space="preserve">・前日の糖質は約480g（7.9g/kg）で目標の8g/kgとほぼ同じ。3食（各2.1〜2.2g/kg）を軸に補食で上乗せしています。</w:t>
+        <w:t xml:space="preserve">・前日の糖質は約460g（7.5g/kg）で、目標の8g/kg（約490g）に約30g不足。補食②をカステラ＋オレンジジュースにする（＋14g）、夕食にオレンジジュース200mlを加える（＋21g）などで補えます。</w:t>
       </w:r>
     </w:p>
     <w:p>
@@ -9590,7 +8969,7 @@
           <w:sz w:val="17"/>
           <w:szCs w:val="17"/>
         </w:rPr>
-        <w:t xml:space="preserve">・前日のたんぱく質は約88g（約1.4g/kg）で、糖質を優先する日としては十分。増やすなら朝食に納豆か温泉卵（約＋7g）。</w:t>
+        <w:t xml:space="preserve">・前日のたんぱく質は約84g（約1.4g/kg）で、糖質を優先する日としては十分。増やすなら朝食に納豆か温泉卵（約＋7g）。</w:t>
       </w:r>
     </w:p>
     <w:p>
@@ -9610,7 +8989,7 @@
           <w:sz w:val="17"/>
           <w:szCs w:val="17"/>
         </w:rPr>
-        <w:t xml:space="preserve">・前日のエネルギーは約2,640kcal（約43kcal/kg）。普段より大幅に多ければ補食③を省くなどで調整。</w:t>
+        <w:t xml:space="preserve">・前日のエネルギーは約2,520kcal（約41kcal/kg）。普段より大幅に多ければ、主菜や卵料理の量で調整し、主食は減らさない。</w:t>
       </w:r>
     </w:p>
     <w:p>

</xml_diff>